<commit_message>
chore: update templates 2268.02B (nông nghiệp) và 2268.01E (PASDV)
</commit_message>
<xml_diff>
--- a/report_assets/KHCN templates/Báo cáo đề xuất/2268.02B BCDXCV ngan han co TSBD cat tuong.docx
+++ b/report_assets/KHCN templates/Báo cáo đề xuất/2268.02B BCDXCV ngan han co TSBD cat tuong.docx
@@ -114,7 +114,7 @@
                 </mc:Choice>
                 <mc:Fallback>
                   <w:pict>
-                    <v:line w14:anchorId="0FF98BD4" id="Straight Connector 1" o:spid="_x0000_s1026" style="position:absolute;z-index:251688960;visibility:visible;mso-wrap-style:square;mso-wrap-distance-left:9pt;mso-wrap-distance-top:0;mso-wrap-distance-right:9pt;mso-wrap-distance-bottom:0;mso-position-horizontal:center;mso-position-horizontal-relative:margin;mso-position-vertical:absolute;mso-position-vertical-relative:text" from="0,16.5pt" to="108pt,16.5pt" o:gfxdata="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">
+                    <v:line w14:anchorId="6865FAE5" id="Straight Connector 1" o:spid="_x0000_s1026" style="position:absolute;z-index:251688960;visibility:visible;mso-wrap-style:square;mso-wrap-distance-left:9pt;mso-wrap-distance-top:0;mso-wrap-distance-right:9pt;mso-wrap-distance-bottom:0;mso-position-horizontal:center;mso-position-horizontal-relative:margin;mso-position-vertical:absolute;mso-position-vertical-relative:text" from="0,16.5pt" to="108pt,16.5pt" o:gfxdata="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">
                       <w10:wrap anchorx="margin"/>
                     </v:line>
                   </w:pict>
@@ -266,7 +266,7 @@
                 </mc:Choice>
                 <mc:Fallback>
                   <w:pict>
-                    <v:shapetype w14:anchorId="1F301F84" id="_x0000_t32" coordsize="21600,21600" o:spt="32" o:oned="t" path="m,l21600,21600e" filled="f">
+                    <v:shapetype w14:anchorId="4B7C7BA3" id="_x0000_t32" coordsize="21600,21600" o:spt="32" o:oned="t" path="m,l21600,21600e" filled="f">
                       <v:path arrowok="t" fillok="f" o:connecttype="none"/>
                       <o:lock v:ext="edit" shapetype="t"/>
                     </v:shapetype>
@@ -821,548 +821,281 @@
         <w:t>Giới thiệu về khách hàng</w:t>
       </w:r>
     </w:p>
-    <w:tbl>
-      <w:tblPr>
-        <w:tblStyle w:val="TableGrid1112"/>
-        <w:tblW w:w="10455" w:type="dxa"/>
-        <w:tblInd w:w="-601" w:type="dxa"/>
-        <w:tblBorders>
-          <w:top w:val="none" w:sz="0" w:space="0" w:color="auto"/>
-          <w:left w:val="none" w:sz="0" w:space="0" w:color="auto"/>
-          <w:bottom w:val="none" w:sz="0" w:space="0" w:color="auto"/>
-          <w:right w:val="none" w:sz="0" w:space="0" w:color="auto"/>
-          <w:insideH w:val="none" w:sz="0" w:space="0" w:color="auto"/>
-          <w:insideV w:val="none" w:sz="0" w:space="0" w:color="auto"/>
-        </w:tblBorders>
-        <w:tblLayout w:type="fixed"/>
-        <w:tblLook w:val="04A0" w:firstRow="1" w:lastRow="0" w:firstColumn="1" w:lastColumn="0" w:noHBand="0" w:noVBand="1"/>
-      </w:tblPr>
-      <w:tblGrid>
-        <w:gridCol w:w="597"/>
-        <w:gridCol w:w="9858"/>
-      </w:tblGrid>
-      <w:tr>
-        <w:tc>
-          <w:tcPr>
-            <w:tcW w:w="597" w:type="dxa"/>
-          </w:tcPr>
-          <w:p>
-            <w:pPr>
-              <w:spacing w:line="276" w:lineRule="auto"/>
-              <w:rPr>
-                <w:rFonts w:ascii="Times New Roman" w:hAnsi="Times New Roman"/>
-                <w:color w:val="FFFFFF" w:themeColor="background1"/>
-                <w:sz w:val="26"/>
-                <w:szCs w:val="26"/>
-                <w:lang w:val="es-MX"/>
-              </w:rPr>
-            </w:pPr>
-          </w:p>
-        </w:tc>
-        <w:tc>
-          <w:tcPr>
-            <w:tcW w:w="9858" w:type="dxa"/>
-            <w:hideMark/>
-          </w:tcPr>
-          <w:p>
-            <w:pPr>
-              <w:spacing w:line="276" w:lineRule="auto"/>
-              <w:ind w:firstLine="571"/>
-              <w:jc w:val="both"/>
-              <w:rPr>
-                <w:rFonts w:ascii="Times New Roman" w:hAnsi="Times New Roman"/>
-                <w:b/>
-                <w:bCs/>
-                <w:sz w:val="26"/>
-                <w:szCs w:val="26"/>
-                <w:lang w:val="es-MX"/>
-              </w:rPr>
-            </w:pPr>
-            <w:r>
-              <w:rPr>
-                <w:rFonts w:ascii="Times New Roman" w:hAnsi="Times New Roman"/>
-                <w:b/>
-                <w:sz w:val="26"/>
-                <w:szCs w:val="26"/>
-                <w:lang w:val="en-AU"/>
-              </w:rPr>
-              <w:t>1.</w:t>
-            </w:r>
-            <w:r>
-              <w:rPr>
-                <w:rFonts w:ascii="Times New Roman" w:hAnsi="Times New Roman"/>
-                <w:b/>
-                <w:sz w:val="26"/>
-                <w:szCs w:val="26"/>
-                <w:lang w:val="en-AU"/>
-              </w:rPr>
-              <w:t>1. [Danh xưng]:</w:t>
-            </w:r>
-            <w:r>
-              <w:rPr>
-                <w:rFonts w:ascii="Times New Roman" w:hAnsi="Times New Roman"/>
-                <w:sz w:val="26"/>
-                <w:szCs w:val="26"/>
-                <w:lang w:val="en-AU"/>
-              </w:rPr>
-              <w:t xml:space="preserve"> </w:t>
-            </w:r>
-            <w:r>
-              <w:rPr>
-                <w:rFonts w:ascii="Times New Roman" w:hAnsi="Times New Roman"/>
-                <w:b/>
-                <w:sz w:val="26"/>
-                <w:szCs w:val="26"/>
-                <w:lang w:val="en-AU"/>
-              </w:rPr>
-              <w:t>[Tên khách hàng]</w:t>
-            </w:r>
-            <w:r>
-              <w:rPr>
-                <w:rFonts w:ascii="Times New Roman" w:hAnsi="Times New Roman"/>
-                <w:sz w:val="26"/>
-                <w:szCs w:val="26"/>
-                <w:lang w:val="en-AU"/>
-              </w:rPr>
-              <w:t>.</w:t>
-            </w:r>
-            <w:r>
-              <w:rPr>
-                <w:rFonts w:ascii="Times New Roman" w:hAnsi="Times New Roman"/>
-                <w:b/>
-                <w:sz w:val="26"/>
-                <w:szCs w:val="26"/>
-                <w:lang w:val="en-AU"/>
-              </w:rPr>
-              <w:t xml:space="preserve"> </w:t>
-            </w:r>
-            <w:r>
-              <w:rPr>
-                <w:rFonts w:ascii="Times New Roman" w:hAnsi="Times New Roman"/>
-                <w:sz w:val="26"/>
-                <w:szCs w:val="26"/>
-                <w:lang w:val="es-MX"/>
-              </w:rPr>
-              <w:t>Sinh năm:</w:t>
-            </w:r>
-            <w:r>
-              <w:rPr>
-                <w:rFonts w:ascii="Times New Roman" w:hAnsi="Times New Roman"/>
-                <w:b/>
-                <w:sz w:val="26"/>
-                <w:szCs w:val="26"/>
-                <w:lang w:val="es-MX"/>
-              </w:rPr>
-              <w:t xml:space="preserve"> </w:t>
-            </w:r>
-            <w:r>
-              <w:rPr>
-                <w:rFonts w:ascii="Times New Roman" w:hAnsi="Times New Roman"/>
-                <w:sz w:val="26"/>
-                <w:szCs w:val="26"/>
-                <w:lang w:val="en-AU"/>
-              </w:rPr>
-              <w:t>[Năm sinh]</w:t>
-            </w:r>
-          </w:p>
-          <w:p>
-            <w:pPr>
-              <w:spacing w:line="276" w:lineRule="auto"/>
-              <w:ind w:firstLine="571"/>
-              <w:jc w:val="both"/>
-              <w:rPr>
-                <w:rFonts w:ascii="Times New Roman" w:hAnsi="Times New Roman"/>
-                <w:sz w:val="26"/>
-                <w:szCs w:val="26"/>
-              </w:rPr>
-            </w:pPr>
-            <w:r>
-              <w:rPr>
-                <w:rFonts w:ascii="Times New Roman" w:hAnsi="Times New Roman"/>
-                <w:sz w:val="26"/>
-                <w:szCs w:val="26"/>
-                <w:lang w:val="pt-BR"/>
-              </w:rPr>
-              <w:t xml:space="preserve">[Loại giấy tờ tùy thân] số: </w:t>
-            </w:r>
-            <w:r>
-              <w:rPr>
-                <w:rFonts w:ascii="Times New Roman" w:hAnsi="Times New Roman"/>
-                <w:b/>
-                <w:sz w:val="26"/>
-                <w:szCs w:val="26"/>
-                <w:lang w:val="pt-BR"/>
-              </w:rPr>
-              <w:t>[CMND]</w:t>
-            </w:r>
-            <w:r>
-              <w:rPr>
-                <w:rFonts w:ascii="Times New Roman" w:hAnsi="Times New Roman"/>
-                <w:sz w:val="26"/>
-                <w:szCs w:val="26"/>
-                <w:lang w:val="pt-BR"/>
-              </w:rPr>
-              <w:t xml:space="preserve"> cấp ngày: [Ngày cấp]. Nơi cấp: [Nơi cấp]</w:t>
-            </w:r>
-          </w:p>
-          <w:p>
-            <w:pPr>
-              <w:spacing w:line="276" w:lineRule="auto"/>
-              <w:ind w:firstLine="571"/>
-              <w:jc w:val="both"/>
-              <w:rPr>
-                <w:rFonts w:ascii="Times New Roman" w:hAnsi="Times New Roman"/>
-                <w:sz w:val="26"/>
-                <w:szCs w:val="26"/>
-              </w:rPr>
-            </w:pPr>
-            <w:r>
-              <w:rPr>
-                <w:rFonts w:ascii="Times New Roman" w:hAnsi="Times New Roman"/>
-                <w:color w:val="C00000"/>
-                <w:sz w:val="26"/>
-                <w:szCs w:val="26"/>
-              </w:rPr>
-              <w:t xml:space="preserve">CMND số </w:t>
-            </w:r>
-            <w:r>
-              <w:rPr>
-                <w:rFonts w:ascii="Times New Roman" w:hAnsi="Times New Roman"/>
-                <w:color w:val="C00000"/>
-                <w:sz w:val="26"/>
-                <w:szCs w:val="26"/>
-              </w:rPr>
-              <w:t>[CMND cũ]</w:t>
-            </w:r>
-          </w:p>
-          <w:p>
-            <w:pPr>
-              <w:spacing w:line="276" w:lineRule="auto"/>
-              <w:ind w:firstLine="571"/>
-              <w:jc w:val="both"/>
-              <w:rPr>
-                <w:rFonts w:ascii="Times New Roman" w:hAnsi="Times New Roman"/>
-                <w:sz w:val="26"/>
-                <w:szCs w:val="26"/>
-                <w:lang w:val="es-MX"/>
-              </w:rPr>
-            </w:pPr>
-            <w:r>
-              <w:rPr>
-                <w:rFonts w:ascii="Times New Roman" w:hAnsi="Times New Roman"/>
-                <w:sz w:val="26"/>
-                <w:szCs w:val="26"/>
-                <w:lang w:val="es-MX"/>
-              </w:rPr>
-              <w:t>Nơi cư trú: [Địa chỉ]</w:t>
-            </w:r>
-          </w:p>
-          <w:p>
-            <w:pPr>
-              <w:spacing w:line="276" w:lineRule="auto"/>
-              <w:ind w:firstLine="571"/>
-              <w:jc w:val="both"/>
-              <w:rPr>
-                <w:rFonts w:ascii="Times New Roman" w:hAnsi="Times New Roman"/>
-                <w:b/>
-                <w:sz w:val="26"/>
-                <w:szCs w:val="26"/>
-                <w:lang w:val="en-AU"/>
-              </w:rPr>
-            </w:pPr>
-            <w:r>
-              <w:rPr>
-                <w:rFonts w:ascii="Times New Roman" w:hAnsi="Times New Roman"/>
-                <w:sz w:val="26"/>
-                <w:szCs w:val="26"/>
-                <w:lang w:val="es-MX"/>
-              </w:rPr>
-              <w:t xml:space="preserve">Số điện </w:t>
-            </w:r>
-            <w:r>
-              <w:rPr>
-                <w:rFonts w:ascii="Times New Roman" w:hAnsi="Times New Roman"/>
-                <w:sz w:val="26"/>
-                <w:szCs w:val="26"/>
-                <w:lang w:val="pt-BR"/>
-              </w:rPr>
-              <w:t>thoại</w:t>
-            </w:r>
-            <w:r>
-              <w:rPr>
-                <w:rFonts w:ascii="Times New Roman" w:hAnsi="Times New Roman"/>
-                <w:sz w:val="26"/>
-                <w:szCs w:val="26"/>
-                <w:lang w:val="es-MX"/>
-              </w:rPr>
-              <w:t>: [Số điện thoại].</w:t>
-            </w:r>
-          </w:p>
-        </w:tc>
-      </w:tr>
-      <w:tr>
-        <w:tc>
-          <w:tcPr>
-            <w:tcW w:w="597" w:type="dxa"/>
-            <w:hideMark/>
-          </w:tcPr>
-          <w:p>
-            <w:pPr>
-              <w:spacing w:line="276" w:lineRule="auto"/>
-              <w:rPr>
-                <w:rFonts w:ascii="Times New Roman" w:hAnsi="Times New Roman"/>
-                <w:color w:val="FFFFFF" w:themeColor="background1"/>
-                <w:sz w:val="26"/>
-                <w:szCs w:val="26"/>
-                <w:lang w:val="es-MX"/>
-              </w:rPr>
-            </w:pPr>
-            <w:r>
-              <w:rPr>
-                <w:rFonts w:ascii="Times New Roman" w:hAnsi="Times New Roman"/>
-                <w:color w:val="FFFFFF" w:themeColor="background1"/>
-                <w:sz w:val="26"/>
-                <w:szCs w:val="26"/>
-                <w:lang w:val="es-MX"/>
-              </w:rPr>
-              <w:t>[TV.STT]</w:t>
-            </w:r>
-          </w:p>
-        </w:tc>
-        <w:tc>
-          <w:tcPr>
-            <w:tcW w:w="9858" w:type="dxa"/>
-            <w:hideMark/>
-          </w:tcPr>
-          <w:p>
-            <w:pPr>
-              <w:spacing w:line="276" w:lineRule="auto"/>
-              <w:ind w:firstLine="571"/>
-              <w:jc w:val="both"/>
-              <w:rPr>
-                <w:rFonts w:ascii="Times New Roman" w:hAnsi="Times New Roman"/>
-                <w:b/>
-                <w:bCs/>
-                <w:sz w:val="26"/>
-                <w:szCs w:val="26"/>
-                <w:lang w:val="es-MX"/>
-              </w:rPr>
-            </w:pPr>
-            <w:r>
-              <w:rPr>
-                <w:rFonts w:ascii="Times New Roman" w:hAnsi="Times New Roman"/>
-                <w:b/>
-                <w:sz w:val="26"/>
-                <w:szCs w:val="26"/>
-                <w:lang w:val="en-AU"/>
-              </w:rPr>
-              <w:t>1.</w:t>
-            </w:r>
-            <w:r>
-              <w:rPr>
-                <w:rFonts w:ascii="Times New Roman" w:hAnsi="Times New Roman"/>
-                <w:b/>
-                <w:sz w:val="26"/>
-                <w:szCs w:val="26"/>
-                <w:lang w:val="en-AU"/>
-              </w:rPr>
-              <w:t>2</w:t>
-            </w:r>
-            <w:r>
-              <w:rPr>
-                <w:rFonts w:ascii="Times New Roman" w:hAnsi="Times New Roman"/>
-                <w:b/>
-                <w:sz w:val="26"/>
-                <w:szCs w:val="26"/>
-                <w:lang w:val="en-AU"/>
-              </w:rPr>
-              <w:t>. [TV.Danh xưng]:</w:t>
-            </w:r>
-            <w:r>
-              <w:rPr>
-                <w:rFonts w:ascii="Times New Roman" w:hAnsi="Times New Roman"/>
-                <w:sz w:val="26"/>
-                <w:szCs w:val="26"/>
-                <w:lang w:val="en-AU"/>
-              </w:rPr>
-              <w:t xml:space="preserve"> </w:t>
-            </w:r>
-            <w:r>
-              <w:rPr>
-                <w:rFonts w:ascii="Times New Roman" w:hAnsi="Times New Roman"/>
-                <w:b/>
-                <w:sz w:val="26"/>
-                <w:szCs w:val="26"/>
-                <w:lang w:val="en-AU"/>
-              </w:rPr>
-              <w:t>[TV.Họ và tên]</w:t>
-            </w:r>
-            <w:r>
-              <w:rPr>
-                <w:rFonts w:ascii="Times New Roman" w:hAnsi="Times New Roman"/>
-                <w:sz w:val="26"/>
-                <w:szCs w:val="26"/>
-                <w:lang w:val="en-AU"/>
-              </w:rPr>
-              <w:t>.</w:t>
-            </w:r>
-            <w:r>
-              <w:rPr>
-                <w:rFonts w:ascii="Times New Roman" w:hAnsi="Times New Roman"/>
-                <w:b/>
-                <w:sz w:val="26"/>
-                <w:szCs w:val="26"/>
-                <w:lang w:val="en-AU"/>
-              </w:rPr>
-              <w:t xml:space="preserve"> </w:t>
-            </w:r>
-            <w:r>
-              <w:rPr>
-                <w:rFonts w:ascii="Times New Roman" w:hAnsi="Times New Roman"/>
-                <w:sz w:val="26"/>
-                <w:szCs w:val="26"/>
-                <w:lang w:val="es-MX"/>
-              </w:rPr>
-              <w:t>Sinh năm:</w:t>
-            </w:r>
-            <w:r>
-              <w:rPr>
-                <w:rFonts w:ascii="Times New Roman" w:hAnsi="Times New Roman"/>
-                <w:b/>
-                <w:sz w:val="26"/>
-                <w:szCs w:val="26"/>
-                <w:lang w:val="es-MX"/>
-              </w:rPr>
-              <w:t xml:space="preserve"> </w:t>
-            </w:r>
-            <w:r>
-              <w:rPr>
-                <w:rFonts w:ascii="Times New Roman" w:hAnsi="Times New Roman"/>
-                <w:sz w:val="26"/>
-                <w:szCs w:val="26"/>
-                <w:lang w:val="en-AU"/>
-              </w:rPr>
-              <w:t>[TV.Năm sinh]</w:t>
-            </w:r>
-          </w:p>
-          <w:p>
-            <w:pPr>
-              <w:spacing w:line="276" w:lineRule="auto"/>
-              <w:ind w:firstLine="571"/>
-              <w:jc w:val="both"/>
-              <w:rPr>
-                <w:rFonts w:ascii="Times New Roman" w:hAnsi="Times New Roman"/>
-                <w:sz w:val="26"/>
-                <w:szCs w:val="26"/>
-              </w:rPr>
-            </w:pPr>
-            <w:r>
-              <w:rPr>
-                <w:rFonts w:ascii="Times New Roman" w:hAnsi="Times New Roman"/>
-                <w:sz w:val="26"/>
-                <w:szCs w:val="26"/>
-                <w:lang w:val="es-MX"/>
-              </w:rPr>
-              <w:t xml:space="preserve">[TV.Loại giấy tờ tùy thân] số: </w:t>
-            </w:r>
-            <w:r>
-              <w:rPr>
-                <w:rFonts w:ascii="Times New Roman" w:hAnsi="Times New Roman"/>
-                <w:b/>
-                <w:sz w:val="26"/>
-                <w:szCs w:val="26"/>
-                <w:lang w:val="es-MX"/>
-              </w:rPr>
-              <w:t xml:space="preserve">[TV.CMND] </w:t>
-            </w:r>
-            <w:r>
-              <w:rPr>
-                <w:rFonts w:ascii="Times New Roman" w:hAnsi="Times New Roman"/>
-                <w:sz w:val="26"/>
-                <w:szCs w:val="26"/>
-                <w:lang w:val="es-MX"/>
-              </w:rPr>
-              <w:t>cấp ngày: [TV.Ngày cấp]. Nơi cấp: [TV.Nơi cấp]</w:t>
-            </w:r>
-          </w:p>
-          <w:p>
-            <w:pPr>
-              <w:spacing w:line="276" w:lineRule="auto"/>
-              <w:ind w:firstLine="571"/>
-              <w:jc w:val="both"/>
-              <w:rPr>
-                <w:rFonts w:ascii="Times New Roman" w:hAnsi="Times New Roman"/>
-                <w:color w:val="C00000"/>
-                <w:sz w:val="26"/>
-                <w:szCs w:val="26"/>
-              </w:rPr>
-            </w:pPr>
-            <w:r>
-              <w:rPr>
-                <w:rFonts w:ascii="Times New Roman" w:hAnsi="Times New Roman"/>
-                <w:color w:val="C00000"/>
-                <w:sz w:val="26"/>
-                <w:szCs w:val="26"/>
-              </w:rPr>
-              <w:t xml:space="preserve">CMND số </w:t>
-            </w:r>
-            <w:r>
-              <w:rPr>
-                <w:rFonts w:ascii="Times New Roman" w:hAnsi="Times New Roman"/>
-                <w:color w:val="C00000"/>
-                <w:sz w:val="26"/>
-                <w:szCs w:val="26"/>
-              </w:rPr>
-              <w:t>[TV.CMND cũ]</w:t>
-            </w:r>
-          </w:p>
-          <w:p>
-            <w:pPr>
-              <w:spacing w:line="276" w:lineRule="auto"/>
-              <w:ind w:firstLine="571"/>
-              <w:jc w:val="both"/>
-              <w:rPr>
-                <w:rFonts w:ascii="Times New Roman" w:hAnsi="Times New Roman"/>
-                <w:sz w:val="26"/>
-                <w:szCs w:val="26"/>
-                <w:lang w:val="es-MX"/>
-              </w:rPr>
-            </w:pPr>
-            <w:r>
-              <w:rPr>
-                <w:rFonts w:ascii="Times New Roman" w:hAnsi="Times New Roman"/>
-                <w:sz w:val="26"/>
-                <w:szCs w:val="26"/>
-                <w:lang w:val="es-MX"/>
-              </w:rPr>
-              <w:t>Nơi cư trú: [TV.Địa chỉ hiện tại]</w:t>
-            </w:r>
-          </w:p>
-          <w:p>
-            <w:pPr>
-              <w:spacing w:line="276" w:lineRule="auto"/>
-              <w:ind w:firstLine="571"/>
-              <w:jc w:val="both"/>
-              <w:rPr>
-                <w:rFonts w:ascii="Times New Roman" w:hAnsi="Times New Roman"/>
-                <w:sz w:val="26"/>
-                <w:szCs w:val="26"/>
-                <w:lang w:val="es-MX"/>
-              </w:rPr>
-            </w:pPr>
-            <w:r>
-              <w:rPr>
-                <w:rFonts w:ascii="Times New Roman" w:hAnsi="Times New Roman"/>
-                <w:sz w:val="26"/>
-                <w:szCs w:val="26"/>
-                <w:lang w:val="es-MX"/>
-              </w:rPr>
-              <w:t>Số điện thoại: [TV.Số điện thoại]</w:t>
-            </w:r>
-          </w:p>
-        </w:tc>
-      </w:tr>
-    </w:tbl>
+    <w:p>
+      <w:pPr>
+        <w:spacing w:after="0" w:line="276" w:lineRule="auto"/>
+        <w:ind w:firstLine="571"/>
+        <w:jc w:val="both"/>
+        <w:rPr>
+          <w:rFonts w:ascii="Times New Roman" w:hAnsi="Times New Roman"/>
+          <w:bCs/>
+          <w:sz w:val="26"/>
+          <w:szCs w:val="26"/>
+          <w:lang w:val="es-MX"/>
+        </w:rPr>
+      </w:pPr>
+      <w:r>
+        <w:rPr>
+          <w:rFonts w:ascii="Times New Roman" w:hAnsi="Times New Roman"/>
+          <w:bCs/>
+          <w:sz w:val="26"/>
+          <w:szCs w:val="26"/>
+          <w:lang w:val="en-AU"/>
+        </w:rPr>
+        <w:t xml:space="preserve">1.1. [Danh xưng]: [Tên khách hàng]. </w:t>
+      </w:r>
+      <w:r>
+        <w:rPr>
+          <w:rFonts w:ascii="Times New Roman" w:hAnsi="Times New Roman"/>
+          <w:bCs/>
+          <w:sz w:val="26"/>
+          <w:szCs w:val="26"/>
+          <w:lang w:val="es-MX"/>
+        </w:rPr>
+        <w:t xml:space="preserve">Sinh năm: </w:t>
+      </w:r>
+      <w:r>
+        <w:rPr>
+          <w:rFonts w:ascii="Times New Roman" w:hAnsi="Times New Roman"/>
+          <w:bCs/>
+          <w:sz w:val="26"/>
+          <w:szCs w:val="26"/>
+          <w:lang w:val="en-AU"/>
+        </w:rPr>
+        <w:t>[Năm sinh]</w:t>
+      </w:r>
+    </w:p>
+    <w:p>
+      <w:pPr>
+        <w:spacing w:after="0" w:line="276" w:lineRule="auto"/>
+        <w:ind w:firstLine="571"/>
+        <w:jc w:val="both"/>
+        <w:rPr>
+          <w:rFonts w:ascii="Times New Roman" w:hAnsi="Times New Roman"/>
+          <w:sz w:val="26"/>
+          <w:szCs w:val="26"/>
+        </w:rPr>
+      </w:pPr>
+      <w:r>
+        <w:rPr>
+          <w:rFonts w:ascii="Times New Roman" w:hAnsi="Times New Roman"/>
+          <w:sz w:val="26"/>
+          <w:szCs w:val="26"/>
+          <w:lang w:val="pt-BR"/>
+        </w:rPr>
+        <w:t>[Loại giấy tờ tùy thân] số: [CMND] cấp ngày: [Ngày cấp]. Nơi cấp: [Nơi cấp]</w:t>
+      </w:r>
+    </w:p>
+    <w:p>
+      <w:pPr>
+        <w:spacing w:after="0" w:line="276" w:lineRule="auto"/>
+        <w:ind w:firstLine="571"/>
+        <w:jc w:val="both"/>
+        <w:rPr>
+          <w:rFonts w:ascii="Times New Roman" w:hAnsi="Times New Roman"/>
+          <w:sz w:val="26"/>
+          <w:szCs w:val="26"/>
+        </w:rPr>
+      </w:pPr>
+      <w:r>
+        <w:rPr>
+          <w:rFonts w:ascii="Times New Roman" w:hAnsi="Times New Roman"/>
+          <w:color w:val="C00000"/>
+          <w:sz w:val="26"/>
+          <w:szCs w:val="26"/>
+        </w:rPr>
+        <w:t>CMND số [CMND cũ]</w:t>
+      </w:r>
+    </w:p>
+    <w:p>
+      <w:pPr>
+        <w:spacing w:after="0" w:line="276" w:lineRule="auto"/>
+        <w:ind w:firstLine="571"/>
+        <w:jc w:val="both"/>
+        <w:rPr>
+          <w:rFonts w:ascii="Times New Roman" w:hAnsi="Times New Roman"/>
+          <w:sz w:val="26"/>
+          <w:szCs w:val="26"/>
+          <w:lang w:val="es-MX"/>
+        </w:rPr>
+      </w:pPr>
+      <w:r>
+        <w:rPr>
+          <w:rFonts w:ascii="Times New Roman" w:hAnsi="Times New Roman"/>
+          <w:sz w:val="26"/>
+          <w:szCs w:val="26"/>
+          <w:lang w:val="es-MX"/>
+        </w:rPr>
+        <w:t>Nơi cư trú: [Địa chỉ]</w:t>
+      </w:r>
+    </w:p>
+    <w:p>
+      <w:pPr>
+        <w:spacing w:after="0" w:line="276" w:lineRule="auto"/>
+        <w:ind w:firstLine="567"/>
+        <w:jc w:val="both"/>
+        <w:rPr>
+          <w:rFonts w:ascii="Times New Roman" w:hAnsi="Times New Roman"/>
+          <w:sz w:val="26"/>
+          <w:szCs w:val="26"/>
+          <w:lang w:val="es-MX"/>
+        </w:rPr>
+      </w:pPr>
+      <w:r>
+        <w:rPr>
+          <w:rFonts w:ascii="Times New Roman" w:hAnsi="Times New Roman"/>
+          <w:sz w:val="26"/>
+          <w:szCs w:val="26"/>
+          <w:lang w:val="es-MX"/>
+        </w:rPr>
+        <w:t xml:space="preserve">Số điện </w:t>
+      </w:r>
+      <w:r>
+        <w:rPr>
+          <w:rFonts w:ascii="Times New Roman" w:hAnsi="Times New Roman"/>
+          <w:sz w:val="26"/>
+          <w:szCs w:val="26"/>
+          <w:lang w:val="pt-BR"/>
+        </w:rPr>
+        <w:t>thoại</w:t>
+      </w:r>
+      <w:r>
+        <w:rPr>
+          <w:rFonts w:ascii="Times New Roman" w:hAnsi="Times New Roman"/>
+          <w:sz w:val="26"/>
+          <w:szCs w:val="26"/>
+          <w:lang w:val="es-MX"/>
+        </w:rPr>
+        <w:t>: [Số điện thoại].</w:t>
+      </w:r>
+    </w:p>
+    <w:p>
+      <w:pPr>
+        <w:spacing w:after="0" w:line="276" w:lineRule="auto"/>
+        <w:ind w:firstLine="571"/>
+        <w:jc w:val="both"/>
+        <w:rPr>
+          <w:rFonts w:ascii="Times New Roman" w:hAnsi="Times New Roman"/>
+          <w:sz w:val="26"/>
+          <w:szCs w:val="26"/>
+          <w:lang w:val="es-MX"/>
+        </w:rPr>
+      </w:pPr>
+      <w:r>
+        <w:rPr>
+          <w:rFonts w:ascii="Times New Roman" w:hAnsi="Times New Roman"/>
+          <w:sz w:val="26"/>
+          <w:szCs w:val="26"/>
+          <w:lang w:val="en-AU"/>
+        </w:rPr>
+        <w:t xml:space="preserve">1.2. [TV.Danh xưng]: [TV.Họ và tên]. </w:t>
+      </w:r>
+      <w:r>
+        <w:rPr>
+          <w:rFonts w:ascii="Times New Roman" w:hAnsi="Times New Roman"/>
+          <w:sz w:val="26"/>
+          <w:szCs w:val="26"/>
+          <w:lang w:val="es-MX"/>
+        </w:rPr>
+        <w:t xml:space="preserve">Sinh năm: </w:t>
+      </w:r>
+      <w:r>
+        <w:rPr>
+          <w:rFonts w:ascii="Times New Roman" w:hAnsi="Times New Roman"/>
+          <w:sz w:val="26"/>
+          <w:szCs w:val="26"/>
+          <w:lang w:val="en-AU"/>
+        </w:rPr>
+        <w:t>[TV.Năm sinh]</w:t>
+      </w:r>
+    </w:p>
+    <w:p>
+      <w:pPr>
+        <w:spacing w:after="0" w:line="276" w:lineRule="auto"/>
+        <w:ind w:firstLine="571"/>
+        <w:jc w:val="both"/>
+        <w:rPr>
+          <w:rFonts w:ascii="Times New Roman" w:hAnsi="Times New Roman"/>
+          <w:sz w:val="26"/>
+          <w:szCs w:val="26"/>
+        </w:rPr>
+      </w:pPr>
+      <w:r>
+        <w:rPr>
+          <w:rFonts w:ascii="Times New Roman" w:hAnsi="Times New Roman"/>
+          <w:sz w:val="26"/>
+          <w:szCs w:val="26"/>
+          <w:lang w:val="es-MX"/>
+        </w:rPr>
+        <w:t>[TV.Loại giấy tờ tùy thân] số: [TV.CMND] cấp ngày: [TV.Ngày cấp]. Nơi cấp: [TV.Nơi cấp]</w:t>
+      </w:r>
+    </w:p>
+    <w:p>
+      <w:pPr>
+        <w:spacing w:after="0" w:line="276" w:lineRule="auto"/>
+        <w:ind w:firstLine="571"/>
+        <w:jc w:val="both"/>
+        <w:rPr>
+          <w:rFonts w:ascii="Times New Roman" w:hAnsi="Times New Roman"/>
+          <w:color w:val="C00000"/>
+          <w:sz w:val="26"/>
+          <w:szCs w:val="26"/>
+        </w:rPr>
+      </w:pPr>
+      <w:r>
+        <w:rPr>
+          <w:rFonts w:ascii="Times New Roman" w:hAnsi="Times New Roman"/>
+          <w:color w:val="C00000"/>
+          <w:sz w:val="26"/>
+          <w:szCs w:val="26"/>
+        </w:rPr>
+        <w:t>CMND số [TV.CMND cũ]</w:t>
+      </w:r>
+    </w:p>
+    <w:p>
+      <w:pPr>
+        <w:spacing w:after="0" w:line="276" w:lineRule="auto"/>
+        <w:ind w:firstLine="571"/>
+        <w:jc w:val="both"/>
+        <w:rPr>
+          <w:rFonts w:ascii="Times New Roman" w:hAnsi="Times New Roman"/>
+          <w:sz w:val="26"/>
+          <w:szCs w:val="26"/>
+          <w:lang w:val="es-MX"/>
+        </w:rPr>
+      </w:pPr>
+      <w:r>
+        <w:rPr>
+          <w:rFonts w:ascii="Times New Roman" w:hAnsi="Times New Roman"/>
+          <w:sz w:val="26"/>
+          <w:szCs w:val="26"/>
+          <w:lang w:val="es-MX"/>
+        </w:rPr>
+        <w:t>Nơi cư trú: [TV.Địa chỉ hiện tại]</w:t>
+      </w:r>
+    </w:p>
+    <w:p>
+      <w:pPr>
+        <w:spacing w:after="0" w:line="276" w:lineRule="auto"/>
+        <w:ind w:firstLine="567"/>
+        <w:jc w:val="both"/>
+        <w:rPr>
+          <w:rFonts w:ascii="Times New Roman" w:eastAsia="Times New Roman" w:hAnsi="Times New Roman" w:cs="Times New Roman"/>
+          <w:sz w:val="26"/>
+          <w:szCs w:val="28"/>
+          <w:lang w:val="pt-BR"/>
+        </w:rPr>
+      </w:pPr>
+      <w:r>
+        <w:rPr>
+          <w:rFonts w:ascii="Times New Roman" w:hAnsi="Times New Roman"/>
+          <w:sz w:val="26"/>
+          <w:szCs w:val="26"/>
+          <w:lang w:val="es-MX"/>
+        </w:rPr>
+        <w:t>Số điện thoại: [TV.Số điện thoại]</w:t>
+      </w:r>
+    </w:p>
     <w:p>
       <w:pPr>
         <w:pStyle w:val="ListParagraph"/>
@@ -1378,7 +1111,6 @@
         <w:jc w:val="both"/>
         <w:rPr>
           <w:rFonts w:ascii="Times New Roman" w:hAnsi="Times New Roman" w:cs="Times New Roman"/>
-          <w:b/>
           <w:sz w:val="26"/>
           <w:szCs w:val="26"/>
           <w:lang w:val="de-DE"/>
@@ -1495,146 +1227,47 @@
         <w:ind w:firstLine="567"/>
         <w:jc w:val="both"/>
         <w:rPr>
-          <w:rFonts w:ascii="Times New Roman" w:eastAsia="Calibri" w:hAnsi="Times New Roman" w:cs="Times New Roman"/>
-          <w:sz w:val="26"/>
-          <w:szCs w:val="28"/>
-          <w:lang w:val="de-DE"/>
-        </w:rPr>
-      </w:pPr>
-      <w:r>
-        <w:rPr>
-          <w:rFonts w:ascii="Times New Roman" w:eastAsia="Times New Roman" w:hAnsi="Times New Roman" w:cs="Times New Roman"/>
-          <w:sz w:val="26"/>
-          <w:szCs w:val="28"/>
-          <w:lang w:val="de-DE"/>
-        </w:rPr>
-        <w:t>-</w:t>
-      </w:r>
-      <w:r>
-        <w:rPr>
-          <w:rFonts w:ascii="Times New Roman" w:eastAsia="Times New Roman" w:hAnsi="Times New Roman" w:cs="Times New Roman"/>
-          <w:sz w:val="26"/>
-          <w:szCs w:val="28"/>
-          <w:lang w:val="de-DE"/>
-        </w:rPr>
-        <w:t xml:space="preserve"> Tại Agribank: </w:t>
-      </w:r>
-      <w:r>
-        <w:rPr>
-          <w:rFonts w:ascii="Times New Roman" w:eastAsia="Calibri" w:hAnsi="Times New Roman" w:cs="Times New Roman"/>
-          <w:sz w:val="26"/>
-          <w:szCs w:val="28"/>
-          <w:lang w:val="de-DE"/>
-        </w:rPr>
-        <w:t xml:space="preserve">Khách hàng hiện có tổng dư nợ </w:t>
-      </w:r>
-      <w:r>
-        <w:rPr>
-          <w:rFonts w:ascii="Times New Roman" w:eastAsia="Times New Roman" w:hAnsi="Times New Roman" w:cs="Times New Roman"/>
-          <w:sz w:val="26"/>
-          <w:szCs w:val="28"/>
-          <w:lang w:val="de-DE"/>
-        </w:rPr>
-        <w:t>[</w:t>
-      </w:r>
-      <w:r>
-        <w:rPr>
-          <w:rFonts w:ascii="Times New Roman" w:eastAsia="Times New Roman" w:hAnsi="Times New Roman" w:cs="Times New Roman"/>
-          <w:sz w:val="26"/>
-          <w:szCs w:val="28"/>
-          <w:lang w:val="de-DE"/>
-        </w:rPr>
-        <w:t>VBA</w:t>
-      </w:r>
-      <w:r>
-        <w:rPr>
-          <w:rFonts w:ascii="Times New Roman" w:eastAsia="Times New Roman" w:hAnsi="Times New Roman" w:cs="Times New Roman"/>
-          <w:sz w:val="26"/>
-          <w:szCs w:val="28"/>
-          <w:lang w:val="de-DE"/>
-        </w:rPr>
-        <w:t>.</w:t>
-      </w:r>
-      <w:r>
-        <w:rPr>
-          <w:rFonts w:ascii="Times New Roman" w:eastAsia="Times New Roman" w:hAnsi="Times New Roman" w:cs="Times New Roman"/>
-          <w:sz w:val="26"/>
-          <w:szCs w:val="28"/>
-          <w:lang w:val="de-DE"/>
-        </w:rPr>
-        <w:t>Tổng dư nợ</w:t>
-      </w:r>
-      <w:r>
-        <w:rPr>
-          <w:rFonts w:ascii="Times New Roman" w:eastAsia="Times New Roman" w:hAnsi="Times New Roman" w:cs="Times New Roman"/>
-          <w:sz w:val="26"/>
-          <w:szCs w:val="28"/>
-          <w:lang w:val="de-DE"/>
-        </w:rPr>
-        <w:t>] đồng</w:t>
-      </w:r>
-      <w:r>
-        <w:rPr>
-          <w:rFonts w:ascii="Times New Roman" w:eastAsia="Times New Roman" w:hAnsi="Times New Roman" w:cs="Times New Roman"/>
-          <w:sz w:val="26"/>
-          <w:szCs w:val="28"/>
-          <w:lang w:val="de-DE"/>
-        </w:rPr>
-        <w:t xml:space="preserve"> tại Agribank [Tên chi nhánh/PGD]</w:t>
-      </w:r>
-      <w:r>
-        <w:rPr>
-          <w:rFonts w:ascii="Times New Roman" w:eastAsia="Times New Roman" w:hAnsi="Times New Roman" w:cs="Times New Roman"/>
-          <w:sz w:val="26"/>
-          <w:szCs w:val="28"/>
-          <w:lang w:val="de-DE"/>
-        </w:rPr>
-        <w:t>; Nhóm nợ</w:t>
-      </w:r>
-      <w:r>
-        <w:rPr>
-          <w:rFonts w:ascii="Times New Roman" w:eastAsia="Calibri" w:hAnsi="Times New Roman" w:cs="Times New Roman"/>
-          <w:sz w:val="26"/>
-          <w:szCs w:val="28"/>
-          <w:lang w:val="de-DE"/>
-        </w:rPr>
-        <w:t xml:space="preserve">: </w:t>
-      </w:r>
-      <w:r>
-        <w:rPr>
-          <w:rFonts w:ascii="Times New Roman" w:eastAsia="Calibri" w:hAnsi="Times New Roman" w:cs="Times New Roman"/>
-          <w:sz w:val="26"/>
-          <w:szCs w:val="28"/>
-          <w:lang w:val="de-DE"/>
-        </w:rPr>
-        <w:t>[HĐTD.Nhóm nợ]</w:t>
-      </w:r>
-      <w:r>
-        <w:rPr>
-          <w:rFonts w:ascii="Times New Roman" w:eastAsia="Calibri" w:hAnsi="Times New Roman" w:cs="Times New Roman"/>
-          <w:sz w:val="26"/>
-          <w:szCs w:val="28"/>
-          <w:lang w:val="de-DE"/>
-        </w:rPr>
-        <w:t>.</w:t>
-      </w:r>
-      <w:r>
-        <w:rPr>
-          <w:rFonts w:ascii="Times New Roman" w:eastAsia="Calibri" w:hAnsi="Times New Roman" w:cs="Times New Roman"/>
-          <w:sz w:val="26"/>
-          <w:szCs w:val="28"/>
-          <w:lang w:val="de-DE"/>
-        </w:rPr>
-        <w:t xml:space="preserve"> Trong đó:</w:t>
-      </w:r>
-      <w:r>
-        <w:rPr>
-          <w:rFonts w:ascii="Times New Roman" w:eastAsia="Calibri" w:hAnsi="Times New Roman" w:cs="Times New Roman"/>
-          <w:sz w:val="26"/>
-          <w:szCs w:val="28"/>
-          <w:lang w:val="de-DE"/>
-        </w:rPr>
-        <w:t xml:space="preserve"> </w:t>
+          <w:rFonts w:ascii="Times New Roman" w:eastAsia="Times New Roman" w:hAnsi="Times New Roman" w:cs="Times New Roman"/>
+          <w:sz w:val="26"/>
+          <w:szCs w:val="28"/>
+        </w:rPr>
+      </w:pPr>
+      <w:r>
+        <w:rPr>
+          <w:rFonts w:ascii="Times New Roman" w:eastAsia="Times New Roman" w:hAnsi="Times New Roman" w:cs="Times New Roman"/>
+          <w:sz w:val="26"/>
+          <w:szCs w:val="28"/>
+        </w:rPr>
+        <w:t>[#DUNỢ]</w:t>
+      </w:r>
+    </w:p>
+    <w:p>
+      <w:pPr>
+        <w:shd w:val="clear" w:color="auto" w:fill="FFFFFF"/>
+        <w:spacing w:after="0" w:line="276" w:lineRule="auto"/>
+        <w:ind w:firstLine="567"/>
+        <w:jc w:val="both"/>
+        <w:rPr>
+          <w:rFonts w:ascii="Times New Roman" w:eastAsia="Times New Roman" w:hAnsi="Times New Roman" w:cs="Times New Roman"/>
+          <w:sz w:val="26"/>
+          <w:szCs w:val="28"/>
+        </w:rPr>
+      </w:pPr>
+      <w:r>
+        <w:rPr>
+          <w:rFonts w:ascii="Times New Roman" w:eastAsia="Times New Roman" w:hAnsi="Times New Roman" w:cs="Times New Roman"/>
+          <w:sz w:val="26"/>
+          <w:szCs w:val="28"/>
+        </w:rPr>
+        <w:t>- Tại [Tên tổ chức]: Tổng dư nợ [Tổng dư nợ] đồng; Nhóm nợ: [Nhóm nợ]</w:t>
+      </w:r>
+      <w:r>
+        <w:rPr>
+          <w:rFonts w:ascii="Times New Roman" w:eastAsia="Times New Roman" w:hAnsi="Times New Roman" w:cs="Times New Roman"/>
+          <w:sz w:val="26"/>
+          <w:szCs w:val="28"/>
+        </w:rPr>
+        <w:t>. Trong đó:</w:t>
       </w:r>
     </w:p>
     <w:p>
@@ -1647,27 +1280,16 @@
           <w:rFonts w:ascii="Times New Roman" w:eastAsia="Times New Roman" w:hAnsi="Times New Roman" w:cs="Times New Roman"/>
           <w:sz w:val="26"/>
           <w:szCs w:val="28"/>
-          <w:lang w:val="de-DE"/>
-        </w:rPr>
-      </w:pPr>
-      <w:r>
-        <w:rPr>
-          <w:rFonts w:ascii="Times New Roman" w:eastAsia="Times New Roman" w:hAnsi="Times New Roman" w:cs="Times New Roman"/>
-          <w:sz w:val="26"/>
-          <w:szCs w:val="28"/>
-          <w:lang w:val="de-DE"/>
+        </w:rPr>
+      </w:pPr>
+      <w:r>
+        <w:rPr>
+          <w:rFonts w:ascii="Times New Roman" w:eastAsia="Times New Roman" w:hAnsi="Times New Roman" w:cs="Times New Roman"/>
+          <w:sz w:val="26"/>
+          <w:szCs w:val="28"/>
         </w:rPr>
         <w:lastRenderedPageBreak/>
-        <w:t>+ D</w:t>
-      </w:r>
-      <w:r>
-        <w:rPr>
-          <w:rFonts w:ascii="Times New Roman" w:eastAsia="Times New Roman" w:hAnsi="Times New Roman" w:cs="Times New Roman"/>
-          <w:sz w:val="26"/>
-          <w:szCs w:val="28"/>
-          <w:lang w:val="de-DE"/>
-        </w:rPr>
-        <w:t>ư nợ ngắn hạn là [VBA.Dư nợ ngắn hạn] mục đích [VBA.Mục đích ngắn hạn], nguồn trả nợ từ [VBA.Nguồn trả nợ];</w:t>
+        <w:t>+ Ngắn hạn: [Dư nợ ngắn hạn], mục đích [Mục đích ngắn hạn]</w:t>
       </w:r>
     </w:p>
     <w:p>
@@ -1677,20 +1299,39 @@
         <w:ind w:firstLine="851"/>
         <w:jc w:val="both"/>
         <w:rPr>
-          <w:rFonts w:ascii="Times New Roman" w:eastAsia="Calibri" w:hAnsi="Times New Roman" w:cs="Times New Roman"/>
-          <w:sz w:val="26"/>
-          <w:szCs w:val="28"/>
-          <w:lang w:val="de-DE"/>
-        </w:rPr>
-      </w:pPr>
-      <w:r>
-        <w:rPr>
-          <w:rFonts w:ascii="Times New Roman" w:eastAsia="Times New Roman" w:hAnsi="Times New Roman" w:cs="Times New Roman"/>
-          <w:sz w:val="26"/>
-          <w:szCs w:val="28"/>
-          <w:lang w:val="de-DE"/>
-        </w:rPr>
-        <w:t>+ Dư nợ trung dài hạn là [VBA.Dư nợ trung dài hạn] mục đích [VBA.Mục đích trung dài hạn] nguồn trả nợ từ [VBA.Nguồn trả nợ];</w:t>
+          <w:rFonts w:ascii="Times New Roman" w:eastAsia="Times New Roman" w:hAnsi="Times New Roman" w:cs="Times New Roman"/>
+          <w:sz w:val="26"/>
+          <w:szCs w:val="28"/>
+        </w:rPr>
+      </w:pPr>
+      <w:r>
+        <w:rPr>
+          <w:rFonts w:ascii="Times New Roman" w:eastAsia="Times New Roman" w:hAnsi="Times New Roman" w:cs="Times New Roman"/>
+          <w:sz w:val="26"/>
+          <w:szCs w:val="28"/>
+        </w:rPr>
+        <w:t>+ Trung dài hạn: [Dư nợ trung dài hạn], mục đích [Mục đích trung dài hạn]</w:t>
+      </w:r>
+    </w:p>
+    <w:p>
+      <w:pPr>
+        <w:shd w:val="clear" w:color="auto" w:fill="FFFFFF"/>
+        <w:spacing w:after="0" w:line="276" w:lineRule="auto"/>
+        <w:ind w:firstLine="851"/>
+        <w:jc w:val="both"/>
+        <w:rPr>
+          <w:rFonts w:ascii="Times New Roman" w:eastAsia="Times New Roman" w:hAnsi="Times New Roman" w:cs="Times New Roman"/>
+          <w:sz w:val="26"/>
+          <w:szCs w:val="28"/>
+        </w:rPr>
+      </w:pPr>
+      <w:r>
+        <w:rPr>
+          <w:rFonts w:ascii="Times New Roman" w:eastAsia="Times New Roman" w:hAnsi="Times New Roman" w:cs="Times New Roman"/>
+          <w:sz w:val="26"/>
+          <w:szCs w:val="28"/>
+        </w:rPr>
+        <w:t>+ Nguồn trả nợ: [Nguồn trả nợ]</w:t>
       </w:r>
     </w:p>
     <w:p>
@@ -1703,279 +1344,15 @@
           <w:rFonts w:ascii="Times New Roman" w:eastAsia="Times New Roman" w:hAnsi="Times New Roman" w:cs="Times New Roman"/>
           <w:sz w:val="26"/>
           <w:szCs w:val="28"/>
-          <w:lang w:val="de-DE"/>
-        </w:rPr>
-      </w:pPr>
-      <w:r>
-        <w:rPr>
-          <w:rFonts w:ascii="Times New Roman" w:eastAsia="Times New Roman" w:hAnsi="Times New Roman" w:cs="Times New Roman"/>
-          <w:sz w:val="26"/>
-          <w:szCs w:val="28"/>
-          <w:lang w:val="de-DE"/>
-        </w:rPr>
-        <w:t>-</w:t>
-      </w:r>
-      <w:r>
-        <w:rPr>
-          <w:rFonts w:ascii="Times New Roman" w:eastAsia="Times New Roman" w:hAnsi="Times New Roman" w:cs="Times New Roman"/>
-          <w:sz w:val="26"/>
-          <w:szCs w:val="28"/>
-          <w:lang w:val="de-DE"/>
-        </w:rPr>
-        <w:t xml:space="preserve"> Tại các TCTD khác: [HĐTD.Dư nợ tại TCTD khác] đồ</w:t>
-      </w:r>
-      <w:r>
-        <w:rPr>
-          <w:rFonts w:ascii="Times New Roman" w:eastAsia="Times New Roman" w:hAnsi="Times New Roman" w:cs="Times New Roman"/>
-          <w:sz w:val="26"/>
-          <w:szCs w:val="28"/>
-          <w:lang w:val="de-DE"/>
-        </w:rPr>
-        <w:t>ng;</w:t>
-      </w:r>
-      <w:r>
-        <w:rPr>
-          <w:rFonts w:ascii="Times New Roman" w:eastAsia="Times New Roman" w:hAnsi="Times New Roman" w:cs="Times New Roman"/>
-          <w:sz w:val="26"/>
-          <w:szCs w:val="28"/>
-          <w:lang w:val="de-DE"/>
-        </w:rPr>
-        <w:t xml:space="preserve"> </w:t>
-      </w:r>
-      <w:r>
-        <w:rPr>
-          <w:rFonts w:ascii="Times New Roman" w:eastAsia="Times New Roman" w:hAnsi="Times New Roman" w:cs="Times New Roman"/>
-          <w:sz w:val="26"/>
-          <w:szCs w:val="28"/>
-          <w:lang w:val="de-DE"/>
-        </w:rPr>
-        <w:t>Nhóm nợ</w:t>
-      </w:r>
-      <w:r>
-        <w:rPr>
-          <w:rFonts w:ascii="Times New Roman" w:eastAsia="Times New Roman" w:hAnsi="Times New Roman" w:cs="Times New Roman"/>
-          <w:sz w:val="26"/>
-          <w:szCs w:val="28"/>
-          <w:lang w:val="de-DE"/>
-        </w:rPr>
-        <w:t xml:space="preserve">: [HĐTD.Nhóm nợ]. </w:t>
-      </w:r>
-    </w:p>
-    <w:p>
-      <w:pPr>
-        <w:shd w:val="clear" w:color="auto" w:fill="FFFFFF"/>
-        <w:spacing w:after="0" w:line="276" w:lineRule="auto"/>
-        <w:ind w:firstLine="851"/>
-        <w:jc w:val="both"/>
-        <w:rPr>
-          <w:rFonts w:ascii="Times New Roman" w:eastAsia="Times New Roman" w:hAnsi="Times New Roman" w:cs="Times New Roman"/>
-          <w:sz w:val="26"/>
-          <w:szCs w:val="28"/>
-          <w:lang w:val="de-DE"/>
-        </w:rPr>
-      </w:pPr>
-      <w:r>
-        <w:rPr>
-          <w:rFonts w:ascii="Times New Roman" w:eastAsia="Times New Roman" w:hAnsi="Times New Roman" w:cs="Times New Roman"/>
-          <w:sz w:val="26"/>
-          <w:szCs w:val="28"/>
-          <w:lang w:val="de-DE"/>
-        </w:rPr>
-        <w:t xml:space="preserve">+ Dư nợ ngắn hạn: </w:t>
-      </w:r>
-      <w:r>
-        <w:rPr>
-          <w:rFonts w:ascii="Times New Roman" w:eastAsia="Times New Roman" w:hAnsi="Times New Roman" w:cs="Times New Roman"/>
-          <w:sz w:val="26"/>
-          <w:szCs w:val="28"/>
-          <w:lang w:val="de-DE"/>
-        </w:rPr>
-        <w:t>[</w:t>
-      </w:r>
-      <w:r>
-        <w:rPr>
-          <w:rFonts w:ascii="Times New Roman" w:eastAsia="Times New Roman" w:hAnsi="Times New Roman" w:cs="Times New Roman"/>
-          <w:sz w:val="26"/>
-          <w:szCs w:val="28"/>
-          <w:lang w:val="de-DE"/>
-        </w:rPr>
-        <w:t>TCTD</w:t>
-      </w:r>
-      <w:r>
-        <w:rPr>
-          <w:rFonts w:ascii="Times New Roman" w:eastAsia="Times New Roman" w:hAnsi="Times New Roman" w:cs="Times New Roman"/>
-          <w:sz w:val="26"/>
-          <w:szCs w:val="28"/>
-          <w:lang w:val="de-DE"/>
-        </w:rPr>
-        <w:t>.Dư nợ ngắn hạn]</w:t>
-      </w:r>
-      <w:r>
-        <w:rPr>
-          <w:rFonts w:ascii="Times New Roman" w:eastAsia="Times New Roman" w:hAnsi="Times New Roman" w:cs="Times New Roman"/>
-          <w:sz w:val="26"/>
-          <w:szCs w:val="28"/>
-          <w:lang w:val="de-DE"/>
-        </w:rPr>
-        <w:t xml:space="preserve"> đồng</w:t>
-      </w:r>
-      <w:r>
-        <w:rPr>
-          <w:rFonts w:ascii="Times New Roman" w:eastAsia="Times New Roman" w:hAnsi="Times New Roman" w:cs="Times New Roman"/>
-          <w:sz w:val="26"/>
-          <w:szCs w:val="28"/>
-          <w:lang w:val="de-DE"/>
-        </w:rPr>
-        <w:t xml:space="preserve"> mục đích [</w:t>
-      </w:r>
-      <w:r>
-        <w:rPr>
-          <w:rFonts w:ascii="Times New Roman" w:eastAsia="Times New Roman" w:hAnsi="Times New Roman" w:cs="Times New Roman"/>
-          <w:sz w:val="26"/>
-          <w:szCs w:val="28"/>
-          <w:lang w:val="de-DE"/>
-        </w:rPr>
-        <w:t>TCTD</w:t>
-      </w:r>
-      <w:r>
-        <w:rPr>
-          <w:rFonts w:ascii="Times New Roman" w:eastAsia="Times New Roman" w:hAnsi="Times New Roman" w:cs="Times New Roman"/>
-          <w:sz w:val="26"/>
-          <w:szCs w:val="28"/>
-          <w:lang w:val="de-DE"/>
-        </w:rPr>
-        <w:t xml:space="preserve">.Mục đích ngắn hạn], </w:t>
-      </w:r>
-      <w:r>
-        <w:rPr>
-          <w:rFonts w:ascii="Times New Roman" w:eastAsia="Times New Roman" w:hAnsi="Times New Roman" w:cs="Times New Roman"/>
-          <w:sz w:val="26"/>
-          <w:szCs w:val="28"/>
-          <w:lang w:val="de-DE"/>
-        </w:rPr>
-        <w:t>nguồn trả nợ từ [TCTD.Nguồn trả nợ];</w:t>
-      </w:r>
-    </w:p>
-    <w:p>
-      <w:pPr>
-        <w:shd w:val="clear" w:color="auto" w:fill="FFFFFF"/>
-        <w:spacing w:after="0" w:line="276" w:lineRule="auto"/>
-        <w:ind w:firstLine="851"/>
-        <w:jc w:val="both"/>
-        <w:rPr>
-          <w:rFonts w:ascii="Times New Roman" w:eastAsia="Times New Roman" w:hAnsi="Times New Roman" w:cs="Times New Roman"/>
-          <w:sz w:val="26"/>
-          <w:szCs w:val="28"/>
-          <w:lang w:val="de-DE"/>
-        </w:rPr>
-      </w:pPr>
-      <w:r>
-        <w:rPr>
-          <w:rFonts w:ascii="Times New Roman" w:eastAsia="Times New Roman" w:hAnsi="Times New Roman" w:cs="Times New Roman"/>
-          <w:sz w:val="26"/>
-          <w:szCs w:val="28"/>
-          <w:lang w:val="de-DE"/>
-        </w:rPr>
-        <w:t>+ D</w:t>
-      </w:r>
-      <w:r>
-        <w:rPr>
-          <w:rFonts w:ascii="Times New Roman" w:eastAsia="Times New Roman" w:hAnsi="Times New Roman" w:cs="Times New Roman"/>
-          <w:sz w:val="26"/>
-          <w:szCs w:val="28"/>
-          <w:lang w:val="de-DE"/>
-        </w:rPr>
-        <w:t>ư nợ trung dài hạn</w:t>
-      </w:r>
-      <w:r>
-        <w:rPr>
-          <w:rFonts w:ascii="Times New Roman" w:eastAsia="Times New Roman" w:hAnsi="Times New Roman" w:cs="Times New Roman"/>
-          <w:sz w:val="26"/>
-          <w:szCs w:val="28"/>
-          <w:lang w:val="de-DE"/>
-        </w:rPr>
-        <w:t xml:space="preserve">: </w:t>
-      </w:r>
-      <w:r>
-        <w:rPr>
-          <w:rFonts w:ascii="Times New Roman" w:eastAsia="Times New Roman" w:hAnsi="Times New Roman" w:cs="Times New Roman"/>
-          <w:sz w:val="26"/>
-          <w:szCs w:val="28"/>
-          <w:lang w:val="de-DE"/>
-        </w:rPr>
-        <w:t>[</w:t>
-      </w:r>
-      <w:r>
-        <w:rPr>
-          <w:rFonts w:ascii="Times New Roman" w:eastAsia="Times New Roman" w:hAnsi="Times New Roman" w:cs="Times New Roman"/>
-          <w:sz w:val="26"/>
-          <w:szCs w:val="28"/>
-          <w:lang w:val="de-DE"/>
-        </w:rPr>
-        <w:t>TCTD</w:t>
-      </w:r>
-      <w:r>
-        <w:rPr>
-          <w:rFonts w:ascii="Times New Roman" w:eastAsia="Times New Roman" w:hAnsi="Times New Roman" w:cs="Times New Roman"/>
-          <w:sz w:val="26"/>
-          <w:szCs w:val="28"/>
-          <w:lang w:val="de-DE"/>
-        </w:rPr>
-        <w:t xml:space="preserve">.Dư nợ trung dài hạn] </w:t>
-      </w:r>
-      <w:r>
-        <w:rPr>
-          <w:rFonts w:ascii="Times New Roman" w:eastAsia="Times New Roman" w:hAnsi="Times New Roman" w:cs="Times New Roman"/>
-          <w:sz w:val="26"/>
-          <w:szCs w:val="28"/>
-          <w:lang w:val="de-DE"/>
-        </w:rPr>
-        <w:t xml:space="preserve">đồng </w:t>
-      </w:r>
-      <w:r>
-        <w:rPr>
-          <w:rFonts w:ascii="Times New Roman" w:eastAsia="Times New Roman" w:hAnsi="Times New Roman" w:cs="Times New Roman"/>
-          <w:sz w:val="26"/>
-          <w:szCs w:val="28"/>
-          <w:lang w:val="de-DE"/>
-        </w:rPr>
-        <w:t>mục đích [</w:t>
-      </w:r>
-      <w:r>
-        <w:rPr>
-          <w:rFonts w:ascii="Times New Roman" w:eastAsia="Times New Roman" w:hAnsi="Times New Roman" w:cs="Times New Roman"/>
-          <w:sz w:val="26"/>
-          <w:szCs w:val="28"/>
-          <w:lang w:val="de-DE"/>
-        </w:rPr>
-        <w:t>TCTD</w:t>
-      </w:r>
-      <w:r>
-        <w:rPr>
-          <w:rFonts w:ascii="Times New Roman" w:eastAsia="Times New Roman" w:hAnsi="Times New Roman" w:cs="Times New Roman"/>
-          <w:sz w:val="26"/>
-          <w:szCs w:val="28"/>
-          <w:lang w:val="de-DE"/>
-        </w:rPr>
-        <w:t>.Mục đích trung dài hạn], nguồn trả nợ từ [</w:t>
-      </w:r>
-      <w:r>
-        <w:rPr>
-          <w:rFonts w:ascii="Times New Roman" w:eastAsia="Times New Roman" w:hAnsi="Times New Roman" w:cs="Times New Roman"/>
-          <w:sz w:val="26"/>
-          <w:szCs w:val="28"/>
-          <w:lang w:val="de-DE"/>
-        </w:rPr>
-        <w:t>TCTD</w:t>
-      </w:r>
-      <w:r>
-        <w:rPr>
-          <w:rFonts w:ascii="Times New Roman" w:eastAsia="Times New Roman" w:hAnsi="Times New Roman" w:cs="Times New Roman"/>
-          <w:sz w:val="26"/>
-          <w:szCs w:val="28"/>
-          <w:lang w:val="de-DE"/>
-        </w:rPr>
-        <w:t>.Nguồn trả nợ];</w:t>
+        </w:rPr>
+      </w:pPr>
+      <w:r>
+        <w:rPr>
+          <w:rFonts w:ascii="Times New Roman" w:eastAsia="Times New Roman" w:hAnsi="Times New Roman" w:cs="Times New Roman"/>
+          <w:sz w:val="26"/>
+          <w:szCs w:val="28"/>
+        </w:rPr>
+        <w:t>[/DUNỢ]</w:t>
       </w:r>
     </w:p>
     <w:p>
@@ -4150,16 +3527,7 @@
                 <w:sz w:val="26"/>
                 <w:szCs w:val="28"/>
               </w:rPr>
-              <w:t xml:space="preserve"> từ </w:t>
-            </w:r>
-            <w:r>
-              <w:rPr>
-                <w:rFonts w:ascii="Times New Roman" w:eastAsia="Times New Roman" w:hAnsi="Times New Roman" w:cs="Times New Roman"/>
-                <w:sz w:val="26"/>
-                <w:szCs w:val="28"/>
-              </w:rPr>
-              <w:lastRenderedPageBreak/>
-              <w:t>hệ thống CIC</w:t>
+              <w:t xml:space="preserve"> từ hệ thống CIC</w:t>
             </w:r>
           </w:p>
         </w:tc>
@@ -4630,6 +3998,7 @@
           <w:szCs w:val="28"/>
           <w:lang w:val="de-DE"/>
         </w:rPr>
+        <w:lastRenderedPageBreak/>
         <w:t>1.2. Đánh giá</w:t>
       </w:r>
       <w:r>
@@ -5678,46 +5047,16 @@
           <w:szCs w:val="26"/>
           <w:lang w:val="pt-BR"/>
         </w:rPr>
-        <w:t xml:space="preserve">[Tên chi nhánh/PGD] số tiền: </w:t>
-      </w:r>
-      <w:r>
-        <w:rPr>
-          <w:rFonts w:ascii="Times New Roman" w:eastAsia="Times New Roman" w:hAnsi="Times New Roman" w:cs="Times New Roman"/>
-          <w:b/>
-          <w:sz w:val="26"/>
-          <w:szCs w:val="26"/>
-          <w:lang w:val="pt-BR"/>
-        </w:rPr>
-        <w:t>[</w:t>
-      </w:r>
-      <w:r>
-        <w:rPr>
-          <w:rFonts w:ascii="Times New Roman" w:eastAsia="Times New Roman" w:hAnsi="Times New Roman" w:cs="Times New Roman"/>
-          <w:b/>
-          <w:sz w:val="26"/>
-          <w:szCs w:val="26"/>
-          <w:lang w:val="pt-BR"/>
-        </w:rPr>
-        <w:t>PA</w:t>
-      </w:r>
-      <w:r>
-        <w:rPr>
-          <w:rFonts w:ascii="Times New Roman" w:eastAsia="Times New Roman" w:hAnsi="Times New Roman" w:cs="Times New Roman"/>
-          <w:b/>
-          <w:sz w:val="26"/>
-          <w:szCs w:val="26"/>
-          <w:lang w:val="pt-BR"/>
-        </w:rPr>
-        <w:t>.Số tiền vay]</w:t>
-      </w:r>
-      <w:r>
-        <w:rPr>
-          <w:rFonts w:ascii="Times New Roman" w:eastAsia="Times New Roman" w:hAnsi="Times New Roman" w:cs="Times New Roman"/>
-          <w:sz w:val="26"/>
-          <w:szCs w:val="26"/>
-          <w:lang w:val="pt-BR"/>
-        </w:rPr>
-        <w:t xml:space="preserve"> đồng (Bằng chữ: [</w:t>
+        <w:t>[Tên chi nhánh/PGD] số tiền: [PA.Số tiền vay] đồng (Bằng chữ:</w:t>
+      </w:r>
+      <w:r>
+        <w:rPr>
+          <w:rFonts w:ascii="Times New Roman" w:eastAsia="Times New Roman" w:hAnsi="Times New Roman" w:cs="Times New Roman"/>
+          <w:sz w:val="26"/>
+          <w:szCs w:val="26"/>
+          <w:lang w:val="pt-BR"/>
+        </w:rPr>
+        <w:t xml:space="preserve"> [</w:t>
       </w:r>
       <w:r>
         <w:rPr>
@@ -5956,15 +5295,23 @@
           <w:sz w:val="26"/>
           <w:szCs w:val="28"/>
         </w:rPr>
-        <w:t xml:space="preserve">- Nguồn trả nợ: từ thu hoạch hoa </w:t>
-      </w:r>
-      <w:r>
-        <w:rPr>
-          <w:rFonts w:ascii="Times New Roman" w:eastAsia="Times New Roman" w:hAnsi="Times New Roman" w:cs="Times New Roman"/>
-          <w:sz w:val="26"/>
-          <w:szCs w:val="28"/>
-        </w:rPr>
-        <w:t>Cát tường</w:t>
+        <w:t xml:space="preserve">- Nguồn trả nợ: từ </w:t>
+      </w:r>
+      <w:r>
+        <w:rPr>
+          <w:rFonts w:ascii="Times New Roman" w:eastAsia="Times New Roman" w:hAnsi="Times New Roman" w:cs="Times New Roman"/>
+          <w:sz w:val="26"/>
+          <w:szCs w:val="28"/>
+        </w:rPr>
+        <w:t xml:space="preserve">doanh thu của hoạt động </w:t>
+      </w:r>
+      <w:r>
+        <w:rPr>
+          <w:rFonts w:ascii="Times New Roman" w:eastAsia="Times New Roman" w:hAnsi="Times New Roman" w:cs="Times New Roman"/>
+          <w:sz w:val="26"/>
+          <w:szCs w:val="28"/>
+        </w:rPr>
+        <w:t>trồng [PA.Loại hoa]</w:t>
       </w:r>
       <w:r>
         <w:rPr>
@@ -6210,17 +5557,31 @@
         <w:jc w:val="both"/>
         <w:rPr>
           <w:rFonts w:ascii="Times New Roman" w:eastAsia="Times New Roman" w:hAnsi="Times New Roman" w:cs="Times New Roman"/>
-          <w:sz w:val="26"/>
-          <w:szCs w:val="26"/>
-        </w:rPr>
-      </w:pPr>
-      <w:r>
-        <w:rPr>
-          <w:rFonts w:ascii="Times New Roman" w:eastAsia="Times New Roman" w:hAnsi="Times New Roman" w:cs="Times New Roman"/>
+          <w:b/>
+          <w:bCs/>
+          <w:sz w:val="26"/>
+          <w:szCs w:val="26"/>
+        </w:rPr>
+      </w:pPr>
+      <w:r>
+        <w:rPr>
+          <w:rFonts w:ascii="Times New Roman" w:eastAsia="Times New Roman" w:hAnsi="Times New Roman" w:cs="Times New Roman"/>
+          <w:b/>
+          <w:bCs/>
           <w:sz w:val="26"/>
           <w:szCs w:val="26"/>
         </w:rPr>
         <w:t>4.[STT]. Chi tiết tài sản</w:t>
+      </w:r>
+      <w:r>
+        <w:rPr>
+          <w:rFonts w:ascii="Times New Roman" w:eastAsia="Times New Roman" w:hAnsi="Times New Roman" w:cs="Times New Roman"/>
+          <w:b/>
+          <w:bCs/>
+          <w:sz w:val="26"/>
+          <w:szCs w:val="26"/>
+        </w:rPr>
+        <w:t xml:space="preserve"> thứ [STT]</w:t>
       </w:r>
     </w:p>
     <w:p>
@@ -6308,7 +5669,6 @@
           <w:sz w:val="26"/>
           <w:szCs w:val="26"/>
         </w:rPr>
-        <w:lastRenderedPageBreak/>
         <w:t>- Diện tích: [Diện tích đất] m</w:t>
       </w:r>
       <w:r>
@@ -6348,24 +5708,25 @@
           <w:sz w:val="26"/>
           <w:szCs w:val="26"/>
         </w:rPr>
-        <w:t>- Hình thức sử dụng:  + Sử dụng riêng: [Sử dụng riêng] m</w:t>
-      </w:r>
-      <w:r>
-        <w:rPr>
-          <w:rFonts w:ascii="Times New Roman" w:eastAsia="Times New Roman" w:hAnsi="Times New Roman" w:cs="Times New Roman"/>
-          <w:sz w:val="26"/>
-          <w:szCs w:val="26"/>
-          <w:vertAlign w:val="superscript"/>
-        </w:rPr>
-        <w:t>2</w:t>
-      </w:r>
-      <w:r>
-        <w:rPr>
-          <w:rFonts w:ascii="Times New Roman" w:eastAsia="Times New Roman" w:hAnsi="Times New Roman" w:cs="Times New Roman"/>
-          <w:sz w:val="26"/>
-          <w:szCs w:val="26"/>
-        </w:rPr>
-        <w:t>;</w:t>
+        <w:t xml:space="preserve">- Hình thức sử dụng:  </w:t>
+      </w:r>
+      <w:r>
+        <w:rPr>
+          <w:rFonts w:ascii="Times New Roman" w:eastAsia="Times New Roman" w:hAnsi="Times New Roman" w:cs="Times New Roman"/>
+          <w:color w:val="EE0000"/>
+          <w:sz w:val="26"/>
+          <w:szCs w:val="26"/>
+        </w:rPr>
+        <w:t>Sử dụng riêng</w:t>
+      </w:r>
+      <w:r>
+        <w:rPr>
+          <w:rFonts w:ascii="Times New Roman" w:eastAsia="Times New Roman" w:hAnsi="Times New Roman" w:cs="Times New Roman"/>
+          <w:color w:val="EE0000"/>
+          <w:sz w:val="26"/>
+          <w:szCs w:val="26"/>
+        </w:rPr>
+        <w:t>/Sử dụng chung</w:t>
       </w:r>
     </w:p>
     <w:p>
@@ -6387,48 +5748,7 @@
           <w:sz w:val="26"/>
           <w:szCs w:val="26"/>
         </w:rPr>
-        <w:t xml:space="preserve">                       </w:t>
-      </w:r>
-      <w:r>
-        <w:rPr>
-          <w:rFonts w:ascii="Times New Roman" w:eastAsia="Times New Roman" w:hAnsi="Times New Roman" w:cs="Times New Roman"/>
-          <w:sz w:val="26"/>
-          <w:szCs w:val="26"/>
-        </w:rPr>
-        <w:tab/>
-      </w:r>
-      <w:r>
-        <w:rPr>
-          <w:rFonts w:ascii="Times New Roman" w:eastAsia="Times New Roman" w:hAnsi="Times New Roman" w:cs="Times New Roman"/>
-          <w:sz w:val="26"/>
-          <w:szCs w:val="26"/>
-        </w:rPr>
-        <w:tab/>
-      </w:r>
-      <w:r>
-        <w:rPr>
-          <w:rFonts w:ascii="Times New Roman" w:eastAsia="Times New Roman" w:hAnsi="Times New Roman" w:cs="Times New Roman"/>
-          <w:sz w:val="26"/>
-          <w:szCs w:val="26"/>
-        </w:rPr>
-        <w:t>+ Sử dụng chung: [Sử dụng chung] m</w:t>
-      </w:r>
-      <w:r>
-        <w:rPr>
-          <w:rFonts w:ascii="Times New Roman" w:eastAsia="Times New Roman" w:hAnsi="Times New Roman" w:cs="Times New Roman"/>
-          <w:sz w:val="26"/>
-          <w:szCs w:val="26"/>
-          <w:vertAlign w:val="superscript"/>
-        </w:rPr>
-        <w:t>2</w:t>
-      </w:r>
-      <w:r>
-        <w:rPr>
-          <w:rFonts w:ascii="Times New Roman" w:eastAsia="Times New Roman" w:hAnsi="Times New Roman" w:cs="Times New Roman"/>
-          <w:sz w:val="26"/>
-          <w:szCs w:val="26"/>
-        </w:rPr>
-        <w:t>;</w:t>
+        <w:t>- Mục đích sử dụng đất: [Mục đích sử dụng]</w:t>
       </w:r>
     </w:p>
     <w:p>
@@ -6450,7 +5770,7 @@
           <w:sz w:val="26"/>
           <w:szCs w:val="26"/>
         </w:rPr>
-        <w:t>- Mục đích sử dụng đất: [Mục đích sử dụng]</w:t>
+        <w:t>- Thời hạn sử dụng đất: [Thời hạn sử dụng]</w:t>
       </w:r>
     </w:p>
     <w:p>
@@ -6472,7 +5792,8 @@
           <w:sz w:val="26"/>
           <w:szCs w:val="26"/>
         </w:rPr>
-        <w:t>- Thời hạn sử dụng đất: [Thời hạn sử dụng]</w:t>
+        <w:lastRenderedPageBreak/>
+        <w:t>- Nguồn gốc sử dụng đất: [Nguồn gốc]</w:t>
       </w:r>
     </w:p>
     <w:p>
@@ -6494,7 +5815,7 @@
           <w:sz w:val="26"/>
           <w:szCs w:val="26"/>
         </w:rPr>
-        <w:t>- Nguồn gốc sử dụng đất: [Nguồn gốc]</w:t>
+        <w:t>- Ghi chú: [Ghi chú]</w:t>
       </w:r>
     </w:p>
     <w:p>
@@ -6694,23 +6015,27 @@
     <w:p>
       <w:pPr>
         <w:widowControl w:val="0"/>
-        <w:spacing w:after="0" w:line="276" w:lineRule="auto"/>
+        <w:spacing w:line="276" w:lineRule="auto"/>
         <w:ind w:firstLine="567"/>
         <w:contextualSpacing/>
         <w:jc w:val="both"/>
         <w:rPr>
-          <w:rFonts w:ascii="Times New Roman" w:eastAsia="Times New Roman" w:hAnsi="Times New Roman" w:cs="Times New Roman"/>
-          <w:sz w:val="26"/>
-          <w:szCs w:val="26"/>
-        </w:rPr>
-      </w:pPr>
-      <w:r>
-        <w:rPr>
-          <w:rFonts w:ascii="Times New Roman" w:eastAsia="Times New Roman" w:hAnsi="Times New Roman" w:cs="Times New Roman"/>
-          <w:sz w:val="26"/>
-          <w:szCs w:val="26"/>
-        </w:rPr>
-        <w:t>- Ghi chú: [Ghi chú]</w:t>
+          <w:rFonts w:ascii="Times New Roman" w:hAnsi="Times New Roman"/>
+          <w:bCs/>
+          <w:sz w:val="26"/>
+          <w:szCs w:val="26"/>
+          <w:lang w:val="fr-FR"/>
+        </w:rPr>
+      </w:pPr>
+      <w:r>
+        <w:rPr>
+          <w:rFonts w:ascii="Times New Roman" w:hAnsi="Times New Roman"/>
+          <w:bCs/>
+          <w:sz w:val="26"/>
+          <w:szCs w:val="26"/>
+          <w:lang w:val="fr-FR"/>
+        </w:rPr>
+        <w:t xml:space="preserve">c) Xác định tình trạng tài sản: [Tình trạng sử dụng TS] </w:t>
       </w:r>
     </w:p>
     <w:p>
@@ -6736,7 +6061,17 @@
           <w:szCs w:val="26"/>
           <w:lang w:val="fr-FR"/>
         </w:rPr>
-        <w:t xml:space="preserve">c) Xác định tình trạng tài sản: [Tình trạng sử dụng TS] </w:t>
+        <w:t>d)</w:t>
+      </w:r>
+      <w:r>
+        <w:rPr>
+          <w:rFonts w:ascii="Times New Roman" w:hAnsi="Times New Roman"/>
+          <w:bCs/>
+          <w:sz w:val="26"/>
+          <w:szCs w:val="26"/>
+          <w:lang w:val="fr-FR"/>
+        </w:rPr>
+        <w:t xml:space="preserve"> Xác định tính tranh chấp của tài sản: </w:t>
       </w:r>
     </w:p>
     <w:p>
@@ -6762,42 +6097,6 @@
           <w:szCs w:val="26"/>
           <w:lang w:val="fr-FR"/>
         </w:rPr>
-        <w:t>d)</w:t>
-      </w:r>
-      <w:r>
-        <w:rPr>
-          <w:rFonts w:ascii="Times New Roman" w:hAnsi="Times New Roman"/>
-          <w:bCs/>
-          <w:sz w:val="26"/>
-          <w:szCs w:val="26"/>
-          <w:lang w:val="fr-FR"/>
-        </w:rPr>
-        <w:t xml:space="preserve"> Xác định tính tranh chấp của tài sản: </w:t>
-      </w:r>
-    </w:p>
-    <w:p>
-      <w:pPr>
-        <w:widowControl w:val="0"/>
-        <w:spacing w:line="276" w:lineRule="auto"/>
-        <w:ind w:firstLine="567"/>
-        <w:contextualSpacing/>
-        <w:jc w:val="both"/>
-        <w:rPr>
-          <w:rFonts w:ascii="Times New Roman" w:hAnsi="Times New Roman"/>
-          <w:bCs/>
-          <w:sz w:val="26"/>
-          <w:szCs w:val="26"/>
-          <w:lang w:val="fr-FR"/>
-        </w:rPr>
-      </w:pPr>
-      <w:r>
-        <w:rPr>
-          <w:rFonts w:ascii="Times New Roman" w:hAnsi="Times New Roman"/>
-          <w:bCs/>
-          <w:sz w:val="26"/>
-          <w:szCs w:val="26"/>
-          <w:lang w:val="fr-FR"/>
-        </w:rPr>
         <w:t>- Người sử dụng đồng thời là chủ sở hữu tài sản: [Tên chủ sở hữu TS].</w:t>
       </w:r>
     </w:p>
@@ -6936,6 +6235,444 @@
     </w:p>
     <w:p>
       <w:pPr>
+        <w:spacing w:before="60" w:after="60" w:line="276" w:lineRule="auto"/>
+        <w:ind w:firstLine="567"/>
+        <w:jc w:val="both"/>
+        <w:rPr>
+          <w:rFonts w:ascii="Times New Roman" w:hAnsi="Times New Roman" w:cs="Times New Roman"/>
+          <w:sz w:val="26"/>
+          <w:szCs w:val="26"/>
+        </w:rPr>
+      </w:pPr>
+      <w:r>
+        <w:rPr>
+          <w:rFonts w:ascii="Times New Roman" w:hAnsi="Times New Roman" w:cs="Times New Roman"/>
+          <w:sz w:val="26"/>
+          <w:szCs w:val="26"/>
+        </w:rPr>
+        <w:t>[#ĐS]</w:t>
+      </w:r>
+    </w:p>
+    <w:p>
+      <w:pPr>
+        <w:spacing w:before="60" w:after="60" w:line="276" w:lineRule="auto"/>
+        <w:ind w:firstLine="567"/>
+        <w:jc w:val="both"/>
+        <w:rPr>
+          <w:rFonts w:ascii="Times New Roman" w:hAnsi="Times New Roman" w:cs="Times New Roman"/>
+          <w:sz w:val="26"/>
+          <w:szCs w:val="26"/>
+        </w:rPr>
+      </w:pPr>
+      <w:r>
+        <w:rPr>
+          <w:rFonts w:ascii="Times New Roman" w:hAnsi="Times New Roman" w:cs="Times New Roman"/>
+          <w:b/>
+          <w:bCs/>
+          <w:sz w:val="26"/>
+          <w:szCs w:val="26"/>
+        </w:rPr>
+        <w:t>4.[STT].</w:t>
+      </w:r>
+      <w:r>
+        <w:rPr>
+          <w:rFonts w:ascii="Times New Roman" w:hAnsi="Times New Roman" w:cs="Times New Roman"/>
+          <w:sz w:val="26"/>
+          <w:szCs w:val="26"/>
+        </w:rPr>
+        <w:t xml:space="preserve"> </w:t>
+      </w:r>
+      <w:r>
+        <w:rPr>
+          <w:rFonts w:ascii="Times New Roman" w:eastAsia="Times New Roman" w:hAnsi="Times New Roman" w:cs="Times New Roman"/>
+          <w:b/>
+          <w:bCs/>
+          <w:sz w:val="26"/>
+          <w:szCs w:val="26"/>
+        </w:rPr>
+        <w:t>Chi tiết tài sản</w:t>
+      </w:r>
+      <w:r>
+        <w:rPr>
+          <w:rFonts w:ascii="Times New Roman" w:eastAsia="Times New Roman" w:hAnsi="Times New Roman" w:cs="Times New Roman"/>
+          <w:b/>
+          <w:bCs/>
+          <w:sz w:val="26"/>
+          <w:szCs w:val="26"/>
+        </w:rPr>
+        <w:t xml:space="preserve"> thứ [STT]</w:t>
+      </w:r>
+    </w:p>
+    <w:p>
+      <w:pPr>
+        <w:spacing w:before="60" w:after="60" w:line="276" w:lineRule="auto"/>
+        <w:ind w:firstLine="567"/>
+        <w:jc w:val="both"/>
+        <w:rPr>
+          <w:rFonts w:ascii="Times New Roman" w:hAnsi="Times New Roman" w:cs="Times New Roman"/>
+          <w:sz w:val="26"/>
+          <w:szCs w:val="26"/>
+        </w:rPr>
+      </w:pPr>
+      <w:r>
+        <w:rPr>
+          <w:rFonts w:ascii="Times New Roman" w:hAnsi="Times New Roman" w:cs="Times New Roman"/>
+          <w:sz w:val="26"/>
+          <w:szCs w:val="26"/>
+        </w:rPr>
+        <w:t>a) Chi tiết tài sản (theo Giấy chứng nhận đăng ký xe ô tô số [ĐS.Giấy đăng ký số] do [ĐS.Cơ quan cấp] cấp ngày [ĐS.Cấp ngày])</w:t>
+      </w:r>
+    </w:p>
+    <w:p>
+      <w:pPr>
+        <w:spacing w:before="60" w:after="60" w:line="276" w:lineRule="auto"/>
+        <w:ind w:firstLine="567"/>
+        <w:jc w:val="both"/>
+        <w:rPr>
+          <w:rFonts w:ascii="Times New Roman" w:hAnsi="Times New Roman" w:cs="Times New Roman"/>
+          <w:sz w:val="26"/>
+          <w:szCs w:val="26"/>
+        </w:rPr>
+      </w:pPr>
+      <w:r>
+        <w:rPr>
+          <w:rFonts w:ascii="Times New Roman" w:hAnsi="Times New Roman" w:cs="Times New Roman"/>
+          <w:sz w:val="26"/>
+          <w:szCs w:val="26"/>
+        </w:rPr>
+        <w:t>Nhãn hiệu: [ĐS.Nhãn hiệu]</w:t>
+      </w:r>
+      <w:r>
+        <w:rPr>
+          <w:rFonts w:ascii="Times New Roman" w:hAnsi="Times New Roman" w:cs="Times New Roman"/>
+          <w:sz w:val="26"/>
+          <w:szCs w:val="26"/>
+        </w:rPr>
+        <w:tab/>
+      </w:r>
+      <w:r>
+        <w:rPr>
+          <w:rFonts w:ascii="Times New Roman" w:hAnsi="Times New Roman" w:cs="Times New Roman"/>
+          <w:sz w:val="26"/>
+          <w:szCs w:val="26"/>
+        </w:rPr>
+        <w:tab/>
+      </w:r>
+      <w:r>
+        <w:rPr>
+          <w:rFonts w:ascii="Times New Roman" w:hAnsi="Times New Roman" w:cs="Times New Roman"/>
+          <w:sz w:val="26"/>
+          <w:szCs w:val="26"/>
+        </w:rPr>
+        <w:tab/>
+      </w:r>
+      <w:r>
+        <w:rPr>
+          <w:rFonts w:ascii="Times New Roman" w:hAnsi="Times New Roman" w:cs="Times New Roman"/>
+          <w:sz w:val="26"/>
+          <w:szCs w:val="26"/>
+        </w:rPr>
+        <w:tab/>
+        <w:t>Số loại: [ĐS.Số loại]</w:t>
+      </w:r>
+    </w:p>
+    <w:p>
+      <w:pPr>
+        <w:spacing w:before="60" w:after="60" w:line="276" w:lineRule="auto"/>
+        <w:ind w:firstLine="567"/>
+        <w:jc w:val="both"/>
+        <w:rPr>
+          <w:rFonts w:ascii="Times New Roman" w:hAnsi="Times New Roman" w:cs="Times New Roman"/>
+          <w:sz w:val="26"/>
+          <w:szCs w:val="26"/>
+        </w:rPr>
+      </w:pPr>
+      <w:r>
+        <w:rPr>
+          <w:rFonts w:ascii="Times New Roman" w:hAnsi="Times New Roman" w:cs="Times New Roman"/>
+          <w:sz w:val="26"/>
+          <w:szCs w:val="26"/>
+        </w:rPr>
+        <w:t>Màu sơn: [ĐS.Màu sơn]</w:t>
+      </w:r>
+      <w:r>
+        <w:rPr>
+          <w:rFonts w:ascii="Times New Roman" w:hAnsi="Times New Roman" w:cs="Times New Roman"/>
+          <w:sz w:val="26"/>
+          <w:szCs w:val="26"/>
+        </w:rPr>
+        <w:tab/>
+      </w:r>
+      <w:r>
+        <w:rPr>
+          <w:rFonts w:ascii="Times New Roman" w:hAnsi="Times New Roman" w:cs="Times New Roman"/>
+          <w:sz w:val="26"/>
+          <w:szCs w:val="26"/>
+        </w:rPr>
+        <w:tab/>
+      </w:r>
+      <w:r>
+        <w:rPr>
+          <w:rFonts w:ascii="Times New Roman" w:hAnsi="Times New Roman" w:cs="Times New Roman"/>
+          <w:sz w:val="26"/>
+          <w:szCs w:val="26"/>
+        </w:rPr>
+        <w:tab/>
+      </w:r>
+      <w:r>
+        <w:rPr>
+          <w:rFonts w:ascii="Times New Roman" w:hAnsi="Times New Roman" w:cs="Times New Roman"/>
+          <w:sz w:val="26"/>
+          <w:szCs w:val="26"/>
+        </w:rPr>
+        <w:tab/>
+        <w:t>Số máy: [ĐS.Số máy]</w:t>
+      </w:r>
+    </w:p>
+    <w:p>
+      <w:pPr>
+        <w:spacing w:before="60" w:after="60" w:line="276" w:lineRule="auto"/>
+        <w:ind w:firstLine="567"/>
+        <w:jc w:val="both"/>
+        <w:rPr>
+          <w:rFonts w:ascii="Times New Roman" w:hAnsi="Times New Roman" w:cs="Times New Roman"/>
+          <w:sz w:val="26"/>
+          <w:szCs w:val="26"/>
+        </w:rPr>
+      </w:pPr>
+      <w:r>
+        <w:rPr>
+          <w:rFonts w:ascii="Times New Roman" w:hAnsi="Times New Roman" w:cs="Times New Roman"/>
+          <w:sz w:val="26"/>
+          <w:szCs w:val="26"/>
+        </w:rPr>
+        <w:t>Năm sản xuất: [ĐS.Năm sản xuất]</w:t>
+      </w:r>
+      <w:r>
+        <w:rPr>
+          <w:rFonts w:ascii="Times New Roman" w:hAnsi="Times New Roman" w:cs="Times New Roman"/>
+          <w:sz w:val="26"/>
+          <w:szCs w:val="26"/>
+        </w:rPr>
+        <w:tab/>
+      </w:r>
+      <w:r>
+        <w:rPr>
+          <w:rFonts w:ascii="Times New Roman" w:hAnsi="Times New Roman" w:cs="Times New Roman"/>
+          <w:sz w:val="26"/>
+          <w:szCs w:val="26"/>
+        </w:rPr>
+        <w:tab/>
+      </w:r>
+      <w:r>
+        <w:rPr>
+          <w:rFonts w:ascii="Times New Roman" w:hAnsi="Times New Roman" w:cs="Times New Roman"/>
+          <w:sz w:val="26"/>
+          <w:szCs w:val="26"/>
+        </w:rPr>
+        <w:tab/>
+        <w:t>Số khung: [ĐS.Số khung]</w:t>
+      </w:r>
+    </w:p>
+    <w:p>
+      <w:pPr>
+        <w:spacing w:before="60" w:after="60" w:line="276" w:lineRule="auto"/>
+        <w:ind w:firstLine="567"/>
+        <w:jc w:val="both"/>
+        <w:rPr>
+          <w:rFonts w:ascii="Times New Roman" w:hAnsi="Times New Roman" w:cs="Times New Roman"/>
+          <w:sz w:val="26"/>
+          <w:szCs w:val="26"/>
+        </w:rPr>
+      </w:pPr>
+      <w:r>
+        <w:rPr>
+          <w:rFonts w:ascii="Times New Roman" w:hAnsi="Times New Roman" w:cs="Times New Roman"/>
+          <w:sz w:val="26"/>
+          <w:szCs w:val="26"/>
+        </w:rPr>
+        <w:t>Biển kiểm soát: [ĐS.Biển kiểm soát]</w:t>
+      </w:r>
+      <w:r>
+        <w:rPr>
+          <w:rFonts w:ascii="Times New Roman" w:hAnsi="Times New Roman" w:cs="Times New Roman"/>
+          <w:sz w:val="26"/>
+          <w:szCs w:val="26"/>
+        </w:rPr>
+        <w:tab/>
+      </w:r>
+      <w:r>
+        <w:rPr>
+          <w:rFonts w:ascii="Times New Roman" w:hAnsi="Times New Roman" w:cs="Times New Roman"/>
+          <w:sz w:val="26"/>
+          <w:szCs w:val="26"/>
+        </w:rPr>
+        <w:tab/>
+        <w:t>Số chỗ ngồi: [ĐS.Số chỗ ngồi]</w:t>
+      </w:r>
+    </w:p>
+    <w:p>
+      <w:pPr>
+        <w:spacing w:before="60" w:after="60" w:line="276" w:lineRule="auto"/>
+        <w:ind w:firstLine="567"/>
+        <w:jc w:val="both"/>
+        <w:rPr>
+          <w:rFonts w:ascii="Times New Roman" w:hAnsi="Times New Roman" w:cs="Times New Roman"/>
+          <w:sz w:val="26"/>
+          <w:szCs w:val="26"/>
+        </w:rPr>
+      </w:pPr>
+      <w:r>
+        <w:rPr>
+          <w:rFonts w:ascii="Times New Roman" w:hAnsi="Times New Roman" w:cs="Times New Roman"/>
+          <w:sz w:val="26"/>
+          <w:szCs w:val="26"/>
+        </w:rPr>
+        <w:t>b) Xác định tình trạng tài sản: [ĐS.Tình trạng sử dụng TS]</w:t>
+      </w:r>
+    </w:p>
+    <w:p>
+      <w:pPr>
+        <w:spacing w:before="60" w:after="60" w:line="276" w:lineRule="auto"/>
+        <w:ind w:firstLine="567"/>
+        <w:jc w:val="both"/>
+        <w:rPr>
+          <w:rFonts w:ascii="Times New Roman" w:hAnsi="Times New Roman" w:cs="Times New Roman"/>
+          <w:sz w:val="26"/>
+          <w:szCs w:val="26"/>
+        </w:rPr>
+      </w:pPr>
+      <w:r>
+        <w:rPr>
+          <w:rFonts w:ascii="Times New Roman" w:hAnsi="Times New Roman" w:cs="Times New Roman"/>
+          <w:sz w:val="26"/>
+          <w:szCs w:val="26"/>
+        </w:rPr>
+        <w:t>c) Xác định tính tranh chấp của tài sản:</w:t>
+      </w:r>
+    </w:p>
+    <w:p>
+      <w:pPr>
+        <w:spacing w:before="60" w:after="60" w:line="276" w:lineRule="auto"/>
+        <w:ind w:firstLine="567"/>
+        <w:jc w:val="both"/>
+        <w:rPr>
+          <w:rFonts w:ascii="Times New Roman" w:hAnsi="Times New Roman" w:cs="Times New Roman"/>
+          <w:sz w:val="26"/>
+          <w:szCs w:val="26"/>
+        </w:rPr>
+      </w:pPr>
+      <w:r>
+        <w:rPr>
+          <w:rFonts w:ascii="Times New Roman" w:hAnsi="Times New Roman" w:cs="Times New Roman"/>
+          <w:sz w:val="26"/>
+          <w:szCs w:val="26"/>
+        </w:rPr>
+        <w:t>- Người sử dụng đồng thời là chủ sở hữu tài sản: [ĐS.Tên chủ sở hữu TS].</w:t>
+      </w:r>
+    </w:p>
+    <w:p>
+      <w:pPr>
+        <w:spacing w:before="60" w:after="60" w:line="276" w:lineRule="auto"/>
+        <w:ind w:firstLine="567"/>
+        <w:jc w:val="both"/>
+        <w:rPr>
+          <w:rFonts w:ascii="Times New Roman" w:hAnsi="Times New Roman" w:cs="Times New Roman"/>
+          <w:sz w:val="26"/>
+          <w:szCs w:val="26"/>
+        </w:rPr>
+      </w:pPr>
+      <w:r>
+        <w:rPr>
+          <w:rFonts w:ascii="Times New Roman" w:hAnsi="Times New Roman" w:cs="Times New Roman"/>
+          <w:sz w:val="26"/>
+          <w:szCs w:val="26"/>
+        </w:rPr>
+        <w:t>- Tại thời điểm thẩm định, tài sản không có tranh chấp, toàn bộ thuộc tài sản thế chấp.</w:t>
+      </w:r>
+    </w:p>
+    <w:p>
+      <w:pPr>
+        <w:spacing w:before="60" w:after="60" w:line="276" w:lineRule="auto"/>
+        <w:ind w:firstLine="567"/>
+        <w:jc w:val="both"/>
+        <w:rPr>
+          <w:rFonts w:ascii="Times New Roman" w:hAnsi="Times New Roman" w:cs="Times New Roman"/>
+          <w:sz w:val="26"/>
+          <w:szCs w:val="26"/>
+        </w:rPr>
+      </w:pPr>
+      <w:r>
+        <w:rPr>
+          <w:rFonts w:ascii="Times New Roman" w:hAnsi="Times New Roman" w:cs="Times New Roman"/>
+          <w:sz w:val="26"/>
+          <w:szCs w:val="26"/>
+        </w:rPr>
+        <w:t>d) Tính thanh khoản: [ĐS.Khái quát về lợi thế]</w:t>
+      </w:r>
+    </w:p>
+    <w:p>
+      <w:pPr>
+        <w:spacing w:before="60" w:after="60" w:line="276" w:lineRule="auto"/>
+        <w:ind w:firstLine="567"/>
+        <w:jc w:val="both"/>
+        <w:rPr>
+          <w:rFonts w:ascii="Times New Roman" w:hAnsi="Times New Roman" w:cs="Times New Roman"/>
+          <w:sz w:val="26"/>
+          <w:szCs w:val="26"/>
+        </w:rPr>
+      </w:pPr>
+      <w:r>
+        <w:rPr>
+          <w:rFonts w:ascii="Times New Roman" w:hAnsi="Times New Roman" w:cs="Times New Roman"/>
+          <w:sz w:val="26"/>
+          <w:szCs w:val="26"/>
+        </w:rPr>
+        <w:t>e) Mua bảo hiểm TSBĐ: [ĐS.Mua bảo hiểm TSBĐ]</w:t>
+      </w:r>
+    </w:p>
+    <w:p>
+      <w:pPr>
+        <w:spacing w:before="60" w:after="60" w:line="276" w:lineRule="auto"/>
+        <w:ind w:firstLine="567"/>
+        <w:jc w:val="both"/>
+        <w:rPr>
+          <w:rFonts w:ascii="Times New Roman" w:hAnsi="Times New Roman" w:cs="Times New Roman"/>
+          <w:sz w:val="26"/>
+          <w:szCs w:val="26"/>
+        </w:rPr>
+      </w:pPr>
+      <w:r>
+        <w:rPr>
+          <w:rFonts w:ascii="Times New Roman" w:hAnsi="Times New Roman" w:cs="Times New Roman"/>
+          <w:sz w:val="26"/>
+          <w:szCs w:val="26"/>
+        </w:rPr>
+        <w:t>f) Thời hạn sử dụng còn lại: [ĐS.Thời hạn sử dụng]</w:t>
+      </w:r>
+    </w:p>
+    <w:p>
+      <w:pPr>
+        <w:spacing w:before="60" w:after="60" w:line="276" w:lineRule="auto"/>
+        <w:ind w:firstLine="567"/>
+        <w:jc w:val="both"/>
+        <w:rPr>
+          <w:rFonts w:ascii="Times New Roman" w:hAnsi="Times New Roman" w:cs="Times New Roman"/>
+          <w:sz w:val="26"/>
+          <w:szCs w:val="26"/>
+        </w:rPr>
+      </w:pPr>
+      <w:r>
+        <w:rPr>
+          <w:rFonts w:ascii="Times New Roman" w:hAnsi="Times New Roman" w:cs="Times New Roman"/>
+          <w:sz w:val="26"/>
+          <w:szCs w:val="26"/>
+        </w:rPr>
+        <w:t>[/ĐS]</w:t>
+      </w:r>
+    </w:p>
+    <w:p>
+      <w:pPr>
         <w:widowControl w:val="0"/>
         <w:spacing w:after="0" w:line="276" w:lineRule="auto"/>
         <w:ind w:firstLine="567"/>
@@ -6970,7 +6707,18 @@
           <w:szCs w:val="26"/>
           <w:lang w:val="fr-FR"/>
         </w:rPr>
-        <w:t>7. Xác định giá trị TSBĐ:</w:t>
+        <w:t>3</w:t>
+      </w:r>
+      <w:r>
+        <w:rPr>
+          <w:rFonts w:ascii="Times New Roman" w:eastAsia="Calibri" w:hAnsi="Times New Roman" w:cs="Times New Roman"/>
+          <w:b/>
+          <w:bCs/>
+          <w:sz w:val="26"/>
+          <w:szCs w:val="26"/>
+          <w:lang w:val="fr-FR"/>
+        </w:rPr>
+        <w:t>. Xác định giá trị TSBĐ:</w:t>
       </w:r>
     </w:p>
     <w:p>
@@ -7053,13 +6801,14 @@
           </w:tcPr>
           <w:p>
             <w:pPr>
+              <w:spacing w:after="0"/>
               <w:jc w:val="center"/>
               <w:rPr>
                 <w:rFonts w:ascii="Times New Roman" w:hAnsi="Times New Roman"/>
                 <w:b/>
                 <w:bCs/>
-                <w:sz w:val="26"/>
-                <w:szCs w:val="26"/>
+                <w:sz w:val="24"/>
+                <w:szCs w:val="24"/>
               </w:rPr>
             </w:pPr>
             <w:r>
@@ -7067,8 +6816,8 @@
                 <w:rFonts w:ascii="Times New Roman" w:hAnsi="Times New Roman"/>
                 <w:b/>
                 <w:bCs/>
-                <w:sz w:val="26"/>
-                <w:szCs w:val="26"/>
+                <w:sz w:val="24"/>
+                <w:szCs w:val="24"/>
               </w:rPr>
               <w:t>STT</w:t>
             </w:r>
@@ -7089,13 +6838,14 @@
           </w:tcPr>
           <w:p>
             <w:pPr>
+              <w:spacing w:after="0"/>
               <w:jc w:val="center"/>
               <w:rPr>
                 <w:rFonts w:ascii="Times New Roman" w:hAnsi="Times New Roman"/>
                 <w:b/>
                 <w:bCs/>
-                <w:sz w:val="26"/>
-                <w:szCs w:val="26"/>
+                <w:sz w:val="24"/>
+                <w:szCs w:val="24"/>
               </w:rPr>
             </w:pPr>
             <w:r>
@@ -7103,8 +6853,8 @@
                 <w:rFonts w:ascii="Times New Roman" w:hAnsi="Times New Roman"/>
                 <w:b/>
                 <w:bCs/>
-                <w:sz w:val="26"/>
-                <w:szCs w:val="26"/>
+                <w:sz w:val="24"/>
+                <w:szCs w:val="24"/>
               </w:rPr>
               <w:t>Loại tài sản</w:t>
             </w:r>
@@ -7122,13 +6872,14 @@
           </w:tcPr>
           <w:p>
             <w:pPr>
+              <w:spacing w:after="0"/>
               <w:jc w:val="center"/>
               <w:rPr>
                 <w:rFonts w:ascii="Times New Roman" w:hAnsi="Times New Roman"/>
                 <w:b/>
                 <w:bCs/>
-                <w:sz w:val="26"/>
-                <w:szCs w:val="26"/>
+                <w:sz w:val="24"/>
+                <w:szCs w:val="24"/>
               </w:rPr>
             </w:pPr>
             <w:r>
@@ -7139,17 +6890,7 @@
                 <w:sz w:val="24"/>
                 <w:szCs w:val="24"/>
               </w:rPr>
-              <w:t xml:space="preserve">Số </w:t>
-            </w:r>
-            <w:r>
-              <w:rPr>
-                <w:rFonts w:ascii="Times New Roman" w:eastAsia="Times New Roman" w:hAnsi="Times New Roman" w:cs="Times New Roman"/>
-                <w:b/>
-                <w:bCs/>
-                <w:sz w:val="24"/>
-                <w:szCs w:val="24"/>
-              </w:rPr>
-              <w:t>GCN</w:t>
+              <w:t>Số GCN</w:t>
             </w:r>
           </w:p>
         </w:tc>
@@ -7168,13 +6909,14 @@
           </w:tcPr>
           <w:p>
             <w:pPr>
+              <w:spacing w:after="0"/>
               <w:jc w:val="center"/>
               <w:rPr>
                 <w:rFonts w:ascii="Times New Roman" w:hAnsi="Times New Roman"/>
                 <w:b/>
                 <w:bCs/>
-                <w:sz w:val="26"/>
-                <w:szCs w:val="26"/>
+                <w:sz w:val="24"/>
+                <w:szCs w:val="24"/>
               </w:rPr>
             </w:pPr>
             <w:r>
@@ -7182,8 +6924,8 @@
                 <w:rFonts w:ascii="Times New Roman" w:hAnsi="Times New Roman"/>
                 <w:b/>
                 <w:bCs/>
-                <w:sz w:val="26"/>
-                <w:szCs w:val="26"/>
+                <w:sz w:val="24"/>
+                <w:szCs w:val="24"/>
               </w:rPr>
               <w:t>Diện tích (m</w:t>
             </w:r>
@@ -7192,8 +6934,8 @@
                 <w:rFonts w:ascii="Times New Roman" w:hAnsi="Times New Roman"/>
                 <w:b/>
                 <w:bCs/>
-                <w:sz w:val="26"/>
-                <w:szCs w:val="26"/>
+                <w:sz w:val="24"/>
+                <w:szCs w:val="24"/>
                 <w:vertAlign w:val="superscript"/>
               </w:rPr>
               <w:t>2</w:t>
@@ -7203,8 +6945,8 @@
                 <w:rFonts w:ascii="Times New Roman" w:hAnsi="Times New Roman"/>
                 <w:b/>
                 <w:bCs/>
-                <w:sz w:val="26"/>
-                <w:szCs w:val="26"/>
+                <w:sz w:val="24"/>
+                <w:szCs w:val="24"/>
               </w:rPr>
               <w:t>)</w:t>
             </w:r>
@@ -7225,13 +6967,14 @@
           </w:tcPr>
           <w:p>
             <w:pPr>
+              <w:spacing w:after="0"/>
               <w:jc w:val="center"/>
               <w:rPr>
                 <w:rFonts w:ascii="Times New Roman" w:hAnsi="Times New Roman"/>
                 <w:b/>
                 <w:bCs/>
-                <w:sz w:val="26"/>
-                <w:szCs w:val="26"/>
+                <w:sz w:val="24"/>
+                <w:szCs w:val="24"/>
               </w:rPr>
             </w:pPr>
             <w:r>
@@ -7239,8 +6982,8 @@
                 <w:rFonts w:ascii="Times New Roman" w:hAnsi="Times New Roman"/>
                 <w:b/>
                 <w:bCs/>
-                <w:sz w:val="26"/>
-                <w:szCs w:val="26"/>
+                <w:sz w:val="24"/>
+                <w:szCs w:val="24"/>
               </w:rPr>
               <w:t>Đơn giá (đồng/m</w:t>
             </w:r>
@@ -7249,8 +6992,8 @@
                 <w:rFonts w:ascii="Times New Roman" w:hAnsi="Times New Roman"/>
                 <w:b/>
                 <w:bCs/>
-                <w:sz w:val="26"/>
-                <w:szCs w:val="26"/>
+                <w:sz w:val="24"/>
+                <w:szCs w:val="24"/>
                 <w:vertAlign w:val="superscript"/>
               </w:rPr>
               <w:t>2</w:t>
@@ -7260,8 +7003,8 @@
                 <w:rFonts w:ascii="Times New Roman" w:hAnsi="Times New Roman"/>
                 <w:b/>
                 <w:bCs/>
-                <w:sz w:val="26"/>
-                <w:szCs w:val="26"/>
+                <w:sz w:val="24"/>
+                <w:szCs w:val="24"/>
               </w:rPr>
               <w:t>)</w:t>
             </w:r>
@@ -7282,13 +7025,14 @@
           </w:tcPr>
           <w:p>
             <w:pPr>
+              <w:spacing w:after="0"/>
               <w:jc w:val="center"/>
               <w:rPr>
                 <w:rFonts w:ascii="Times New Roman" w:hAnsi="Times New Roman"/>
                 <w:b/>
                 <w:bCs/>
-                <w:sz w:val="26"/>
-                <w:szCs w:val="26"/>
+                <w:sz w:val="24"/>
+                <w:szCs w:val="24"/>
               </w:rPr>
             </w:pPr>
             <w:r>
@@ -7296,8 +7040,8 @@
                 <w:rFonts w:ascii="Times New Roman" w:hAnsi="Times New Roman"/>
                 <w:b/>
                 <w:bCs/>
-                <w:sz w:val="26"/>
-                <w:szCs w:val="26"/>
+                <w:sz w:val="24"/>
+                <w:szCs w:val="24"/>
               </w:rPr>
               <w:t>Giá trị (đồng)</w:t>
             </w:r>
@@ -7306,7 +7050,7 @@
       </w:tr>
       <w:tr>
         <w:trPr>
-          <w:trHeight w:val="368"/>
+          <w:trHeight w:val="1166"/>
         </w:trPr>
         <w:tc>
           <w:tcPr>
@@ -7323,6 +7067,7 @@
           </w:tcPr>
           <w:p>
             <w:pPr>
+              <w:spacing w:after="0"/>
               <w:jc w:val="center"/>
               <w:rPr>
                 <w:rFonts w:ascii="Times New Roman" w:hAnsi="Times New Roman"/>
@@ -7336,6 +7081,7 @@
                 <w:sz w:val="26"/>
                 <w:szCs w:val="26"/>
               </w:rPr>
+              <w:lastRenderedPageBreak/>
               <w:t>[#DINH_GIA][STT]</w:t>
             </w:r>
           </w:p>
@@ -7355,6 +7101,7 @@
           </w:tcPr>
           <w:p>
             <w:pPr>
+              <w:spacing w:after="0"/>
               <w:rPr>
                 <w:rFonts w:ascii="Times New Roman" w:hAnsi="Times New Roman"/>
                 <w:sz w:val="26"/>
@@ -7383,6 +7130,7 @@
           </w:tcPr>
           <w:p>
             <w:pPr>
+              <w:spacing w:after="0"/>
               <w:jc w:val="center"/>
               <w:rPr>
                 <w:rFonts w:ascii="Times New Roman" w:hAnsi="Times New Roman"/>
@@ -7416,6 +7164,7 @@
           </w:tcPr>
           <w:p>
             <w:pPr>
+              <w:spacing w:after="0"/>
               <w:jc w:val="right"/>
               <w:rPr>
                 <w:rFonts w:ascii="Times New Roman" w:hAnsi="Times New Roman"/>
@@ -7448,6 +7197,7 @@
           </w:tcPr>
           <w:p>
             <w:pPr>
+              <w:spacing w:after="0"/>
               <w:jc w:val="right"/>
               <w:rPr>
                 <w:rFonts w:ascii="Times New Roman" w:hAnsi="Times New Roman"/>
@@ -7480,6 +7230,7 @@
           </w:tcPr>
           <w:p>
             <w:pPr>
+              <w:spacing w:after="0"/>
               <w:jc w:val="right"/>
               <w:rPr>
                 <w:rFonts w:ascii="Times New Roman" w:hAnsi="Times New Roman"/>
@@ -7517,6 +7268,7 @@
           </w:tcPr>
           <w:p>
             <w:pPr>
+              <w:spacing w:after="0"/>
               <w:rPr>
                 <w:rFonts w:ascii="Times New Roman" w:hAnsi="Times New Roman"/>
                 <w:sz w:val="26"/>
@@ -7548,6 +7300,7 @@
           </w:tcPr>
           <w:p>
             <w:pPr>
+              <w:spacing w:after="0"/>
               <w:jc w:val="center"/>
               <w:rPr>
                 <w:rFonts w:ascii="Times New Roman" w:hAnsi="Times New Roman"/>
@@ -7580,6 +7333,7 @@
           </w:tcPr>
           <w:p>
             <w:pPr>
+              <w:spacing w:after="0"/>
               <w:rPr>
                 <w:rFonts w:ascii="Times New Roman" w:hAnsi="Times New Roman"/>
                 <w:sz w:val="26"/>
@@ -7603,6 +7357,7 @@
           </w:tcPr>
           <w:p>
             <w:pPr>
+              <w:spacing w:after="0"/>
               <w:rPr>
                 <w:rFonts w:ascii="Times New Roman" w:hAnsi="Times New Roman"/>
                 <w:sz w:val="26"/>
@@ -7634,6 +7389,7 @@
           </w:tcPr>
           <w:p>
             <w:pPr>
+              <w:spacing w:after="0"/>
               <w:rPr>
                 <w:rFonts w:ascii="Times New Roman" w:hAnsi="Times New Roman"/>
                 <w:sz w:val="26"/>
@@ -7665,6 +7421,7 @@
           </w:tcPr>
           <w:p>
             <w:pPr>
+              <w:spacing w:after="0"/>
               <w:jc w:val="right"/>
               <w:rPr>
                 <w:rFonts w:ascii="Times New Roman" w:hAnsi="Times New Roman"/>
@@ -7714,49 +7471,21 @@
       <w:r>
         <w:rPr>
           <w:rFonts w:ascii="Times New Roman" w:eastAsia="Calibri" w:hAnsi="Times New Roman" w:cs="Times New Roman"/>
-          <w:b/>
-          <w:sz w:val="26"/>
-          <w:szCs w:val="28"/>
-        </w:rPr>
-        <w:t>[</w:t>
-      </w:r>
-      <w:r>
-        <w:rPr>
-          <w:rFonts w:ascii="Times New Roman" w:eastAsia="Calibri" w:hAnsi="Times New Roman" w:cs="Times New Roman"/>
-          <w:b/>
-          <w:sz w:val="26"/>
-          <w:szCs w:val="28"/>
-        </w:rPr>
-        <w:t>HĐTD.</w:t>
-      </w:r>
-      <w:r>
-        <w:rPr>
-          <w:rFonts w:ascii="Times New Roman" w:eastAsia="Calibri" w:hAnsi="Times New Roman" w:cs="Times New Roman"/>
-          <w:b/>
-          <w:sz w:val="26"/>
-          <w:szCs w:val="28"/>
-        </w:rPr>
-        <w:t>Tổng giá trị TSBĐ]</w:t>
-      </w:r>
-      <w:r>
-        <w:rPr>
-          <w:rFonts w:ascii="Times New Roman" w:eastAsia="Calibri" w:hAnsi="Times New Roman" w:cs="Times New Roman"/>
-          <w:b/>
+          <w:bCs/>
+          <w:sz w:val="26"/>
+          <w:szCs w:val="28"/>
+        </w:rPr>
+        <w:t>[HĐTD.Tổng giá trị TSBĐ]</w:t>
+      </w:r>
+      <w:r>
+        <w:rPr>
+          <w:rFonts w:ascii="Times New Roman" w:eastAsia="Calibri" w:hAnsi="Times New Roman" w:cs="Times New Roman"/>
+          <w:bCs/>
           <w:sz w:val="26"/>
           <w:szCs w:val="28"/>
           <w:lang w:val="vi-VN"/>
         </w:rPr>
-        <w:t xml:space="preserve"> </w:t>
-      </w:r>
-      <w:r>
-        <w:rPr>
-          <w:rFonts w:ascii="Times New Roman" w:eastAsia="Calibri" w:hAnsi="Times New Roman" w:cs="Times New Roman"/>
-          <w:bCs/>
-          <w:sz w:val="26"/>
-          <w:szCs w:val="28"/>
-          <w:lang w:val="vi-VN"/>
-        </w:rPr>
-        <w:t>đồng</w:t>
+        <w:t xml:space="preserve"> đồng</w:t>
       </w:r>
     </w:p>
     <w:p>
@@ -7795,7 +7524,7 @@
           <w:szCs w:val="26"/>
           <w:lang w:val="fr-FR"/>
         </w:rPr>
-        <w:t>8. Mức cho vay có bảo đảm bằng tài sả</w:t>
+        <w:t>4</w:t>
       </w:r>
       <w:r>
         <w:rPr>
@@ -7806,7 +7535,7 @@
           <w:szCs w:val="26"/>
           <w:lang w:val="fr-FR"/>
         </w:rPr>
-        <w:t>n</w:t>
+        <w:t>. Mức cho vay có bảo đảm bằng tài sả</w:t>
       </w:r>
       <w:r>
         <w:rPr>
@@ -7817,17 +7546,28 @@
           <w:szCs w:val="26"/>
           <w:lang w:val="fr-FR"/>
         </w:rPr>
+        <w:t>n</w:t>
+      </w:r>
+      <w:r>
+        <w:rPr>
+          <w:rFonts w:ascii="Times New Roman" w:eastAsia="Calibri" w:hAnsi="Times New Roman" w:cs="Times New Roman"/>
+          <w:b/>
+          <w:bCs/>
+          <w:sz w:val="26"/>
+          <w:szCs w:val="26"/>
+          <w:lang w:val="fr-FR"/>
+        </w:rPr>
         <w:t xml:space="preserve">: </w:t>
       </w:r>
       <w:r>
         <w:rPr>
-          <w:rFonts w:ascii="Times New Roman" w:hAnsi="Times New Roman"/>
+          <w:rFonts w:ascii="Times New Roman" w:eastAsia="Times New Roman" w:hAnsi="Times New Roman" w:cs="Times New Roman"/>
           <w:bCs/>
           <w:sz w:val="26"/>
           <w:szCs w:val="26"/>
-          <w:lang w:val="fr-FR"/>
-        </w:rPr>
-        <w:t>[SĐ.Nghĩa vụ bảo đảm]</w:t>
+          <w:lang w:val="pt-BR"/>
+        </w:rPr>
+        <w:t>[PA.Số tiền vay]</w:t>
       </w:r>
       <w:r>
         <w:rPr>
@@ -7876,7 +7616,18 @@
           <w:szCs w:val="26"/>
           <w:lang w:val="fr-FR"/>
         </w:rPr>
-        <w:t>9. Nghĩa vụ được bảo đảm, phạm vi bảo đảm</w:t>
+        <w:t>5</w:t>
+      </w:r>
+      <w:r>
+        <w:rPr>
+          <w:rFonts w:ascii="Times New Roman" w:eastAsia="Calibri" w:hAnsi="Times New Roman" w:cs="Times New Roman"/>
+          <w:b/>
+          <w:bCs/>
+          <w:sz w:val="26"/>
+          <w:szCs w:val="26"/>
+          <w:lang w:val="fr-FR"/>
+        </w:rPr>
+        <w:t>. Nghĩa vụ được bảo đảm, phạm vi bảo đảm</w:t>
       </w:r>
     </w:p>
     <w:p>
@@ -7982,7 +7733,7 @@
           <w:szCs w:val="26"/>
           <w:lang w:val="fr-FR"/>
         </w:rPr>
-        <w:t xml:space="preserve"> với phạm vi bảo đảm như sau: Tổng dư nợ gốc và số dư bảo lãnh (nếu có) của tất cả các hợp đồng cấp tín dụng ký giữa Agribank [Tên chi nhánh/PGD</w:t>
+        <w:t xml:space="preserve"> với phạm vi bảo đảm như sau: Tổng dư nợ gốc và số dư </w:t>
       </w:r>
       <w:r>
         <w:rPr>
@@ -7992,7 +7743,7 @@
           <w:szCs w:val="26"/>
           <w:lang w:val="fr-FR"/>
         </w:rPr>
-        <w:t>]</w:t>
+        <w:t xml:space="preserve">bảo lãnh (nếu có) của tất cả các hợp đồng cấp tín dụng ký giữa Agribank [Tên chi nhánh/PGD] và khách hàng </w:t>
       </w:r>
       <w:r>
         <w:rPr>
@@ -8002,7 +7753,7 @@
           <w:szCs w:val="26"/>
           <w:lang w:val="fr-FR"/>
         </w:rPr>
-        <w:t xml:space="preserve"> và khách hàng </w:t>
+        <w:t>là</w:t>
       </w:r>
       <w:r>
         <w:rPr>
@@ -8010,110 +7761,19 @@
           <w:bCs/>
           <w:sz w:val="26"/>
           <w:szCs w:val="26"/>
+          <w:lang w:val="vi-VN"/>
+        </w:rPr>
+        <w:t>:</w:t>
+      </w:r>
+      <w:r>
+        <w:rPr>
+          <w:rFonts w:ascii="Times New Roman" w:eastAsia="Calibri" w:hAnsi="Times New Roman" w:cs="Times New Roman"/>
+          <w:bCs/>
+          <w:sz w:val="26"/>
+          <w:szCs w:val="26"/>
           <w:lang w:val="fr-FR"/>
         </w:rPr>
-        <w:t>là</w:t>
-      </w:r>
-      <w:r>
-        <w:rPr>
-          <w:rFonts w:ascii="Times New Roman" w:eastAsia="Calibri" w:hAnsi="Times New Roman" w:cs="Times New Roman"/>
-          <w:bCs/>
-          <w:sz w:val="26"/>
-          <w:szCs w:val="26"/>
-          <w:lang w:val="vi-VN"/>
-        </w:rPr>
-        <w:t>:</w:t>
-      </w:r>
-      <w:r>
-        <w:rPr>
-          <w:rFonts w:ascii="Times New Roman" w:eastAsia="Calibri" w:hAnsi="Times New Roman" w:cs="Times New Roman"/>
-          <w:bCs/>
-          <w:sz w:val="26"/>
-          <w:szCs w:val="26"/>
-          <w:lang w:val="fr-FR"/>
-        </w:rPr>
-        <w:t xml:space="preserve"> </w:t>
-      </w:r>
-      <w:r>
-        <w:rPr>
-          <w:rFonts w:ascii="Times New Roman" w:eastAsia="Calibri" w:hAnsi="Times New Roman" w:cs="Times New Roman"/>
-          <w:bCs/>
-          <w:sz w:val="26"/>
-          <w:szCs w:val="26"/>
-          <w:lang w:val="fr-FR"/>
-        </w:rPr>
-        <w:t>[Danh xưng]</w:t>
-      </w:r>
-      <w:r>
-        <w:rPr>
-          <w:rFonts w:ascii="Times New Roman" w:eastAsia="Calibri" w:hAnsi="Times New Roman" w:cs="Times New Roman"/>
-          <w:bCs/>
-          <w:sz w:val="26"/>
-          <w:szCs w:val="26"/>
-          <w:lang w:val="fr-FR"/>
-        </w:rPr>
-        <w:t xml:space="preserve"> [Tên khách hàng]</w:t>
-      </w:r>
-      <w:r>
-        <w:rPr>
-          <w:rFonts w:ascii="Times New Roman" w:eastAsia="Calibri" w:hAnsi="Times New Roman" w:cs="Times New Roman"/>
-          <w:bCs/>
-          <w:sz w:val="26"/>
-          <w:szCs w:val="26"/>
-          <w:lang w:val="fr-FR"/>
-        </w:rPr>
-        <w:t xml:space="preserve"> và </w:t>
-      </w:r>
-      <w:r>
-        <w:rPr>
-          <w:rFonts w:ascii="Times New Roman" w:eastAsia="Calibri" w:hAnsi="Times New Roman" w:cs="Times New Roman"/>
-          <w:bCs/>
-          <w:sz w:val="26"/>
-          <w:szCs w:val="26"/>
-          <w:lang w:val="fr-FR"/>
-        </w:rPr>
-        <w:t>[TV.Danh xưng]</w:t>
-      </w:r>
-      <w:r>
-        <w:rPr>
-          <w:rFonts w:ascii="Times New Roman" w:eastAsia="Calibri" w:hAnsi="Times New Roman" w:cs="Times New Roman"/>
-          <w:bCs/>
-          <w:sz w:val="26"/>
-          <w:szCs w:val="26"/>
-          <w:lang w:val="fr-FR"/>
-        </w:rPr>
-        <w:t xml:space="preserve"> [TV.Họ và tên]</w:t>
-      </w:r>
-      <w:r>
-        <w:rPr>
-          <w:rFonts w:ascii="Times New Roman" w:eastAsia="Calibri" w:hAnsi="Times New Roman" w:cs="Times New Roman"/>
-          <w:bCs/>
-          <w:sz w:val="26"/>
-          <w:szCs w:val="26"/>
-          <w:lang w:val="fr-FR"/>
-        </w:rPr>
-        <w:t xml:space="preserve"> không vượt quá </w:t>
-      </w:r>
-      <w:r>
-        <w:rPr>
-          <w:rFonts w:ascii="Times New Roman" w:eastAsia="Calibri" w:hAnsi="Times New Roman" w:cs="Times New Roman"/>
-          <w:b/>
-          <w:bCs/>
-          <w:sz w:val="26"/>
-          <w:szCs w:val="26"/>
-          <w:lang w:val="fr-FR"/>
-        </w:rPr>
-        <w:t>[SĐ.Nghĩa vụ bảo đảm]</w:t>
-      </w:r>
-      <w:r>
-        <w:rPr>
-          <w:rFonts w:ascii="Times New Roman" w:eastAsia="Calibri" w:hAnsi="Times New Roman" w:cs="Times New Roman"/>
-          <w:bCs/>
-          <w:sz w:val="26"/>
-          <w:szCs w:val="26"/>
-          <w:lang w:val="fr-FR"/>
-        </w:rPr>
-        <w:t xml:space="preserve"> đồng (</w:t>
+        <w:t xml:space="preserve"> [Danh xưng] [Tên khách hàng] và [TV.Danh xưng] [TV.Họ và tên] không vượt quá [SĐ.Nghĩa vụ bảo đảm] đồng (</w:t>
       </w:r>
       <w:r>
         <w:rPr>
@@ -8158,8 +7818,17 @@
           <w:szCs w:val="26"/>
           <w:lang w:val="fr-FR"/>
         </w:rPr>
-        <w:lastRenderedPageBreak/>
-        <w:t>- Không giới hạn đối với các khoản lãi trong hạn, lãi quá hạn, các khoản phí và chi phí phát sinh khác liên quan (nếu có).</w:t>
+        <w:t>- Không giới hạn đối với các khoản lãi trong hạn, lãi quá hạn, các khoản phí và chi phí</w:t>
+      </w:r>
+      <w:r>
+        <w:rPr>
+          <w:rFonts w:ascii="Times New Roman" w:eastAsia="Calibri" w:hAnsi="Times New Roman" w:cs="Times New Roman"/>
+          <w:bCs/>
+          <w:sz w:val="26"/>
+          <w:szCs w:val="26"/>
+          <w:lang w:val="fr-FR"/>
+        </w:rPr>
+        <w:t xml:space="preserve"> phát sinh khác liên quan (nếu có).</w:t>
       </w:r>
     </w:p>
     <w:p>
@@ -8530,21 +8199,11 @@
           <w:sz w:val="26"/>
           <w:szCs w:val="28"/>
         </w:rPr>
-        <w:t xml:space="preserve">- Giá trị định giá tài sản bảo đảm: </w:t>
-      </w:r>
-      <w:r>
-        <w:rPr>
-          <w:rFonts w:ascii="Times New Roman" w:eastAsia="Calibri" w:hAnsi="Times New Roman" w:cs="Times New Roman"/>
-          <w:b/>
-          <w:sz w:val="26"/>
-          <w:szCs w:val="28"/>
-        </w:rPr>
-        <w:t>[</w:t>
-      </w:r>
-      <w:r>
-        <w:rPr>
-          <w:rFonts w:ascii="Times New Roman" w:eastAsia="Calibri" w:hAnsi="Times New Roman" w:cs="Times New Roman"/>
-          <w:b/>
+        <w:t>- Giá trị định giá tài sản bảo đảm: [</w:t>
+      </w:r>
+      <w:r>
+        <w:rPr>
+          <w:rFonts w:ascii="Times New Roman" w:eastAsia="Calibri" w:hAnsi="Times New Roman" w:cs="Times New Roman"/>
           <w:sz w:val="26"/>
           <w:szCs w:val="28"/>
         </w:rPr>
@@ -8553,19 +8212,10 @@
       <w:r>
         <w:rPr>
           <w:rFonts w:ascii="Times New Roman" w:eastAsia="Calibri" w:hAnsi="Times New Roman" w:cs="Times New Roman"/>
-          <w:b/>
-          <w:sz w:val="26"/>
-          <w:szCs w:val="28"/>
-        </w:rPr>
-        <w:t>Tổng giá trị TSBĐ]</w:t>
-      </w:r>
-      <w:r>
-        <w:rPr>
-          <w:rFonts w:ascii="Times New Roman" w:eastAsia="Calibri" w:hAnsi="Times New Roman" w:cs="Times New Roman"/>
-          <w:sz w:val="26"/>
-          <w:szCs w:val="28"/>
-        </w:rPr>
-        <w:t xml:space="preserve"> đồng</w:t>
+          <w:sz w:val="26"/>
+          <w:szCs w:val="28"/>
+        </w:rPr>
+        <w:t>Tổng giá trị TSBĐ] đồng</w:t>
       </w:r>
       <w:r>
         <w:rPr>
@@ -8593,7 +8243,6 @@
       <w:r>
         <w:rPr>
           <w:rFonts w:ascii="Times New Roman" w:eastAsia="Calibri" w:hAnsi="Times New Roman" w:cs="Times New Roman"/>
-          <w:bCs/>
           <w:sz w:val="26"/>
           <w:szCs w:val="28"/>
           <w:lang w:val="fr-FR"/>
@@ -8603,35 +8252,11 @@
       <w:r>
         <w:rPr>
           <w:rFonts w:ascii="Times New Roman" w:eastAsia="Calibri" w:hAnsi="Times New Roman" w:cs="Times New Roman"/>
-          <w:b/>
-          <w:bCs/>
           <w:sz w:val="26"/>
           <w:szCs w:val="28"/>
           <w:lang w:val="fr-FR"/>
         </w:rPr>
-        <w:t>[</w:t>
-      </w:r>
-      <w:r>
-        <w:rPr>
-          <w:rFonts w:ascii="Times New Roman" w:eastAsia="Calibri" w:hAnsi="Times New Roman" w:cs="Times New Roman"/>
-          <w:b/>
-          <w:bCs/>
-          <w:sz w:val="26"/>
-          <w:szCs w:val="28"/>
-          <w:lang w:val="fr-FR"/>
-        </w:rPr>
-        <w:t>HĐTD.</w:t>
-      </w:r>
-      <w:r>
-        <w:rPr>
-          <w:rFonts w:ascii="Times New Roman" w:eastAsia="Calibri" w:hAnsi="Times New Roman" w:cs="Times New Roman"/>
-          <w:b/>
-          <w:bCs/>
-          <w:sz w:val="26"/>
-          <w:szCs w:val="28"/>
-          <w:lang w:val="fr-FR"/>
-        </w:rPr>
-        <w:t>Tổng nghĩa vụ bảo đảm]</w:t>
+        <w:t>[HĐTD.Tổng nghĩa vụ bảo đảm]</w:t>
       </w:r>
       <w:r>
         <w:rPr>
@@ -8978,6 +8603,66 @@
               </w:rPr>
             </w:pPr>
           </w:p>
+          <w:p>
+            <w:pPr>
+              <w:spacing w:line="264" w:lineRule="auto"/>
+              <w:ind w:firstLine="567"/>
+              <w:jc w:val="both"/>
+              <w:rPr>
+                <w:rFonts w:ascii="Times New Roman" w:eastAsia="Calibri" w:hAnsi="Times New Roman"/>
+                <w:sz w:val="26"/>
+                <w:szCs w:val="26"/>
+              </w:rPr>
+            </w:pPr>
+          </w:p>
+          <w:p>
+            <w:pPr>
+              <w:spacing w:line="264" w:lineRule="auto"/>
+              <w:ind w:firstLine="567"/>
+              <w:jc w:val="both"/>
+              <w:rPr>
+                <w:rFonts w:ascii="Times New Roman" w:eastAsia="Calibri" w:hAnsi="Times New Roman"/>
+                <w:sz w:val="26"/>
+                <w:szCs w:val="26"/>
+              </w:rPr>
+            </w:pPr>
+          </w:p>
+          <w:p>
+            <w:pPr>
+              <w:spacing w:line="264" w:lineRule="auto"/>
+              <w:ind w:firstLine="567"/>
+              <w:jc w:val="both"/>
+              <w:rPr>
+                <w:rFonts w:ascii="Times New Roman" w:eastAsia="Calibri" w:hAnsi="Times New Roman"/>
+                <w:sz w:val="26"/>
+                <w:szCs w:val="26"/>
+              </w:rPr>
+            </w:pPr>
+          </w:p>
+          <w:p>
+            <w:pPr>
+              <w:spacing w:line="264" w:lineRule="auto"/>
+              <w:ind w:firstLine="567"/>
+              <w:jc w:val="both"/>
+              <w:rPr>
+                <w:rFonts w:ascii="Times New Roman" w:eastAsia="Calibri" w:hAnsi="Times New Roman"/>
+                <w:sz w:val="26"/>
+                <w:szCs w:val="26"/>
+              </w:rPr>
+            </w:pPr>
+          </w:p>
+          <w:p>
+            <w:pPr>
+              <w:spacing w:line="264" w:lineRule="auto"/>
+              <w:ind w:firstLine="567"/>
+              <w:jc w:val="both"/>
+              <w:rPr>
+                <w:rFonts w:ascii="Times New Roman" w:eastAsia="Calibri" w:hAnsi="Times New Roman"/>
+                <w:sz w:val="26"/>
+                <w:szCs w:val="26"/>
+              </w:rPr>
+            </w:pPr>
+          </w:p>
         </w:tc>
         <w:tc>
           <w:tcPr>
@@ -9084,6 +8769,7 @@
           <w:sz w:val="26"/>
           <w:szCs w:val="27"/>
         </w:rPr>
+        <w:lastRenderedPageBreak/>
         <w:t>B. PHẦN THẨM ĐỊNH VÀ ĐỀ XUẤT CHO VAY CỦA NGƯỜI THẨM ĐỊNH</w:t>
       </w:r>
     </w:p>
@@ -9729,7 +9415,6 @@
           <w:szCs w:val="28"/>
           <w:lang w:val="de-DE"/>
         </w:rPr>
-        <w:lastRenderedPageBreak/>
         <w:t>3.2. Phương án sử dụng vốn:</w:t>
       </w:r>
     </w:p>
@@ -9759,19 +9444,46 @@
         <w:t>- Chi phí dự kiến của phương án trong kỳ như sau:</w:t>
       </w:r>
     </w:p>
+    <w:p>
+      <w:pPr>
+        <w:tabs>
+          <w:tab w:val="left" w:pos="180"/>
+          <w:tab w:val="center" w:pos="4678"/>
+        </w:tabs>
+        <w:spacing w:after="0" w:line="276" w:lineRule="auto"/>
+        <w:ind w:firstLine="567"/>
+        <w:jc w:val="right"/>
+        <w:rPr>
+          <w:rFonts w:ascii="Times New Roman" w:eastAsia="Times New Roman" w:hAnsi="Times New Roman" w:cs="Times New Roman"/>
+          <w:sz w:val="26"/>
+          <w:szCs w:val="26"/>
+          <w:lang w:val="pt-BR"/>
+        </w:rPr>
+      </w:pPr>
+      <w:r>
+        <w:rPr>
+          <w:rFonts w:ascii="Times New Roman" w:eastAsia="Times New Roman" w:hAnsi="Times New Roman" w:cs="Times New Roman"/>
+          <w:sz w:val="26"/>
+          <w:szCs w:val="26"/>
+          <w:lang w:val="pt-BR"/>
+        </w:rPr>
+        <w:t>Đơn vị: đồng</w:t>
+      </w:r>
+    </w:p>
     <w:tbl>
       <w:tblPr>
-        <w:tblW w:w="4887" w:type="pct"/>
+        <w:tblW w:w="0" w:type="auto"/>
         <w:jc w:val="center"/>
+        <w:tblLayout w:type="fixed"/>
         <w:tblLook w:val="04A0" w:firstRow="1" w:lastRow="0" w:firstColumn="1" w:lastColumn="0" w:noHBand="0" w:noVBand="1"/>
       </w:tblPr>
       <w:tblGrid>
-        <w:gridCol w:w="1723"/>
-        <w:gridCol w:w="1415"/>
-        <w:gridCol w:w="870"/>
-        <w:gridCol w:w="1150"/>
-        <w:gridCol w:w="1478"/>
-        <w:gridCol w:w="2994"/>
+        <w:gridCol w:w="817"/>
+        <w:gridCol w:w="2489"/>
+        <w:gridCol w:w="913"/>
+        <w:gridCol w:w="1701"/>
+        <w:gridCol w:w="1985"/>
+        <w:gridCol w:w="1948"/>
       </w:tblGrid>
       <w:tr>
         <w:trPr>
@@ -9780,7 +9492,7 @@
         </w:trPr>
         <w:tc>
           <w:tcPr>
-            <w:tcW w:w="895" w:type="pct"/>
+            <w:tcW w:w="817" w:type="dxa"/>
             <w:vMerge w:val="restart"/>
             <w:tcBorders>
               <w:top w:val="single" w:sz="4" w:space="0" w:color="auto"/>
@@ -9818,7 +9530,7 @@
         </w:tc>
         <w:tc>
           <w:tcPr>
-            <w:tcW w:w="852" w:type="pct"/>
+            <w:tcW w:w="2489" w:type="dxa"/>
             <w:vMerge w:val="restart"/>
             <w:tcBorders>
               <w:top w:val="single" w:sz="4" w:space="0" w:color="auto"/>
@@ -9856,7 +9568,7 @@
         </w:tc>
         <w:tc>
           <w:tcPr>
-            <w:tcW w:w="452" w:type="pct"/>
+            <w:tcW w:w="913" w:type="dxa"/>
             <w:vMerge w:val="restart"/>
             <w:tcBorders>
               <w:top w:val="single" w:sz="4" w:space="0" w:color="auto"/>
@@ -9894,7 +9606,7 @@
         </w:tc>
         <w:tc>
           <w:tcPr>
-            <w:tcW w:w="597" w:type="pct"/>
+            <w:tcW w:w="1701" w:type="dxa"/>
             <w:vMerge w:val="restart"/>
             <w:tcBorders>
               <w:top w:val="single" w:sz="4" w:space="0" w:color="auto"/>
@@ -9932,7 +9644,7 @@
         </w:tc>
         <w:tc>
           <w:tcPr>
-            <w:tcW w:w="2205" w:type="pct"/>
+            <w:tcW w:w="3933" w:type="dxa"/>
             <w:gridSpan w:val="2"/>
             <w:vMerge w:val="restart"/>
             <w:tcBorders>
@@ -9977,7 +9689,7 @@
         </w:trPr>
         <w:tc>
           <w:tcPr>
-            <w:tcW w:w="895" w:type="pct"/>
+            <w:tcW w:w="817" w:type="dxa"/>
             <w:vMerge/>
             <w:tcBorders>
               <w:top w:val="single" w:sz="4" w:space="0" w:color="auto"/>
@@ -10004,7 +9716,7 @@
         </w:tc>
         <w:tc>
           <w:tcPr>
-            <w:tcW w:w="852" w:type="pct"/>
+            <w:tcW w:w="2489" w:type="dxa"/>
             <w:vMerge/>
             <w:tcBorders>
               <w:top w:val="single" w:sz="4" w:space="0" w:color="auto"/>
@@ -10030,7 +9742,7 @@
         </w:tc>
         <w:tc>
           <w:tcPr>
-            <w:tcW w:w="452" w:type="pct"/>
+            <w:tcW w:w="913" w:type="dxa"/>
             <w:vMerge/>
             <w:tcBorders>
               <w:top w:val="single" w:sz="4" w:space="0" w:color="auto"/>
@@ -10057,7 +9769,7 @@
         </w:tc>
         <w:tc>
           <w:tcPr>
-            <w:tcW w:w="597" w:type="pct"/>
+            <w:tcW w:w="1701" w:type="dxa"/>
             <w:vMerge/>
             <w:tcBorders>
               <w:top w:val="single" w:sz="4" w:space="0" w:color="auto"/>
@@ -10084,7 +9796,7 @@
         </w:tc>
         <w:tc>
           <w:tcPr>
-            <w:tcW w:w="2205" w:type="pct"/>
+            <w:tcW w:w="3933" w:type="dxa"/>
             <w:gridSpan w:val="2"/>
             <w:vMerge/>
             <w:tcBorders>
@@ -10118,7 +9830,7 @@
         </w:trPr>
         <w:tc>
           <w:tcPr>
-            <w:tcW w:w="895" w:type="pct"/>
+            <w:tcW w:w="817" w:type="dxa"/>
             <w:vMerge/>
             <w:tcBorders>
               <w:top w:val="single" w:sz="4" w:space="0" w:color="auto"/>
@@ -10145,7 +9857,7 @@
         </w:tc>
         <w:tc>
           <w:tcPr>
-            <w:tcW w:w="852" w:type="pct"/>
+            <w:tcW w:w="2489" w:type="dxa"/>
             <w:vMerge/>
             <w:tcBorders>
               <w:top w:val="single" w:sz="4" w:space="0" w:color="auto"/>
@@ -10171,7 +9883,7 @@
         </w:tc>
         <w:tc>
           <w:tcPr>
-            <w:tcW w:w="452" w:type="pct"/>
+            <w:tcW w:w="913" w:type="dxa"/>
             <w:vMerge/>
             <w:tcBorders>
               <w:top w:val="single" w:sz="4" w:space="0" w:color="auto"/>
@@ -10198,7 +9910,7 @@
         </w:tc>
         <w:tc>
           <w:tcPr>
-            <w:tcW w:w="597" w:type="pct"/>
+            <w:tcW w:w="1701" w:type="dxa"/>
             <w:vMerge/>
             <w:tcBorders>
               <w:top w:val="single" w:sz="4" w:space="0" w:color="auto"/>
@@ -10225,7 +9937,7 @@
         </w:tc>
         <w:tc>
           <w:tcPr>
-            <w:tcW w:w="884" w:type="pct"/>
+            <w:tcW w:w="1985" w:type="dxa"/>
             <w:tcBorders>
               <w:top w:val="nil"/>
               <w:left w:val="nil"/>
@@ -10263,7 +9975,7 @@
         </w:tc>
         <w:tc>
           <w:tcPr>
-            <w:tcW w:w="1321" w:type="pct"/>
+            <w:tcW w:w="1948" w:type="dxa"/>
             <w:tcBorders>
               <w:top w:val="nil"/>
               <w:left w:val="nil"/>
@@ -10307,7 +10019,7 @@
         </w:trPr>
         <w:tc>
           <w:tcPr>
-            <w:tcW w:w="895" w:type="pct"/>
+            <w:tcW w:w="817" w:type="dxa"/>
             <w:tcBorders>
               <w:top w:val="nil"/>
               <w:left w:val="single" w:sz="4" w:space="0" w:color="auto"/>
@@ -10340,7 +10052,7 @@
         </w:tc>
         <w:tc>
           <w:tcPr>
-            <w:tcW w:w="852" w:type="pct"/>
+            <w:tcW w:w="2489" w:type="dxa"/>
             <w:tcBorders>
               <w:top w:val="nil"/>
               <w:left w:val="nil"/>
@@ -10364,7 +10076,7 @@
         </w:tc>
         <w:tc>
           <w:tcPr>
-            <w:tcW w:w="452" w:type="pct"/>
+            <w:tcW w:w="913" w:type="dxa"/>
             <w:tcBorders>
               <w:top w:val="nil"/>
               <w:left w:val="nil"/>
@@ -10391,7 +10103,7 @@
         </w:tc>
         <w:tc>
           <w:tcPr>
-            <w:tcW w:w="597" w:type="pct"/>
+            <w:tcW w:w="1701" w:type="dxa"/>
             <w:tcBorders>
               <w:top w:val="nil"/>
               <w:left w:val="nil"/>
@@ -10415,7 +10127,7 @@
         </w:tc>
         <w:tc>
           <w:tcPr>
-            <w:tcW w:w="884" w:type="pct"/>
+            <w:tcW w:w="1985" w:type="dxa"/>
             <w:tcBorders>
               <w:top w:val="nil"/>
               <w:left w:val="nil"/>
@@ -10440,7 +10152,7 @@
         </w:tc>
         <w:tc>
           <w:tcPr>
-            <w:tcW w:w="1321" w:type="pct"/>
+            <w:tcW w:w="1948" w:type="dxa"/>
             <w:tcBorders>
               <w:top w:val="nil"/>
               <w:left w:val="nil"/>
@@ -10471,7 +10183,7 @@
         </w:trPr>
         <w:tc>
           <w:tcPr>
-            <w:tcW w:w="895" w:type="pct"/>
+            <w:tcW w:w="817" w:type="dxa"/>
             <w:tcBorders>
               <w:top w:val="nil"/>
               <w:left w:val="single" w:sz="4" w:space="0" w:color="auto"/>
@@ -10504,7 +10216,7 @@
         </w:tc>
         <w:tc>
           <w:tcPr>
-            <w:tcW w:w="852" w:type="pct"/>
+            <w:tcW w:w="2489" w:type="dxa"/>
             <w:tcBorders>
               <w:top w:val="nil"/>
               <w:left w:val="nil"/>
@@ -10537,7 +10249,7 @@
         </w:tc>
         <w:tc>
           <w:tcPr>
-            <w:tcW w:w="452" w:type="pct"/>
+            <w:tcW w:w="913" w:type="dxa"/>
             <w:tcBorders>
               <w:top w:val="nil"/>
               <w:left w:val="nil"/>
@@ -10571,7 +10283,7 @@
         </w:tc>
         <w:tc>
           <w:tcPr>
-            <w:tcW w:w="597" w:type="pct"/>
+            <w:tcW w:w="1701" w:type="dxa"/>
             <w:tcBorders>
               <w:top w:val="nil"/>
               <w:left w:val="nil"/>
@@ -10604,7 +10316,7 @@
         </w:tc>
         <w:tc>
           <w:tcPr>
-            <w:tcW w:w="884" w:type="pct"/>
+            <w:tcW w:w="1985" w:type="dxa"/>
             <w:tcBorders>
               <w:top w:val="nil"/>
               <w:left w:val="nil"/>
@@ -10619,6 +10331,7 @@
           <w:p>
             <w:pPr>
               <w:spacing w:after="0" w:line="240" w:lineRule="auto"/>
+              <w:jc w:val="right"/>
               <w:rPr>
                 <w:rFonts w:ascii="Times New Roman" w:eastAsia="Times New Roman" w:hAnsi="Times New Roman" w:cs="Times New Roman"/>
                 <w:sz w:val="24"/>
@@ -10637,7 +10350,7 @@
         </w:tc>
         <w:tc>
           <w:tcPr>
-            <w:tcW w:w="1321" w:type="pct"/>
+            <w:tcW w:w="1948" w:type="dxa"/>
             <w:tcBorders>
               <w:top w:val="nil"/>
               <w:left w:val="nil"/>
@@ -10677,7 +10390,7 @@
         </w:trPr>
         <w:tc>
           <w:tcPr>
-            <w:tcW w:w="895" w:type="pct"/>
+            <w:tcW w:w="817" w:type="dxa"/>
             <w:tcBorders>
               <w:top w:val="single" w:sz="4" w:space="0" w:color="auto"/>
               <w:left w:val="single" w:sz="4" w:space="0" w:color="auto"/>
@@ -10711,7 +10424,7 @@
         </w:tc>
         <w:tc>
           <w:tcPr>
-            <w:tcW w:w="852" w:type="pct"/>
+            <w:tcW w:w="2489" w:type="dxa"/>
             <w:tcBorders>
               <w:top w:val="single" w:sz="4" w:space="0" w:color="auto"/>
               <w:left w:val="nil"/>
@@ -10735,7 +10448,7 @@
         </w:tc>
         <w:tc>
           <w:tcPr>
-            <w:tcW w:w="452" w:type="pct"/>
+            <w:tcW w:w="913" w:type="dxa"/>
             <w:tcBorders>
               <w:top w:val="single" w:sz="4" w:space="0" w:color="auto"/>
               <w:left w:val="nil"/>
@@ -10762,7 +10475,7 @@
         </w:tc>
         <w:tc>
           <w:tcPr>
-            <w:tcW w:w="597" w:type="pct"/>
+            <w:tcW w:w="1701" w:type="dxa"/>
             <w:tcBorders>
               <w:top w:val="single" w:sz="4" w:space="0" w:color="auto"/>
               <w:left w:val="nil"/>
@@ -10786,7 +10499,7 @@
         </w:tc>
         <w:tc>
           <w:tcPr>
-            <w:tcW w:w="884" w:type="pct"/>
+            <w:tcW w:w="1985" w:type="dxa"/>
             <w:tcBorders>
               <w:top w:val="single" w:sz="4" w:space="0" w:color="auto"/>
               <w:left w:val="nil"/>
@@ -10811,7 +10524,7 @@
         </w:tc>
         <w:tc>
           <w:tcPr>
-            <w:tcW w:w="1321" w:type="pct"/>
+            <w:tcW w:w="1948" w:type="dxa"/>
             <w:tcBorders>
               <w:top w:val="single" w:sz="4" w:space="0" w:color="auto"/>
               <w:left w:val="nil"/>
@@ -10842,7 +10555,7 @@
         </w:trPr>
         <w:tc>
           <w:tcPr>
-            <w:tcW w:w="895" w:type="pct"/>
+            <w:tcW w:w="817" w:type="dxa"/>
             <w:tcBorders>
               <w:top w:val="single" w:sz="4" w:space="0" w:color="auto"/>
               <w:left w:val="single" w:sz="4" w:space="0" w:color="auto"/>
@@ -10869,7 +10582,7 @@
         </w:tc>
         <w:tc>
           <w:tcPr>
-            <w:tcW w:w="852" w:type="pct"/>
+            <w:tcW w:w="2489" w:type="dxa"/>
             <w:tcBorders>
               <w:top w:val="single" w:sz="4" w:space="0" w:color="auto"/>
               <w:left w:val="nil"/>
@@ -10905,7 +10618,7 @@
         </w:tc>
         <w:tc>
           <w:tcPr>
-            <w:tcW w:w="452" w:type="pct"/>
+            <w:tcW w:w="913" w:type="dxa"/>
             <w:tcBorders>
               <w:top w:val="single" w:sz="4" w:space="0" w:color="auto"/>
               <w:left w:val="nil"/>
@@ -10934,7 +10647,7 @@
         </w:tc>
         <w:tc>
           <w:tcPr>
-            <w:tcW w:w="597" w:type="pct"/>
+            <w:tcW w:w="1701" w:type="dxa"/>
             <w:tcBorders>
               <w:top w:val="single" w:sz="4" w:space="0" w:color="auto"/>
               <w:left w:val="nil"/>
@@ -10960,7 +10673,7 @@
         </w:tc>
         <w:tc>
           <w:tcPr>
-            <w:tcW w:w="884" w:type="pct"/>
+            <w:tcW w:w="1985" w:type="dxa"/>
             <w:tcBorders>
               <w:top w:val="single" w:sz="4" w:space="0" w:color="auto"/>
               <w:left w:val="nil"/>
@@ -10987,7 +10700,7 @@
         </w:tc>
         <w:tc>
           <w:tcPr>
-            <w:tcW w:w="1321" w:type="pct"/>
+            <w:tcW w:w="1948" w:type="dxa"/>
             <w:tcBorders>
               <w:top w:val="single" w:sz="4" w:space="0" w:color="auto"/>
               <w:left w:val="nil"/>
@@ -11491,46 +11204,16 @@
           <w:szCs w:val="26"/>
           <w:lang w:val="pt-BR"/>
         </w:rPr>
-        <w:t xml:space="preserve">[Tên chi nhánh/PGD] số tiền: </w:t>
-      </w:r>
-      <w:r>
-        <w:rPr>
-          <w:rFonts w:ascii="Times New Roman" w:eastAsia="Times New Roman" w:hAnsi="Times New Roman" w:cs="Times New Roman"/>
-          <w:b/>
-          <w:sz w:val="26"/>
-          <w:szCs w:val="26"/>
-          <w:lang w:val="pt-BR"/>
-        </w:rPr>
-        <w:t>[</w:t>
-      </w:r>
-      <w:r>
-        <w:rPr>
-          <w:rFonts w:ascii="Times New Roman" w:eastAsia="Times New Roman" w:hAnsi="Times New Roman" w:cs="Times New Roman"/>
-          <w:b/>
-          <w:sz w:val="26"/>
-          <w:szCs w:val="26"/>
-          <w:lang w:val="pt-BR"/>
-        </w:rPr>
-        <w:t>PA</w:t>
-      </w:r>
-      <w:r>
-        <w:rPr>
-          <w:rFonts w:ascii="Times New Roman" w:eastAsia="Times New Roman" w:hAnsi="Times New Roman" w:cs="Times New Roman"/>
-          <w:b/>
-          <w:sz w:val="26"/>
-          <w:szCs w:val="26"/>
-          <w:lang w:val="pt-BR"/>
-        </w:rPr>
-        <w:t>.Số tiền vay]</w:t>
-      </w:r>
-      <w:r>
-        <w:rPr>
-          <w:rFonts w:ascii="Times New Roman" w:eastAsia="Times New Roman" w:hAnsi="Times New Roman" w:cs="Times New Roman"/>
-          <w:sz w:val="26"/>
-          <w:szCs w:val="26"/>
-          <w:lang w:val="pt-BR"/>
-        </w:rPr>
-        <w:t xml:space="preserve"> đồng (Bằng chữ: [</w:t>
+        <w:t>[Tên chi nhánh/PGD] số tiền: [PA.Số tiền vay] đồng (Bằng chữ:</w:t>
+      </w:r>
+      <w:r>
+        <w:rPr>
+          <w:rFonts w:ascii="Times New Roman" w:eastAsia="Times New Roman" w:hAnsi="Times New Roman" w:cs="Times New Roman"/>
+          <w:sz w:val="26"/>
+          <w:szCs w:val="26"/>
+          <w:lang w:val="pt-BR"/>
+        </w:rPr>
+        <w:t xml:space="preserve"> [</w:t>
       </w:r>
       <w:r>
         <w:rPr>
@@ -11703,6 +11386,7 @@
           <w:szCs w:val="28"/>
           <w:lang w:val="de-DE"/>
         </w:rPr>
+        <w:lastRenderedPageBreak/>
         <w:t>3.3.</w:t>
       </w:r>
       <w:r>
@@ -11788,7 +11472,25 @@
           <w:szCs w:val="28"/>
           <w:lang w:val="de-DE"/>
         </w:rPr>
-        <w:t xml:space="preserve"> và có nhu cầu vay vốn để trồng hoa Cát tường trên </w:t>
+        <w:t xml:space="preserve"> và có nhu cầu vay vốn để trồng hoa </w:t>
+      </w:r>
+      <w:r>
+        <w:rPr>
+          <w:rFonts w:ascii="Times New Roman" w:eastAsia="Times New Roman" w:hAnsi="Times New Roman" w:cs="Times New Roman"/>
+          <w:sz w:val="26"/>
+          <w:szCs w:val="28"/>
+          <w:lang w:val="de-DE"/>
+        </w:rPr>
+        <w:t>[PA.Loại hoa]</w:t>
+      </w:r>
+      <w:r>
+        <w:rPr>
+          <w:rFonts w:ascii="Times New Roman" w:eastAsia="Times New Roman" w:hAnsi="Times New Roman" w:cs="Times New Roman"/>
+          <w:sz w:val="26"/>
+          <w:szCs w:val="28"/>
+          <w:lang w:val="de-DE"/>
+        </w:rPr>
+        <w:t xml:space="preserve"> trên </w:t>
       </w:r>
       <w:r>
         <w:rPr>
@@ -11979,7 +11681,6 @@
           <w:szCs w:val="28"/>
           <w:lang w:val="de-DE"/>
         </w:rPr>
-        <w:lastRenderedPageBreak/>
         <w:t xml:space="preserve">- Các yếu tố khác để thực hiện phương án: Khách hàng có kinh nghiệm nhiều năm trong lĩnh vực trồng hoa </w:t>
       </w:r>
       <w:r>
@@ -11989,7 +11690,7 @@
           <w:szCs w:val="28"/>
           <w:lang w:val="de-DE"/>
         </w:rPr>
-        <w:t>C</w:t>
+        <w:t>[PA.Loại hoa]</w:t>
       </w:r>
       <w:r>
         <w:rPr>
@@ -11998,7 +11699,7 @@
           <w:szCs w:val="28"/>
           <w:lang w:val="de-DE"/>
         </w:rPr>
-        <w:t>át tường và là người trực tiếp điều hành hoạt động sản xuất đảm bảo thực hiện thành công phương án.</w:t>
+        <w:t xml:space="preserve"> và là người trực tiếp điều hành hoạt động sản xuất đảm bảo thực hiện thành công phương án.</w:t>
       </w:r>
     </w:p>
     <w:p>
@@ -12151,8 +11852,8 @@
       <w:tblGrid>
         <w:gridCol w:w="818"/>
         <w:gridCol w:w="2611"/>
-        <w:gridCol w:w="1163"/>
-        <w:gridCol w:w="1470"/>
+        <w:gridCol w:w="932"/>
+        <w:gridCol w:w="1701"/>
         <w:gridCol w:w="1844"/>
         <w:gridCol w:w="1947"/>
       </w:tblGrid>
@@ -12236,7 +11937,7 @@
         </w:tc>
         <w:tc>
           <w:tcPr>
-            <w:tcW w:w="590" w:type="pct"/>
+            <w:tcW w:w="473" w:type="pct"/>
             <w:tcBorders>
               <w:top w:val="single" w:sz="4" w:space="0" w:color="auto"/>
               <w:left w:val="nil"/>
@@ -12273,7 +11974,7 @@
         </w:tc>
         <w:tc>
           <w:tcPr>
-            <w:tcW w:w="746" w:type="pct"/>
+            <w:tcW w:w="863" w:type="pct"/>
             <w:tcBorders>
               <w:top w:val="single" w:sz="4" w:space="0" w:color="auto"/>
               <w:left w:val="nil"/>
@@ -12347,7 +12048,7 @@
         </w:tc>
         <w:tc>
           <w:tcPr>
-            <w:tcW w:w="989" w:type="pct"/>
+            <w:tcW w:w="988" w:type="pct"/>
             <w:tcBorders>
               <w:top w:val="single" w:sz="4" w:space="0" w:color="auto"/>
               <w:left w:val="nil"/>
@@ -12462,7 +12163,7 @@
         </w:tc>
         <w:tc>
           <w:tcPr>
-            <w:tcW w:w="590" w:type="pct"/>
+            <w:tcW w:w="473" w:type="pct"/>
             <w:tcBorders>
               <w:top w:val="nil"/>
               <w:left w:val="nil"/>
@@ -12489,7 +12190,7 @@
         </w:tc>
         <w:tc>
           <w:tcPr>
-            <w:tcW w:w="746" w:type="pct"/>
+            <w:tcW w:w="863" w:type="pct"/>
             <w:tcBorders>
               <w:top w:val="nil"/>
               <w:left w:val="nil"/>
@@ -12563,7 +12264,7 @@
         </w:tc>
         <w:tc>
           <w:tcPr>
-            <w:tcW w:w="989" w:type="pct"/>
+            <w:tcW w:w="988" w:type="pct"/>
             <w:tcBorders>
               <w:top w:val="nil"/>
               <w:left w:val="nil"/>
@@ -12670,7 +12371,7 @@
         </w:tc>
         <w:tc>
           <w:tcPr>
-            <w:tcW w:w="590" w:type="pct"/>
+            <w:tcW w:w="473" w:type="pct"/>
             <w:tcBorders>
               <w:top w:val="nil"/>
               <w:left w:val="nil"/>
@@ -12695,7 +12396,7 @@
         </w:tc>
         <w:tc>
           <w:tcPr>
-            <w:tcW w:w="746" w:type="pct"/>
+            <w:tcW w:w="863" w:type="pct"/>
             <w:tcBorders>
               <w:top w:val="nil"/>
               <w:left w:val="nil"/>
@@ -12761,7 +12462,7 @@
         </w:tc>
         <w:tc>
           <w:tcPr>
-            <w:tcW w:w="989" w:type="pct"/>
+            <w:tcW w:w="988" w:type="pct"/>
             <w:tcBorders>
               <w:top w:val="nil"/>
               <w:left w:val="nil"/>
@@ -12864,7 +12565,7 @@
         </w:tc>
         <w:tc>
           <w:tcPr>
-            <w:tcW w:w="590" w:type="pct"/>
+            <w:tcW w:w="473" w:type="pct"/>
             <w:tcBorders>
               <w:top w:val="nil"/>
               <w:left w:val="nil"/>
@@ -12889,7 +12590,7 @@
         </w:tc>
         <w:tc>
           <w:tcPr>
-            <w:tcW w:w="746" w:type="pct"/>
+            <w:tcW w:w="863" w:type="pct"/>
             <w:tcBorders>
               <w:top w:val="nil"/>
               <w:left w:val="nil"/>
@@ -12955,7 +12656,7 @@
         </w:tc>
         <w:tc>
           <w:tcPr>
-            <w:tcW w:w="989" w:type="pct"/>
+            <w:tcW w:w="988" w:type="pct"/>
             <w:tcBorders>
               <w:top w:val="nil"/>
               <w:left w:val="nil"/>
@@ -13050,7 +12751,7 @@
         </w:tc>
         <w:tc>
           <w:tcPr>
-            <w:tcW w:w="590" w:type="pct"/>
+            <w:tcW w:w="473" w:type="pct"/>
             <w:tcBorders>
               <w:top w:val="nil"/>
               <w:left w:val="nil"/>
@@ -13077,13 +12778,21 @@
                 <w:sz w:val="24"/>
                 <w:szCs w:val="24"/>
               </w:rPr>
-              <w:t>đ</w:t>
+              <w:t>Đ</w:t>
             </w:r>
-          </w:p>
-        </w:tc>
-        <w:tc>
-          <w:tcPr>
-            <w:tcW w:w="746" w:type="pct"/>
+            <w:r>
+              <w:rPr>
+                <w:rFonts w:ascii="Times New Roman" w:eastAsia="Times New Roman" w:hAnsi="Times New Roman" w:cs="Times New Roman"/>
+                <w:sz w:val="24"/>
+                <w:szCs w:val="24"/>
+              </w:rPr>
+              <w:t>ồng</w:t>
+            </w:r>
+          </w:p>
+        </w:tc>
+        <w:tc>
+          <w:tcPr>
+            <w:tcW w:w="863" w:type="pct"/>
             <w:tcBorders>
               <w:top w:val="nil"/>
               <w:left w:val="nil"/>
@@ -13149,7 +12858,7 @@
         </w:tc>
         <w:tc>
           <w:tcPr>
-            <w:tcW w:w="989" w:type="pct"/>
+            <w:tcW w:w="988" w:type="pct"/>
             <w:tcBorders>
               <w:top w:val="nil"/>
               <w:left w:val="nil"/>
@@ -13260,7 +12969,7 @@
         </w:tc>
         <w:tc>
           <w:tcPr>
-            <w:tcW w:w="590" w:type="pct"/>
+            <w:tcW w:w="473" w:type="pct"/>
             <w:tcBorders>
               <w:top w:val="nil"/>
               <w:left w:val="nil"/>
@@ -13287,7 +12996,7 @@
         </w:tc>
         <w:tc>
           <w:tcPr>
-            <w:tcW w:w="746" w:type="pct"/>
+            <w:tcW w:w="863" w:type="pct"/>
             <w:tcBorders>
               <w:top w:val="nil"/>
               <w:left w:val="nil"/>
@@ -13361,7 +13070,7 @@
         </w:tc>
         <w:tc>
           <w:tcPr>
-            <w:tcW w:w="989" w:type="pct"/>
+            <w:tcW w:w="988" w:type="pct"/>
             <w:tcBorders>
               <w:top w:val="nil"/>
               <w:left w:val="nil"/>
@@ -13468,7 +13177,7 @@
         </w:tc>
         <w:tc>
           <w:tcPr>
-            <w:tcW w:w="590" w:type="pct"/>
+            <w:tcW w:w="473" w:type="pct"/>
             <w:tcBorders>
               <w:top w:val="nil"/>
               <w:left w:val="nil"/>
@@ -13493,7 +13202,7 @@
         </w:tc>
         <w:tc>
           <w:tcPr>
-            <w:tcW w:w="746" w:type="pct"/>
+            <w:tcW w:w="863" w:type="pct"/>
             <w:tcBorders>
               <w:top w:val="nil"/>
               <w:left w:val="nil"/>
@@ -13559,7 +13268,7 @@
         </w:tc>
         <w:tc>
           <w:tcPr>
-            <w:tcW w:w="989" w:type="pct"/>
+            <w:tcW w:w="988" w:type="pct"/>
             <w:tcBorders>
               <w:top w:val="nil"/>
               <w:left w:val="nil"/>
@@ -13662,7 +13371,7 @@
         </w:tc>
         <w:tc>
           <w:tcPr>
-            <w:tcW w:w="590" w:type="pct"/>
+            <w:tcW w:w="473" w:type="pct"/>
             <w:tcBorders>
               <w:top w:val="nil"/>
               <w:left w:val="nil"/>
@@ -13695,7 +13404,7 @@
         </w:tc>
         <w:tc>
           <w:tcPr>
-            <w:tcW w:w="746" w:type="pct"/>
+            <w:tcW w:w="863" w:type="pct"/>
             <w:tcBorders>
               <w:top w:val="nil"/>
               <w:left w:val="nil"/>
@@ -13761,7 +13470,7 @@
         </w:tc>
         <w:tc>
           <w:tcPr>
-            <w:tcW w:w="989" w:type="pct"/>
+            <w:tcW w:w="988" w:type="pct"/>
             <w:tcBorders>
               <w:top w:val="nil"/>
               <w:left w:val="nil"/>
@@ -13864,7 +13573,7 @@
         </w:tc>
         <w:tc>
           <w:tcPr>
-            <w:tcW w:w="590" w:type="pct"/>
+            <w:tcW w:w="473" w:type="pct"/>
             <w:tcBorders>
               <w:top w:val="nil"/>
               <w:left w:val="nil"/>
@@ -13889,7 +13598,7 @@
         </w:tc>
         <w:tc>
           <w:tcPr>
-            <w:tcW w:w="746" w:type="pct"/>
+            <w:tcW w:w="863" w:type="pct"/>
             <w:tcBorders>
               <w:top w:val="nil"/>
               <w:left w:val="nil"/>
@@ -13955,7 +13664,7 @@
         </w:tc>
         <w:tc>
           <w:tcPr>
-            <w:tcW w:w="989" w:type="pct"/>
+            <w:tcW w:w="988" w:type="pct"/>
             <w:tcBorders>
               <w:top w:val="nil"/>
               <w:left w:val="nil"/>
@@ -14066,7 +13775,7 @@
         </w:tc>
         <w:tc>
           <w:tcPr>
-            <w:tcW w:w="590" w:type="pct"/>
+            <w:tcW w:w="473" w:type="pct"/>
             <w:tcBorders>
               <w:top w:val="nil"/>
               <w:left w:val="nil"/>
@@ -14093,7 +13802,7 @@
         </w:tc>
         <w:tc>
           <w:tcPr>
-            <w:tcW w:w="746" w:type="pct"/>
+            <w:tcW w:w="863" w:type="pct"/>
             <w:tcBorders>
               <w:top w:val="nil"/>
               <w:left w:val="nil"/>
@@ -14167,7 +13876,7 @@
         </w:tc>
         <w:tc>
           <w:tcPr>
-            <w:tcW w:w="989" w:type="pct"/>
+            <w:tcW w:w="988" w:type="pct"/>
             <w:tcBorders>
               <w:top w:val="nil"/>
               <w:left w:val="nil"/>
@@ -14225,6 +13934,7 @@
           <w:szCs w:val="28"/>
           <w:lang w:val="de-DE"/>
         </w:rPr>
+        <w:lastRenderedPageBreak/>
         <w:t>4.2</w:t>
       </w:r>
       <w:r>
@@ -14253,119 +13963,68 @@
         <w:ind w:firstLine="567"/>
         <w:jc w:val="both"/>
         <w:rPr>
-          <w:rFonts w:ascii="Times New Roman" w:eastAsia="Calibri" w:hAnsi="Times New Roman" w:cs="Times New Roman"/>
-          <w:sz w:val="26"/>
-          <w:szCs w:val="28"/>
-          <w:lang w:val="de-DE"/>
-        </w:rPr>
-      </w:pPr>
-      <w:r>
-        <w:rPr>
-          <w:rFonts w:ascii="Times New Roman" w:eastAsia="Times New Roman" w:hAnsi="Times New Roman" w:cs="Times New Roman"/>
-          <w:sz w:val="26"/>
-          <w:szCs w:val="28"/>
-          <w:lang w:val="de-DE"/>
-        </w:rPr>
-        <w:t xml:space="preserve">- Dư nợ của khách hàng tại Agribank: </w:t>
-      </w:r>
-      <w:r>
-        <w:rPr>
-          <w:rFonts w:ascii="Times New Roman" w:eastAsia="Calibri" w:hAnsi="Times New Roman" w:cs="Times New Roman"/>
-          <w:sz w:val="26"/>
-          <w:szCs w:val="28"/>
-          <w:lang w:val="de-DE"/>
-        </w:rPr>
-        <w:t xml:space="preserve">Khách hàng hiện có tổng dư nợ </w:t>
-      </w:r>
-      <w:r>
-        <w:rPr>
-          <w:rFonts w:ascii="Times New Roman" w:eastAsia="Times New Roman" w:hAnsi="Times New Roman" w:cs="Times New Roman"/>
-          <w:sz w:val="26"/>
-          <w:szCs w:val="28"/>
-          <w:lang w:val="de-DE"/>
-        </w:rPr>
-        <w:t>[</w:t>
-      </w:r>
-      <w:r>
-        <w:rPr>
-          <w:rFonts w:ascii="Times New Roman" w:eastAsia="Times New Roman" w:hAnsi="Times New Roman" w:cs="Times New Roman"/>
-          <w:sz w:val="26"/>
-          <w:szCs w:val="28"/>
-          <w:lang w:val="de-DE"/>
-        </w:rPr>
-        <w:t>VBA</w:t>
-      </w:r>
-      <w:r>
-        <w:rPr>
-          <w:rFonts w:ascii="Times New Roman" w:eastAsia="Times New Roman" w:hAnsi="Times New Roman" w:cs="Times New Roman"/>
-          <w:sz w:val="26"/>
-          <w:szCs w:val="28"/>
-          <w:lang w:val="de-DE"/>
-        </w:rPr>
-        <w:t>.</w:t>
-      </w:r>
-      <w:r>
-        <w:rPr>
-          <w:rFonts w:ascii="Times New Roman" w:eastAsia="Times New Roman" w:hAnsi="Times New Roman" w:cs="Times New Roman"/>
-          <w:sz w:val="26"/>
-          <w:szCs w:val="28"/>
-          <w:lang w:val="de-DE"/>
-        </w:rPr>
-        <w:t>Tổng dư nợ</w:t>
-      </w:r>
-      <w:r>
-        <w:rPr>
-          <w:rFonts w:ascii="Times New Roman" w:eastAsia="Times New Roman" w:hAnsi="Times New Roman" w:cs="Times New Roman"/>
-          <w:sz w:val="26"/>
-          <w:szCs w:val="28"/>
-          <w:lang w:val="de-DE"/>
-        </w:rPr>
-        <w:t>] đồng</w:t>
-      </w:r>
-      <w:r>
-        <w:rPr>
-          <w:rFonts w:ascii="Times New Roman" w:eastAsia="Times New Roman" w:hAnsi="Times New Roman" w:cs="Times New Roman"/>
-          <w:sz w:val="26"/>
-          <w:szCs w:val="28"/>
-          <w:lang w:val="de-DE"/>
-        </w:rPr>
-        <w:t xml:space="preserve"> tại Agribank [Tên chi nhánh/PGD]</w:t>
-      </w:r>
-      <w:r>
-        <w:rPr>
-          <w:rFonts w:ascii="Times New Roman" w:eastAsia="Times New Roman" w:hAnsi="Times New Roman" w:cs="Times New Roman"/>
-          <w:sz w:val="26"/>
-          <w:szCs w:val="28"/>
-          <w:lang w:val="de-DE"/>
-        </w:rPr>
-        <w:t>; Nhóm nợ</w:t>
-      </w:r>
-      <w:r>
-        <w:rPr>
-          <w:rFonts w:ascii="Times New Roman" w:eastAsia="Calibri" w:hAnsi="Times New Roman" w:cs="Times New Roman"/>
-          <w:sz w:val="26"/>
-          <w:szCs w:val="28"/>
-          <w:lang w:val="de-DE"/>
-        </w:rPr>
-        <w:t xml:space="preserve">: </w:t>
-      </w:r>
-      <w:r>
-        <w:rPr>
-          <w:rFonts w:ascii="Times New Roman" w:eastAsia="Calibri" w:hAnsi="Times New Roman" w:cs="Times New Roman"/>
-          <w:sz w:val="26"/>
-          <w:szCs w:val="28"/>
-          <w:lang w:val="de-DE"/>
-        </w:rPr>
-        <w:t>[HĐTD.Nhóm nợ]</w:t>
-      </w:r>
-      <w:r>
-        <w:rPr>
-          <w:rFonts w:ascii="Times New Roman" w:eastAsia="Calibri" w:hAnsi="Times New Roman" w:cs="Times New Roman"/>
-          <w:sz w:val="26"/>
-          <w:szCs w:val="28"/>
-          <w:lang w:val="de-DE"/>
-        </w:rPr>
-        <w:t xml:space="preserve">. Trong đó: </w:t>
+          <w:rFonts w:ascii="Times New Roman" w:eastAsia="Times New Roman" w:hAnsi="Times New Roman" w:cs="Times New Roman"/>
+          <w:sz w:val="26"/>
+          <w:szCs w:val="28"/>
+        </w:rPr>
+      </w:pPr>
+      <w:r>
+        <w:rPr>
+          <w:rFonts w:ascii="Times New Roman" w:eastAsia="Times New Roman" w:hAnsi="Times New Roman" w:cs="Times New Roman"/>
+          <w:sz w:val="26"/>
+          <w:szCs w:val="28"/>
+        </w:rPr>
+        <w:t>Dư nợ của khách hàng:</w:t>
+      </w:r>
+    </w:p>
+    <w:p>
+      <w:pPr>
+        <w:shd w:val="clear" w:color="auto" w:fill="FFFFFF"/>
+        <w:spacing w:after="0" w:line="276" w:lineRule="auto"/>
+        <w:ind w:firstLine="567"/>
+        <w:jc w:val="both"/>
+        <w:rPr>
+          <w:rFonts w:ascii="Times New Roman" w:eastAsia="Times New Roman" w:hAnsi="Times New Roman" w:cs="Times New Roman"/>
+          <w:sz w:val="26"/>
+          <w:szCs w:val="28"/>
+        </w:rPr>
+      </w:pPr>
+      <w:r>
+        <w:rPr>
+          <w:rFonts w:ascii="Times New Roman" w:eastAsia="Times New Roman" w:hAnsi="Times New Roman" w:cs="Times New Roman"/>
+          <w:sz w:val="26"/>
+          <w:szCs w:val="28"/>
+        </w:rPr>
+        <w:t>[#DUNỢ]</w:t>
+      </w:r>
+    </w:p>
+    <w:p>
+      <w:pPr>
+        <w:shd w:val="clear" w:color="auto" w:fill="FFFFFF"/>
+        <w:spacing w:after="0" w:line="276" w:lineRule="auto"/>
+        <w:ind w:firstLine="567"/>
+        <w:jc w:val="both"/>
+        <w:rPr>
+          <w:rFonts w:ascii="Times New Roman" w:eastAsia="Times New Roman" w:hAnsi="Times New Roman" w:cs="Times New Roman"/>
+          <w:sz w:val="26"/>
+          <w:szCs w:val="28"/>
+        </w:rPr>
+      </w:pPr>
+      <w:r>
+        <w:rPr>
+          <w:rFonts w:ascii="Times New Roman" w:eastAsia="Times New Roman" w:hAnsi="Times New Roman" w:cs="Times New Roman"/>
+          <w:sz w:val="26"/>
+          <w:szCs w:val="28"/>
+        </w:rPr>
+        <w:t>- Tại [Tên tổ chức]: Tổng dư nợ [Tổng dư nợ] đồng; Nhóm nợ: [Nhóm nợ]</w:t>
+      </w:r>
+      <w:r>
+        <w:rPr>
+          <w:rFonts w:ascii="Times New Roman" w:eastAsia="Times New Roman" w:hAnsi="Times New Roman" w:cs="Times New Roman"/>
+          <w:sz w:val="26"/>
+          <w:szCs w:val="28"/>
+        </w:rPr>
+        <w:t>. Trong đó:</w:t>
       </w:r>
     </w:p>
     <w:p>
@@ -14378,17 +14037,15 @@
           <w:rFonts w:ascii="Times New Roman" w:eastAsia="Times New Roman" w:hAnsi="Times New Roman" w:cs="Times New Roman"/>
           <w:sz w:val="26"/>
           <w:szCs w:val="28"/>
-          <w:lang w:val="de-DE"/>
-        </w:rPr>
-      </w:pPr>
-      <w:r>
-        <w:rPr>
-          <w:rFonts w:ascii="Times New Roman" w:eastAsia="Times New Roman" w:hAnsi="Times New Roman" w:cs="Times New Roman"/>
-          <w:sz w:val="26"/>
-          <w:szCs w:val="28"/>
-          <w:lang w:val="de-DE"/>
-        </w:rPr>
-        <w:t>+ Dư nợ ngắn hạn là [VBA.Dư nợ ngắn hạn] mục đích [VBA.Mục đích ngắn hạn], nguồn trả nợ từ [VBA.Nguồn trả nợ];</w:t>
+        </w:rPr>
+      </w:pPr>
+      <w:r>
+        <w:rPr>
+          <w:rFonts w:ascii="Times New Roman" w:eastAsia="Times New Roman" w:hAnsi="Times New Roman" w:cs="Times New Roman"/>
+          <w:sz w:val="26"/>
+          <w:szCs w:val="28"/>
+        </w:rPr>
+        <w:t>+ Ngắn hạn: [Dư nợ ngắn hạn], mục đích [Mục đích ngắn hạn]</w:t>
       </w:r>
     </w:p>
     <w:p>
@@ -14398,28 +14055,44 @@
         <w:ind w:firstLine="851"/>
         <w:jc w:val="both"/>
         <w:rPr>
-          <w:rFonts w:ascii="Times New Roman" w:eastAsia="Calibri" w:hAnsi="Times New Roman" w:cs="Times New Roman"/>
-          <w:sz w:val="26"/>
-          <w:szCs w:val="28"/>
-          <w:lang w:val="de-DE"/>
-        </w:rPr>
-      </w:pPr>
-      <w:r>
-        <w:rPr>
-          <w:rFonts w:ascii="Times New Roman" w:eastAsia="Times New Roman" w:hAnsi="Times New Roman" w:cs="Times New Roman"/>
-          <w:sz w:val="26"/>
-          <w:szCs w:val="28"/>
-          <w:lang w:val="de-DE"/>
-        </w:rPr>
-        <w:t>+ Dư nợ trung dài hạn là [VBA.Dư nợ trung dài hạn] mục đích [VBA.Mục đích trung dài hạn] nguồn trả nợ từ [VBA.Nguồn trả nợ];</w:t>
+          <w:rFonts w:ascii="Times New Roman" w:eastAsia="Times New Roman" w:hAnsi="Times New Roman" w:cs="Times New Roman"/>
+          <w:sz w:val="26"/>
+          <w:szCs w:val="28"/>
+        </w:rPr>
+      </w:pPr>
+      <w:r>
+        <w:rPr>
+          <w:rFonts w:ascii="Times New Roman" w:eastAsia="Times New Roman" w:hAnsi="Times New Roman" w:cs="Times New Roman"/>
+          <w:sz w:val="26"/>
+          <w:szCs w:val="28"/>
+        </w:rPr>
+        <w:t>+ Trung dài hạn: [Dư nợ trung dài hạn], mục đích [Mục đích trung dài hạn]</w:t>
       </w:r>
     </w:p>
     <w:p>
       <w:pPr>
         <w:shd w:val="clear" w:color="auto" w:fill="FFFFFF"/>
-        <w:tabs>
-          <w:tab w:val="left" w:leader="dot" w:pos="9356"/>
-        </w:tabs>
+        <w:spacing w:after="0" w:line="276" w:lineRule="auto"/>
+        <w:ind w:firstLine="851"/>
+        <w:jc w:val="both"/>
+        <w:rPr>
+          <w:rFonts w:ascii="Times New Roman" w:eastAsia="Times New Roman" w:hAnsi="Times New Roman" w:cs="Times New Roman"/>
+          <w:sz w:val="26"/>
+          <w:szCs w:val="28"/>
+        </w:rPr>
+      </w:pPr>
+      <w:r>
+        <w:rPr>
+          <w:rFonts w:ascii="Times New Roman" w:eastAsia="Times New Roman" w:hAnsi="Times New Roman" w:cs="Times New Roman"/>
+          <w:sz w:val="26"/>
+          <w:szCs w:val="28"/>
+        </w:rPr>
+        <w:t>+ Nguồn trả nợ: [Nguồn trả nợ]</w:t>
+      </w:r>
+    </w:p>
+    <w:p>
+      <w:pPr>
+        <w:shd w:val="clear" w:color="auto" w:fill="FFFFFF"/>
         <w:spacing w:after="0" w:line="276" w:lineRule="auto"/>
         <w:ind w:firstLine="567"/>
         <w:jc w:val="both"/>
@@ -14427,143 +14100,15 @@
           <w:rFonts w:ascii="Times New Roman" w:eastAsia="Times New Roman" w:hAnsi="Times New Roman" w:cs="Times New Roman"/>
           <w:sz w:val="26"/>
           <w:szCs w:val="28"/>
-          <w:lang w:val="de-DE"/>
-        </w:rPr>
-      </w:pPr>
-      <w:r>
-        <w:rPr>
-          <w:rFonts w:ascii="Times New Roman" w:eastAsia="Times New Roman" w:hAnsi="Times New Roman" w:cs="Times New Roman"/>
-          <w:sz w:val="26"/>
-          <w:szCs w:val="28"/>
-          <w:lang w:val="de-DE"/>
-        </w:rPr>
-        <w:t>- Dư nợ tại các TCTD khác:</w:t>
-      </w:r>
-      <w:r>
-        <w:rPr>
-          <w:rFonts w:ascii="Times New Roman" w:eastAsia="Times New Roman" w:hAnsi="Times New Roman" w:cs="Times New Roman"/>
-          <w:sz w:val="26"/>
-          <w:szCs w:val="28"/>
-          <w:lang w:val="de-DE"/>
-        </w:rPr>
-        <w:t xml:space="preserve"> </w:t>
-      </w:r>
-      <w:r>
-        <w:rPr>
-          <w:rFonts w:ascii="Times New Roman" w:eastAsia="Calibri" w:hAnsi="Times New Roman" w:cs="Times New Roman"/>
-          <w:sz w:val="26"/>
-          <w:szCs w:val="28"/>
-          <w:lang w:val="de-DE"/>
-        </w:rPr>
-        <w:t>[HĐTD.Dư nợ tại TCTD khác] đồ</w:t>
-      </w:r>
-      <w:r>
-        <w:rPr>
-          <w:rFonts w:ascii="Times New Roman" w:eastAsia="Calibri" w:hAnsi="Times New Roman" w:cs="Times New Roman"/>
-          <w:sz w:val="26"/>
-          <w:szCs w:val="28"/>
-          <w:lang w:val="de-DE"/>
-        </w:rPr>
-        <w:t xml:space="preserve">ng; </w:t>
-      </w:r>
-      <w:r>
-        <w:rPr>
-          <w:rFonts w:ascii="Times New Roman" w:eastAsia="Times New Roman" w:hAnsi="Times New Roman" w:cs="Times New Roman"/>
-          <w:sz w:val="26"/>
-          <w:szCs w:val="28"/>
-          <w:lang w:val="de-DE"/>
-        </w:rPr>
-        <w:t>Nhóm nợ</w:t>
-      </w:r>
-      <w:r>
-        <w:rPr>
-          <w:rFonts w:ascii="Times New Roman" w:eastAsia="Calibri" w:hAnsi="Times New Roman" w:cs="Times New Roman"/>
-          <w:sz w:val="26"/>
-          <w:szCs w:val="28"/>
-          <w:lang w:val="de-DE"/>
-        </w:rPr>
-        <w:t xml:space="preserve">: </w:t>
-      </w:r>
-      <w:r>
-        <w:rPr>
-          <w:rFonts w:ascii="Times New Roman" w:eastAsia="Calibri" w:hAnsi="Times New Roman" w:cs="Times New Roman"/>
-          <w:sz w:val="26"/>
-          <w:szCs w:val="28"/>
-          <w:lang w:val="de-DE"/>
-        </w:rPr>
-        <w:t>[HĐTD.Nhóm nợ]</w:t>
-      </w:r>
-      <w:r>
-        <w:rPr>
-          <w:rFonts w:ascii="Times New Roman" w:eastAsia="Calibri" w:hAnsi="Times New Roman" w:cs="Times New Roman"/>
-          <w:sz w:val="26"/>
-          <w:szCs w:val="28"/>
-          <w:lang w:val="de-DE"/>
-        </w:rPr>
-        <w:t xml:space="preserve">. Khách hàng hiện có tổng dư nợ </w:t>
-      </w:r>
-      <w:r>
-        <w:rPr>
-          <w:rFonts w:ascii="Times New Roman" w:eastAsia="Times New Roman" w:hAnsi="Times New Roman" w:cs="Times New Roman"/>
-          <w:sz w:val="26"/>
-          <w:szCs w:val="28"/>
-          <w:lang w:val="de-DE"/>
-        </w:rPr>
-        <w:t>[</w:t>
-      </w:r>
-      <w:r>
-        <w:rPr>
-          <w:rFonts w:ascii="Times New Roman" w:eastAsia="Times New Roman" w:hAnsi="Times New Roman" w:cs="Times New Roman"/>
-          <w:sz w:val="26"/>
-          <w:szCs w:val="28"/>
-          <w:lang w:val="de-DE"/>
-        </w:rPr>
-        <w:t>TCTD</w:t>
-      </w:r>
-      <w:r>
-        <w:rPr>
-          <w:rFonts w:ascii="Times New Roman" w:eastAsia="Times New Roman" w:hAnsi="Times New Roman" w:cs="Times New Roman"/>
-          <w:sz w:val="26"/>
-          <w:szCs w:val="28"/>
-          <w:lang w:val="de-DE"/>
-        </w:rPr>
-        <w:t>.</w:t>
-      </w:r>
-      <w:r>
-        <w:rPr>
-          <w:rFonts w:ascii="Times New Roman" w:eastAsia="Times New Roman" w:hAnsi="Times New Roman" w:cs="Times New Roman"/>
-          <w:sz w:val="26"/>
-          <w:szCs w:val="28"/>
-          <w:lang w:val="de-DE"/>
-        </w:rPr>
-        <w:t>Tổng dư nợ</w:t>
-      </w:r>
-      <w:r>
-        <w:rPr>
-          <w:rFonts w:ascii="Times New Roman" w:eastAsia="Times New Roman" w:hAnsi="Times New Roman" w:cs="Times New Roman"/>
-          <w:sz w:val="26"/>
-          <w:szCs w:val="28"/>
-          <w:lang w:val="de-DE"/>
-        </w:rPr>
-        <w:t>] đồng</w:t>
-      </w:r>
-      <w:r>
-        <w:rPr>
-          <w:rFonts w:ascii="Times New Roman" w:eastAsia="Times New Roman" w:hAnsi="Times New Roman" w:cs="Times New Roman"/>
-          <w:sz w:val="26"/>
-          <w:szCs w:val="28"/>
-          <w:lang w:val="de-DE"/>
-        </w:rPr>
-        <w:t xml:space="preserve"> tại [TCTD.Tên TCTD], trong đó dư nợ ngắn hạn là [TCTD.Dư nợ ngắn hạn] mục đích [TCTD.Mục đích ngắn hạn], dư nợ trung dài hạn là [TCTD.Dư nợ trung dài hạn] mục đích [TCTD.Mục đích trung dài hạn], nguồn trả nợ từ [TCTD.Nguồn trả nợ]</w:t>
-      </w:r>
-      <w:r>
-        <w:rPr>
-          <w:rFonts w:ascii="Times New Roman" w:eastAsia="Times New Roman" w:hAnsi="Times New Roman" w:cs="Times New Roman"/>
-          <w:sz w:val="26"/>
-          <w:szCs w:val="28"/>
-          <w:lang w:val="de-DE"/>
-        </w:rPr>
-        <w:t>;</w:t>
+        </w:rPr>
+      </w:pPr>
+      <w:r>
+        <w:rPr>
+          <w:rFonts w:ascii="Times New Roman" w:eastAsia="Times New Roman" w:hAnsi="Times New Roman" w:cs="Times New Roman"/>
+          <w:sz w:val="26"/>
+          <w:szCs w:val="28"/>
+        </w:rPr>
+        <w:t>[/DUNỢ]</w:t>
       </w:r>
     </w:p>
     <w:p>
@@ -14760,7 +14305,6 @@
                 <w:color w:val="000000"/>
                 <w:sz w:val="26"/>
               </w:rPr>
-              <w:lastRenderedPageBreak/>
               <w:t>TT</w:t>
             </w:r>
           </w:p>
@@ -15284,7 +14828,21 @@
           <w:rFonts w:ascii="Times New Roman" w:eastAsia="Calibri" w:hAnsi="Times New Roman" w:cs="Times New Roman"/>
           <w:sz w:val="26"/>
         </w:rPr>
-        <w:t xml:space="preserve"> Dư nợ của nhóm khách hàng và người có liên quan: [HĐTD.Dư nợ của KH và NLQ tại Agribank] đồng</w:t>
+        <w:t xml:space="preserve"> Dư nợ của nhóm khách hàng và người có liên quan: </w:t>
+      </w:r>
+      <w:r>
+        <w:rPr>
+          <w:rFonts w:ascii="Times New Roman" w:eastAsia="Calibri" w:hAnsi="Times New Roman" w:cs="Times New Roman"/>
+          <w:sz w:val="26"/>
+        </w:rPr>
+        <w:t>…</w:t>
+      </w:r>
+      <w:r>
+        <w:rPr>
+          <w:rFonts w:ascii="Times New Roman" w:eastAsia="Calibri" w:hAnsi="Times New Roman" w:cs="Times New Roman"/>
+          <w:sz w:val="26"/>
+        </w:rPr>
+        <w:t xml:space="preserve"> đồng</w:t>
       </w:r>
     </w:p>
     <w:p>
@@ -15486,7 +15044,23 @@
           <w:sz w:val="26"/>
           <w:szCs w:val="28"/>
         </w:rPr>
-        <w:t>- Nhóm nợ của khách hàng trong 36 tháng liền kề thời điểm vay vốn: [HĐTD.Nhóm nợ]</w:t>
+        <w:t xml:space="preserve">- Nhóm nợ của khách hàng trong 36 tháng liền kề thời điểm vay vốn: </w:t>
+      </w:r>
+      <w:r>
+        <w:rPr>
+          <w:rFonts w:ascii="Times New Roman" w:eastAsia="Times New Roman" w:hAnsi="Times New Roman" w:cs="Times New Roman"/>
+          <w:sz w:val="26"/>
+          <w:szCs w:val="28"/>
+        </w:rPr>
+        <w:t xml:space="preserve">Nhóm </w:t>
+      </w:r>
+      <w:r>
+        <w:rPr>
+          <w:rFonts w:ascii="Times New Roman" w:eastAsia="Times New Roman" w:hAnsi="Times New Roman" w:cs="Times New Roman"/>
+          <w:sz w:val="26"/>
+          <w:szCs w:val="28"/>
+        </w:rPr>
+        <w:t>[HĐTD.Nhóm nợ]</w:t>
       </w:r>
       <w:r>
         <w:rPr>
@@ -15676,21 +15250,11 @@
           <w:sz w:val="26"/>
           <w:szCs w:val="28"/>
         </w:rPr>
-        <w:t xml:space="preserve">- Giá trị định giá tài sản bảo đảm: </w:t>
-      </w:r>
-      <w:r>
-        <w:rPr>
-          <w:rFonts w:ascii="Times New Roman" w:eastAsia="Calibri" w:hAnsi="Times New Roman" w:cs="Times New Roman"/>
-          <w:b/>
-          <w:sz w:val="26"/>
-          <w:szCs w:val="28"/>
-        </w:rPr>
-        <w:t>[</w:t>
-      </w:r>
-      <w:r>
-        <w:rPr>
-          <w:rFonts w:ascii="Times New Roman" w:eastAsia="Calibri" w:hAnsi="Times New Roman" w:cs="Times New Roman"/>
-          <w:b/>
+        <w:t>- Giá trị định giá tài sản bảo đảm: [</w:t>
+      </w:r>
+      <w:r>
+        <w:rPr>
+          <w:rFonts w:ascii="Times New Roman" w:eastAsia="Calibri" w:hAnsi="Times New Roman" w:cs="Times New Roman"/>
           <w:sz w:val="26"/>
           <w:szCs w:val="28"/>
         </w:rPr>
@@ -15699,19 +15263,10 @@
       <w:r>
         <w:rPr>
           <w:rFonts w:ascii="Times New Roman" w:eastAsia="Calibri" w:hAnsi="Times New Roman" w:cs="Times New Roman"/>
-          <w:b/>
-          <w:sz w:val="26"/>
-          <w:szCs w:val="28"/>
-        </w:rPr>
-        <w:t>Tổng giá trị TSBĐ]</w:t>
-      </w:r>
-      <w:r>
-        <w:rPr>
-          <w:rFonts w:ascii="Times New Roman" w:eastAsia="Calibri" w:hAnsi="Times New Roman" w:cs="Times New Roman"/>
-          <w:sz w:val="26"/>
-          <w:szCs w:val="28"/>
-        </w:rPr>
-        <w:t xml:space="preserve"> đồng</w:t>
+          <w:sz w:val="26"/>
+          <w:szCs w:val="28"/>
+        </w:rPr>
+        <w:t>Tổng giá trị TSBĐ] đồng</w:t>
       </w:r>
       <w:r>
         <w:rPr>
@@ -15762,7 +15317,6 @@
         <w:jc w:val="both"/>
         <w:rPr>
           <w:rFonts w:ascii="Times New Roman" w:eastAsia="Calibri" w:hAnsi="Times New Roman" w:cs="Times New Roman"/>
-          <w:bCs/>
           <w:sz w:val="26"/>
           <w:szCs w:val="28"/>
           <w:lang w:val="fr-FR"/>
@@ -15771,7 +15325,6 @@
       <w:r>
         <w:rPr>
           <w:rFonts w:ascii="Times New Roman" w:eastAsia="Calibri" w:hAnsi="Times New Roman" w:cs="Times New Roman"/>
-          <w:bCs/>
           <w:sz w:val="26"/>
           <w:szCs w:val="28"/>
           <w:lang w:val="fr-FR"/>
@@ -15781,8 +15334,6 @@
       <w:r>
         <w:rPr>
           <w:rFonts w:ascii="Times New Roman" w:eastAsia="Calibri" w:hAnsi="Times New Roman" w:cs="Times New Roman"/>
-          <w:b/>
-          <w:bCs/>
           <w:sz w:val="26"/>
           <w:szCs w:val="28"/>
           <w:lang w:val="fr-FR"/>
@@ -15792,7 +15343,6 @@
       <w:r>
         <w:rPr>
           <w:rFonts w:ascii="Times New Roman" w:eastAsia="Calibri" w:hAnsi="Times New Roman" w:cs="Times New Roman"/>
-          <w:b/>
           <w:sz w:val="26"/>
           <w:szCs w:val="26"/>
           <w:lang w:val="pt-BR"/>
@@ -15802,8 +15352,6 @@
       <w:r>
         <w:rPr>
           <w:rFonts w:ascii="Times New Roman" w:eastAsia="Calibri" w:hAnsi="Times New Roman" w:cs="Times New Roman"/>
-          <w:b/>
-          <w:bCs/>
           <w:sz w:val="26"/>
           <w:szCs w:val="28"/>
           <w:lang w:val="fr-FR"/>
@@ -15817,16 +15365,7 @@
           <w:szCs w:val="26"/>
           <w:lang w:val="pt-BR"/>
         </w:rPr>
-        <w:t xml:space="preserve"> đồng</w:t>
-      </w:r>
-      <w:r>
-        <w:rPr>
-          <w:rFonts w:ascii="Times New Roman" w:eastAsia="Times New Roman" w:hAnsi="Times New Roman" w:cs="Times New Roman"/>
-          <w:sz w:val="26"/>
-          <w:szCs w:val="26"/>
-          <w:lang w:val="pt-BR"/>
-        </w:rPr>
-        <w:t>.</w:t>
+        <w:t xml:space="preserve"> đồng.</w:t>
       </w:r>
     </w:p>
     <w:p>
@@ -15837,7 +15376,6 @@
         <w:jc w:val="both"/>
         <w:rPr>
           <w:rFonts w:ascii="Times New Roman" w:eastAsia="Calibri" w:hAnsi="Times New Roman" w:cs="Times New Roman"/>
-          <w:bCs/>
           <w:sz w:val="26"/>
           <w:szCs w:val="28"/>
           <w:lang w:val="fr-FR"/>
@@ -15846,60 +15384,33 @@
       <w:r>
         <w:rPr>
           <w:rFonts w:ascii="Times New Roman" w:eastAsia="Calibri" w:hAnsi="Times New Roman" w:cs="Times New Roman"/>
-          <w:bCs/>
           <w:sz w:val="26"/>
           <w:szCs w:val="28"/>
           <w:lang w:val="fr-FR"/>
         </w:rPr>
-        <w:t xml:space="preserve">- Nghĩa vụ được bảo đảm, phạm vi bảo đảm: </w:t>
-      </w:r>
-      <w:r>
-        <w:rPr>
-          <w:rFonts w:ascii="Times New Roman" w:eastAsia="Calibri" w:hAnsi="Times New Roman" w:cs="Times New Roman"/>
-          <w:b/>
-          <w:bCs/>
+        <w:t>- Nghĩa vụ được bảo đảm, phạm vi bảo đảm: [</w:t>
+      </w:r>
+      <w:r>
+        <w:rPr>
+          <w:rFonts w:ascii="Times New Roman" w:eastAsia="Calibri" w:hAnsi="Times New Roman" w:cs="Times New Roman"/>
           <w:sz w:val="26"/>
           <w:szCs w:val="28"/>
           <w:lang w:val="fr-FR"/>
         </w:rPr>
-        <w:t>[</w:t>
-      </w:r>
-      <w:r>
-        <w:rPr>
-          <w:rFonts w:ascii="Times New Roman" w:eastAsia="Calibri" w:hAnsi="Times New Roman" w:cs="Times New Roman"/>
-          <w:b/>
-          <w:bCs/>
+        <w:t>HĐTD.</w:t>
+      </w:r>
+      <w:r>
+        <w:rPr>
+          <w:rFonts w:ascii="Times New Roman" w:eastAsia="Calibri" w:hAnsi="Times New Roman" w:cs="Times New Roman"/>
           <w:sz w:val="26"/>
           <w:szCs w:val="28"/>
           <w:lang w:val="fr-FR"/>
         </w:rPr>
-        <w:t>HĐTD.</w:t>
-      </w:r>
-      <w:r>
-        <w:rPr>
-          <w:rFonts w:ascii="Times New Roman" w:eastAsia="Calibri" w:hAnsi="Times New Roman" w:cs="Times New Roman"/>
-          <w:b/>
-          <w:bCs/>
-          <w:sz w:val="26"/>
-          <w:szCs w:val="28"/>
-          <w:lang w:val="fr-FR"/>
-        </w:rPr>
-        <w:t>Tổng nghĩa vụ bảo đảm]</w:t>
-      </w:r>
-      <w:r>
-        <w:rPr>
-          <w:rFonts w:ascii="Times New Roman" w:eastAsia="Calibri" w:hAnsi="Times New Roman" w:cs="Times New Roman"/>
-          <w:bCs/>
-          <w:sz w:val="26"/>
-          <w:szCs w:val="28"/>
-          <w:lang w:val="fr-FR"/>
-        </w:rPr>
-        <w:t xml:space="preserve"> đồng</w:t>
-      </w:r>
-      <w:r>
-        <w:rPr>
-          <w:rFonts w:ascii="Times New Roman" w:eastAsia="Calibri" w:hAnsi="Times New Roman" w:cs="Times New Roman"/>
-          <w:bCs/>
+        <w:t>Tổng nghĩa vụ bảo đảm] đồng</w:t>
+      </w:r>
+      <w:r>
+        <w:rPr>
+          <w:rFonts w:ascii="Times New Roman" w:eastAsia="Calibri" w:hAnsi="Times New Roman" w:cs="Times New Roman"/>
           <w:sz w:val="26"/>
           <w:szCs w:val="28"/>
           <w:lang w:val="fr-FR"/>
@@ -15923,22 +15434,21 @@
       <w:r>
         <w:rPr>
           <w:rFonts w:ascii="Times New Roman" w:eastAsia="Calibri" w:hAnsi="Times New Roman" w:cs="Times New Roman"/>
+          <w:sz w:val="26"/>
+          <w:szCs w:val="28"/>
+          <w:lang w:val="fr-FR"/>
+        </w:rPr>
+        <w:t>* Nhận xét về TSBĐ: tài sản bảo đảm không thuộc Danh mục tài sản không được nhận</w:t>
+      </w:r>
+      <w:r>
+        <w:rPr>
+          <w:rFonts w:ascii="Times New Roman" w:eastAsia="Calibri" w:hAnsi="Times New Roman" w:cs="Times New Roman"/>
           <w:bCs/>
           <w:sz w:val="26"/>
           <w:szCs w:val="28"/>
           <w:lang w:val="fr-FR"/>
         </w:rPr>
-        <w:t xml:space="preserve">* Nhận xét về TSBĐ: </w:t>
-      </w:r>
-      <w:r>
-        <w:rPr>
-          <w:rFonts w:ascii="Times New Roman" w:eastAsia="Calibri" w:hAnsi="Times New Roman" w:cs="Times New Roman"/>
-          <w:bCs/>
-          <w:sz w:val="26"/>
-          <w:szCs w:val="28"/>
-          <w:lang w:val="fr-FR"/>
-        </w:rPr>
-        <w:t>tài sản bảo đảm không thuộc Danh mục tài sản không được nhận làm tài sản bảo đảm; đủ điều kiện nhận làm TSBĐ chính thức theo quy định</w:t>
+        <w:t xml:space="preserve"> làm tài sản bảo đảm; đủ điều kiện nhận làm TSBĐ chính thức theo quy định</w:t>
       </w:r>
       <w:r>
         <w:rPr>
@@ -15997,6 +15507,7 @@
           <w:szCs w:val="28"/>
           <w:lang w:val="pt-BR"/>
         </w:rPr>
+        <w:lastRenderedPageBreak/>
         <w:t>Trên cơ sở hồ sơ vay vốn, đề xuất của Người quan hệ khách hàng, Người thẩm định đã tiến hành thẩm định và đề xuất như sau:</w:t>
       </w:r>
     </w:p>
@@ -16066,21 +15577,11 @@
       <w:r>
         <w:rPr>
           <w:rFonts w:ascii="Times New Roman" w:eastAsia="Calibri" w:hAnsi="Times New Roman" w:cs="Times New Roman"/>
-          <w:b/>
-          <w:sz w:val="26"/>
-          <w:szCs w:val="26"/>
-          <w:lang w:val="pt-BR"/>
-        </w:rPr>
-        <w:t>[HĐTD.Số tiền vay]</w:t>
-      </w:r>
-      <w:r>
-        <w:rPr>
-          <w:rFonts w:ascii="Times New Roman" w:eastAsia="Calibri" w:hAnsi="Times New Roman" w:cs="Times New Roman"/>
-          <w:sz w:val="26"/>
-          <w:szCs w:val="26"/>
-          <w:lang w:val="pt-BR"/>
-        </w:rPr>
-        <w:t xml:space="preserve"> đồng, (Bằng chữ: [HĐTD.Bằng chữ])</w:t>
+          <w:sz w:val="26"/>
+          <w:szCs w:val="26"/>
+          <w:lang w:val="pt-BR"/>
+        </w:rPr>
+        <w:t>[HĐTD.Số tiền vay] đồng, (Bằng chữ: [HĐTD.Bằng chữ])</w:t>
       </w:r>
       <w:r>
         <w:rPr>
@@ -16190,7 +15691,6 @@
       <w:r>
         <w:rPr>
           <w:rFonts w:ascii="Times New Roman" w:eastAsia="Times New Roman" w:hAnsi="Times New Roman" w:cs="Times New Roman"/>
-          <w:b/>
           <w:sz w:val="26"/>
           <w:szCs w:val="26"/>
           <w:lang w:val="pt-BR"/>
@@ -16465,7 +15965,6 @@
                 <w:sz w:val="24"/>
                 <w:szCs w:val="26"/>
               </w:rPr>
-              <w:lastRenderedPageBreak/>
               <w:t>(Ký, ghi rõ họ tên)</w:t>
             </w:r>
           </w:p>
@@ -16681,21 +16180,11 @@
       <w:r>
         <w:rPr>
           <w:rFonts w:ascii="Times New Roman" w:eastAsia="Calibri" w:hAnsi="Times New Roman" w:cs="Times New Roman"/>
-          <w:b/>
-          <w:sz w:val="26"/>
-          <w:szCs w:val="26"/>
-          <w:lang w:val="pt-BR"/>
-        </w:rPr>
-        <w:t>[HĐTD.Số tiền vay]</w:t>
-      </w:r>
-      <w:r>
-        <w:rPr>
-          <w:rFonts w:ascii="Times New Roman" w:eastAsia="Calibri" w:hAnsi="Times New Roman" w:cs="Times New Roman"/>
-          <w:sz w:val="26"/>
-          <w:szCs w:val="26"/>
-          <w:lang w:val="pt-BR"/>
-        </w:rPr>
-        <w:t xml:space="preserve"> đồng, (Bằng chữ: [HĐTD.Bằng chữ])</w:t>
+          <w:sz w:val="26"/>
+          <w:szCs w:val="26"/>
+          <w:lang w:val="pt-BR"/>
+        </w:rPr>
+        <w:t>[HĐTD.Số tiền vay] đồng, (Bằng chữ: [HĐTD.Bằng chữ])</w:t>
       </w:r>
       <w:r>
         <w:rPr>
@@ -16762,16 +16251,7 @@
           <w:szCs w:val="28"/>
           <w:lang w:val="pt-BR"/>
         </w:rPr>
-        <w:t xml:space="preserve">- Phương thức cho vay: </w:t>
-      </w:r>
-      <w:r>
-        <w:rPr>
-          <w:rFonts w:ascii="Times New Roman" w:eastAsia="Calibri" w:hAnsi="Times New Roman" w:cs="Times New Roman"/>
-          <w:sz w:val="26"/>
-          <w:szCs w:val="28"/>
-          <w:lang w:val="pt-BR"/>
-        </w:rPr>
-        <w:t>[HĐTD.Phương thức cho vay]</w:t>
+        <w:t>- Phương thức cho vay: [HĐTD.Phương thức cho vay]</w:t>
       </w:r>
       <w:r>
         <w:rPr>
@@ -16811,7 +16291,6 @@
       <w:r>
         <w:rPr>
           <w:rFonts w:ascii="Times New Roman" w:eastAsia="Times New Roman" w:hAnsi="Times New Roman" w:cs="Times New Roman"/>
-          <w:b/>
           <w:sz w:val="26"/>
           <w:szCs w:val="26"/>
           <w:lang w:val="pt-BR"/>
@@ -16999,6 +16478,14 @@
         </w:rPr>
         <w:t>Tài sản bảo đảm: Cho vay có bảo đảm 100% bằng tài sản</w:t>
       </w:r>
+      <w:r>
+        <w:rPr>
+          <w:rFonts w:ascii="Times New Roman" w:eastAsia="Calibri" w:hAnsi="Times New Roman" w:cs="Times New Roman"/>
+          <w:sz w:val="26"/>
+          <w:szCs w:val="28"/>
+        </w:rPr>
+        <w:t>.</w:t>
+      </w:r>
     </w:p>
     <w:p>
       <w:pPr>
@@ -17022,6 +16509,14 @@
           <w:szCs w:val="28"/>
         </w:rPr>
         <w:t>- Nội dung khác (nếu có)</w:t>
+      </w:r>
+      <w:r>
+        <w:rPr>
+          <w:rFonts w:ascii="Times New Roman" w:eastAsia="Calibri" w:hAnsi="Times New Roman" w:cs="Times New Roman"/>
+          <w:sz w:val="26"/>
+          <w:szCs w:val="28"/>
+        </w:rPr>
+        <w:t>.</w:t>
       </w:r>
     </w:p>
     <w:tbl>

</xml_diff>